<commit_message>
feat: Arquivos para deploy na Render
</commit_message>
<xml_diff>
--- a/SoulPass-Java-Documentacao.docx
+++ b/SoulPass-Java-Documentacao.docx
@@ -1,13 +1,16 @@
 
 <file path=word/document.xml><?xml version="1.0" encoding="utf-8"?>
-<w:document xmlns:wpc="http://schemas.microsoft.com/office/word/2010/wordprocessingCanvas" xmlns:cx="http://schemas.microsoft.com/office/drawing/2014/chartex" xmlns:cx1="http://schemas.microsoft.com/office/drawing/2015/9/8/chartex" xmlns:cx2="http://schemas.microsoft.com/office/drawing/2015/10/21/chartex" xmlns:cx3="http://schemas.microsoft.com/office/drawing/2016/5/9/chartex" xmlns:cx4="http://schemas.microsoft.com/office/drawing/2016/5/10/chartex" xmlns:cx5="http://schemas.microsoft.com/office/drawing/2016/5/11/chartex" xmlns:cx6="http://schemas.microsoft.com/office/drawing/2016/5/12/chartex" xmlns:cx7="http://schemas.microsoft.com/office/drawing/2016/5/13/chartex" xmlns:cx8="http://schemas.microsoft.com/office/drawing/2016/5/14/chartex" xmlns:mc="http://schemas.openxmlformats.org/markup-compatibility/2006" xmlns:aink="http://schemas.microsoft.com/office/drawing/2016/ink" xmlns:am3d="http://schemas.microsoft.com/office/drawing/2017/model3d" xmlns:o="urn:schemas-microsoft-com:office:office" xmlns:oel="http://schemas.microsoft.com/office/2019/extlst" xmlns:r="http://schemas.openxmlformats.org/officeDocument/2006/relationships" xmlns:m="http://schemas.openxmlformats.org/officeDocument/2006/math" xmlns:v="urn:schemas-microsoft-com:vml" xmlns:wp14="http://schemas.microsoft.com/office/word/2010/wordprocessingDrawing" xmlns:wp="http://schemas.openxmlformats.org/drawingml/2006/wordprocessingDrawing" xmlns:w10="urn:schemas-microsoft-com:office:word" xmlns:w="http://schemas.openxmlformats.org/wordprocessingml/2006/main" xmlns:w14="http://schemas.microsoft.com/office/word/2010/wordml" xmlns:w15="http://schemas.microsoft.com/office/word/2012/wordml" xmlns:w16cex="http://schemas.microsoft.com/office/word/2018/wordml/cex" xmlns:w16cid="http://schemas.microsoft.com/office/word/2016/wordml/cid" xmlns:w16="http://schemas.microsoft.com/office/word/2018/wordml" xmlns:w16du="http://schemas.microsoft.com/office/word/2023/wordml/word16du" xmlns:w16sdtdh="http://schemas.microsoft.com/office/word/2020/wordml/sdtdatahash" xmlns:w16se="http://schemas.microsoft.com/office/word/2015/wordml/symex" xmlns:wpg="http://schemas.microsoft.com/office/word/2010/wordprocessingGroup" xmlns:wpi="http://schemas.microsoft.com/office/word/2010/wordprocessingInk" xmlns:wne="http://schemas.microsoft.com/office/word/2006/wordml" xmlns:wps="http://schemas.microsoft.com/office/word/2010/wordprocessingShape" mc:Ignorable="w14 w15 w16se w16cid w16 w16cex w16sdtdh w16du wp14">
+<w:document xmlns:wpc="http://schemas.microsoft.com/office/word/2010/wordprocessingCanvas" xmlns:cx="http://schemas.microsoft.com/office/drawing/2014/chartex" xmlns:cx1="http://schemas.microsoft.com/office/drawing/2015/9/8/chartex" xmlns:cx2="http://schemas.microsoft.com/office/drawing/2015/10/21/chartex" xmlns:cx3="http://schemas.microsoft.com/office/drawing/2016/5/9/chartex" xmlns:cx4="http://schemas.microsoft.com/office/drawing/2016/5/10/chartex" xmlns:cx5="http://schemas.microsoft.com/office/drawing/2016/5/11/chartex" xmlns:cx6="http://schemas.microsoft.com/office/drawing/2016/5/12/chartex" xmlns:cx7="http://schemas.microsoft.com/office/drawing/2016/5/13/chartex" xmlns:cx8="http://schemas.microsoft.com/office/drawing/2016/5/14/chartex" xmlns:mc="http://schemas.openxmlformats.org/markup-compatibility/2006" xmlns:aink="http://schemas.microsoft.com/office/drawing/2016/ink" xmlns:am3d="http://schemas.microsoft.com/office/drawing/2017/model3d" xmlns:o="urn:schemas-microsoft-com:office:office" xmlns:oel="http://schemas.microsoft.com/office/2019/extlst" xmlns:r="http://schemas.openxmlformats.org/officeDocument/2006/relationships" xmlns:m="http://schemas.openxmlformats.org/officeDocument/2006/math" xmlns:v="urn:schemas-microsoft-com:vml" xmlns:wp14="http://schemas.microsoft.com/office/word/2010/wordprocessingDrawing" xmlns:wp="http://schemas.openxmlformats.org/drawingml/2006/wordprocessingDrawing" xmlns:w10="urn:schemas-microsoft-com:office:word" xmlns:w="http://schemas.openxmlformats.org/wordprocessingml/2006/main" xmlns:w14="http://schemas.microsoft.com/office/word/2010/wordml" xmlns:w15="http://schemas.microsoft.com/office/word/2012/wordml" xmlns:w16cex="http://schemas.microsoft.com/office/word/2018/wordml/cex" xmlns:w16cid="http://schemas.microsoft.com/office/word/2016/wordml/cid" xmlns:w16="http://schemas.microsoft.com/office/word/2018/wordml" xmlns:w16sdtdh="http://schemas.microsoft.com/office/word/2020/wordml/sdtdatahash" xmlns:w16se="http://schemas.microsoft.com/office/word/2015/wordml/symex" xmlns:wpg="http://schemas.microsoft.com/office/word/2010/wordprocessingGroup" xmlns:wpi="http://schemas.microsoft.com/office/word/2010/wordprocessingInk" xmlns:wne="http://schemas.microsoft.com/office/word/2006/wordml" xmlns:wps="http://schemas.microsoft.com/office/word/2010/wordprocessingShape" mc:Ignorable="w14 w15 w16se w16cid w16 w16cex w16sdtdh wp14">
   <w:body>
     <w:p>
       <w:pPr>
-        <w:pStyle w:val="Ttulo1"/>
+        <w:pStyle w:val="Heading1"/>
         <w:jc w:val="center"/>
       </w:pPr>
       <w:bookmarkStart w:id="0" w:name="_Toc240009152"/>
+      <w:r>
+        <w:softHyphen/>
+      </w:r>
       <w:proofErr w:type="spellStart"/>
       <w:r>
         <w:t>SoulPass</w:t>
@@ -235,7 +238,7 @@
     <w:p/>
     <w:p>
       <w:pPr>
-        <w:pStyle w:val="Ttulo1"/>
+        <w:pStyle w:val="Heading1"/>
       </w:pPr>
       <w:bookmarkStart w:id="1" w:name="_Toc240009153"/>
       <w:r>
@@ -270,7 +273,7 @@
       <w:sdtContent>
         <w:p>
           <w:pPr>
-            <w:pStyle w:val="CabealhodoSumrio"/>
+            <w:pStyle w:val="TOCHeading"/>
             <w:spacing w:line="360" w:lineRule="auto"/>
             <w:rPr>
               <w:rFonts w:ascii="Arial" w:hAnsi="Arial" w:cs="Arial"/>
@@ -291,7 +294,7 @@
         </w:p>
         <w:p>
           <w:pPr>
-            <w:pStyle w:val="Sumrio1"/>
+            <w:pStyle w:val="TOC1"/>
             <w:tabs>
               <w:tab w:val="right" w:leader="dot" w:pos="8494"/>
             </w:tabs>
@@ -368,7 +371,7 @@
         </w:p>
         <w:p>
           <w:pPr>
-            <w:pStyle w:val="Sumrio1"/>
+            <w:pStyle w:val="TOC1"/>
             <w:tabs>
               <w:tab w:val="right" w:leader="dot" w:pos="8494"/>
             </w:tabs>
@@ -436,7 +439,7 @@
         </w:p>
         <w:p>
           <w:pPr>
-            <w:pStyle w:val="Sumrio1"/>
+            <w:pStyle w:val="TOC1"/>
             <w:tabs>
               <w:tab w:val="right" w:leader="dot" w:pos="8494"/>
             </w:tabs>
@@ -504,7 +507,7 @@
         </w:p>
         <w:p>
           <w:pPr>
-            <w:pStyle w:val="Sumrio2"/>
+            <w:pStyle w:val="TOC2"/>
             <w:tabs>
               <w:tab w:val="right" w:leader="dot" w:pos="8494"/>
             </w:tabs>
@@ -572,7 +575,7 @@
         </w:p>
         <w:p>
           <w:pPr>
-            <w:pStyle w:val="Sumrio2"/>
+            <w:pStyle w:val="TOC2"/>
             <w:tabs>
               <w:tab w:val="right" w:leader="dot" w:pos="8494"/>
             </w:tabs>
@@ -640,7 +643,7 @@
         </w:p>
         <w:p>
           <w:pPr>
-            <w:pStyle w:val="Sumrio3"/>
+            <w:pStyle w:val="TOC3"/>
             <w:tabs>
               <w:tab w:val="right" w:leader="dot" w:pos="8494"/>
             </w:tabs>
@@ -708,7 +711,7 @@
         </w:p>
         <w:p>
           <w:pPr>
-            <w:pStyle w:val="Sumrio3"/>
+            <w:pStyle w:val="TOC3"/>
             <w:tabs>
               <w:tab w:val="right" w:leader="dot" w:pos="8494"/>
             </w:tabs>
@@ -776,7 +779,7 @@
         </w:p>
         <w:p>
           <w:pPr>
-            <w:pStyle w:val="Sumrio1"/>
+            <w:pStyle w:val="TOC1"/>
             <w:tabs>
               <w:tab w:val="right" w:leader="dot" w:pos="8494"/>
             </w:tabs>
@@ -845,7 +848,7 @@
         </w:p>
         <w:p>
           <w:pPr>
-            <w:pStyle w:val="Sumrio1"/>
+            <w:pStyle w:val="TOC1"/>
             <w:tabs>
               <w:tab w:val="right" w:leader="dot" w:pos="8494"/>
             </w:tabs>
@@ -913,7 +916,7 @@
         </w:p>
         <w:p>
           <w:pPr>
-            <w:pStyle w:val="Sumrio1"/>
+            <w:pStyle w:val="TOC1"/>
             <w:tabs>
               <w:tab w:val="right" w:leader="dot" w:pos="8494"/>
             </w:tabs>
@@ -981,7 +984,7 @@
         </w:p>
         <w:p>
           <w:pPr>
-            <w:pStyle w:val="Sumrio1"/>
+            <w:pStyle w:val="TOC1"/>
             <w:tabs>
               <w:tab w:val="right" w:leader="dot" w:pos="8494"/>
             </w:tabs>
@@ -1074,7 +1077,7 @@
     <w:p/>
     <w:p>
       <w:pPr>
-        <w:pStyle w:val="Ttulo1"/>
+        <w:pStyle w:val="Heading1"/>
       </w:pPr>
       <w:r>
         <w:t xml:space="preserve">1. </w:t>
@@ -1086,7 +1089,7 @@
     </w:p>
     <w:p>
       <w:pPr>
-        <w:pStyle w:val="Ttulo2"/>
+        <w:pStyle w:val="Heading2"/>
       </w:pPr>
       <w:bookmarkStart w:id="3" w:name="_Toc240009155"/>
       <w:r>
@@ -1769,7 +1772,7 @@
     <w:p/>
     <w:p>
       <w:pPr>
-        <w:pStyle w:val="Ttulo2"/>
+        <w:pStyle w:val="Heading2"/>
       </w:pPr>
       <w:r>
         <w:t>1.2. O Escopo desse projeto</w:t>
@@ -1778,7 +1781,7 @@
     </w:p>
     <w:p>
       <w:pPr>
-        <w:pStyle w:val="Ttulo3"/>
+        <w:pStyle w:val="Heading3"/>
       </w:pPr>
       <w:bookmarkStart w:id="5" w:name="_Toc240009157"/>
       <w:r>
@@ -1788,7 +1791,7 @@
     </w:p>
     <w:p>
       <w:pPr>
-        <w:pStyle w:val="PargrafodaLista"/>
+        <w:pStyle w:val="ListParagraph"/>
         <w:numPr>
           <w:ilvl w:val="0"/>
           <w:numId w:val="5"/>
@@ -1803,7 +1806,7 @@
     </w:p>
     <w:p>
       <w:pPr>
-        <w:pStyle w:val="PargrafodaLista"/>
+        <w:pStyle w:val="ListParagraph"/>
         <w:numPr>
           <w:ilvl w:val="0"/>
           <w:numId w:val="5"/>
@@ -1825,7 +1828,7 @@
     </w:p>
     <w:p>
       <w:pPr>
-        <w:pStyle w:val="PargrafodaLista"/>
+        <w:pStyle w:val="ListParagraph"/>
         <w:numPr>
           <w:ilvl w:val="0"/>
           <w:numId w:val="5"/>
@@ -1843,7 +1846,7 @@
     </w:p>
     <w:p>
       <w:pPr>
-        <w:pStyle w:val="PargrafodaLista"/>
+        <w:pStyle w:val="ListParagraph"/>
         <w:numPr>
           <w:ilvl w:val="0"/>
           <w:numId w:val="5"/>
@@ -1861,7 +1864,7 @@
     </w:p>
     <w:p>
       <w:pPr>
-        <w:pStyle w:val="PargrafodaLista"/>
+        <w:pStyle w:val="ListParagraph"/>
         <w:numPr>
           <w:ilvl w:val="0"/>
           <w:numId w:val="5"/>
@@ -1876,7 +1879,7 @@
     </w:p>
     <w:p>
       <w:pPr>
-        <w:pStyle w:val="PargrafodaLista"/>
+        <w:pStyle w:val="ListParagraph"/>
         <w:numPr>
           <w:ilvl w:val="0"/>
           <w:numId w:val="5"/>
@@ -1891,7 +1894,7 @@
     </w:p>
     <w:p>
       <w:pPr>
-        <w:pStyle w:val="PargrafodaLista"/>
+        <w:pStyle w:val="ListParagraph"/>
         <w:numPr>
           <w:ilvl w:val="0"/>
           <w:numId w:val="5"/>
@@ -1903,7 +1906,7 @@
     </w:p>
     <w:p>
       <w:pPr>
-        <w:pStyle w:val="PargrafodaLista"/>
+        <w:pStyle w:val="ListParagraph"/>
         <w:numPr>
           <w:ilvl w:val="0"/>
           <w:numId w:val="5"/>
@@ -1915,7 +1918,7 @@
     </w:p>
     <w:p>
       <w:pPr>
-        <w:pStyle w:val="PargrafodaLista"/>
+        <w:pStyle w:val="ListParagraph"/>
         <w:numPr>
           <w:ilvl w:val="0"/>
           <w:numId w:val="5"/>
@@ -1927,7 +1930,7 @@
     </w:p>
     <w:p>
       <w:pPr>
-        <w:pStyle w:val="PargrafodaLista"/>
+        <w:pStyle w:val="ListParagraph"/>
         <w:numPr>
           <w:ilvl w:val="0"/>
           <w:numId w:val="5"/>
@@ -1951,7 +1954,7 @@
     </w:p>
     <w:p>
       <w:pPr>
-        <w:pStyle w:val="PargrafodaLista"/>
+        <w:pStyle w:val="ListParagraph"/>
         <w:numPr>
           <w:ilvl w:val="0"/>
           <w:numId w:val="5"/>
@@ -1975,7 +1978,7 @@
     </w:p>
     <w:p>
       <w:pPr>
-        <w:pStyle w:val="PargrafodaLista"/>
+        <w:pStyle w:val="ListParagraph"/>
         <w:numPr>
           <w:ilvl w:val="0"/>
           <w:numId w:val="5"/>
@@ -1994,7 +1997,7 @@
     </w:p>
     <w:p>
       <w:pPr>
-        <w:pStyle w:val="PargrafodaLista"/>
+        <w:pStyle w:val="ListParagraph"/>
         <w:numPr>
           <w:ilvl w:val="0"/>
           <w:numId w:val="5"/>
@@ -2006,7 +2009,7 @@
     </w:p>
     <w:p>
       <w:pPr>
-        <w:pStyle w:val="PargrafodaLista"/>
+        <w:pStyle w:val="ListParagraph"/>
         <w:numPr>
           <w:ilvl w:val="0"/>
           <w:numId w:val="5"/>
@@ -2025,7 +2028,7 @@
     </w:p>
     <w:p>
       <w:pPr>
-        <w:pStyle w:val="PargrafodaLista"/>
+        <w:pStyle w:val="ListParagraph"/>
         <w:numPr>
           <w:ilvl w:val="0"/>
           <w:numId w:val="5"/>
@@ -2037,7 +2040,7 @@
     </w:p>
     <w:p>
       <w:pPr>
-        <w:pStyle w:val="PargrafodaLista"/>
+        <w:pStyle w:val="ListParagraph"/>
         <w:numPr>
           <w:ilvl w:val="0"/>
           <w:numId w:val="5"/>
@@ -2052,7 +2055,7 @@
     </w:p>
     <w:p>
       <w:pPr>
-        <w:pStyle w:val="PargrafodaLista"/>
+        <w:pStyle w:val="ListParagraph"/>
         <w:numPr>
           <w:ilvl w:val="0"/>
           <w:numId w:val="5"/>
@@ -2064,7 +2067,7 @@
     </w:p>
     <w:p>
       <w:pPr>
-        <w:pStyle w:val="PargrafodaLista"/>
+        <w:pStyle w:val="ListParagraph"/>
         <w:numPr>
           <w:ilvl w:val="0"/>
           <w:numId w:val="5"/>
@@ -2079,7 +2082,7 @@
     </w:p>
     <w:p>
       <w:pPr>
-        <w:pStyle w:val="PargrafodaLista"/>
+        <w:pStyle w:val="ListParagraph"/>
         <w:numPr>
           <w:ilvl w:val="0"/>
           <w:numId w:val="5"/>
@@ -2091,7 +2094,7 @@
     </w:p>
     <w:p>
       <w:pPr>
-        <w:pStyle w:val="PargrafodaLista"/>
+        <w:pStyle w:val="ListParagraph"/>
         <w:numPr>
           <w:ilvl w:val="0"/>
           <w:numId w:val="5"/>
@@ -2103,7 +2106,7 @@
     </w:p>
     <w:p>
       <w:pPr>
-        <w:pStyle w:val="Ttulo3"/>
+        <w:pStyle w:val="Heading3"/>
       </w:pPr>
       <w:bookmarkStart w:id="6" w:name="_Toc240009158"/>
       <w:r>
@@ -2113,7 +2116,7 @@
     </w:p>
     <w:p>
       <w:pPr>
-        <w:pStyle w:val="PargrafodaLista"/>
+        <w:pStyle w:val="ListParagraph"/>
         <w:numPr>
           <w:ilvl w:val="0"/>
           <w:numId w:val="6"/>
@@ -2144,7 +2147,7 @@
     </w:p>
     <w:p>
       <w:pPr>
-        <w:pStyle w:val="PargrafodaLista"/>
+        <w:pStyle w:val="ListParagraph"/>
         <w:numPr>
           <w:ilvl w:val="0"/>
           <w:numId w:val="6"/>
@@ -2164,7 +2167,7 @@
     </w:p>
     <w:p>
       <w:pPr>
-        <w:pStyle w:val="Ttulo2"/>
+        <w:pStyle w:val="Heading2"/>
         <w:keepNext/>
       </w:pPr>
       <w:r>
@@ -2174,7 +2177,7 @@
     </w:p>
     <w:p>
       <w:pPr>
-        <w:pStyle w:val="PargrafodaLista"/>
+        <w:pStyle w:val="ListParagraph"/>
         <w:numPr>
           <w:ilvl w:val="0"/>
           <w:numId w:val="5"/>
@@ -2193,7 +2196,7 @@
     </w:p>
     <w:p>
       <w:pPr>
-        <w:pStyle w:val="PargrafodaLista"/>
+        <w:pStyle w:val="ListParagraph"/>
         <w:numPr>
           <w:ilvl w:val="0"/>
           <w:numId w:val="5"/>
@@ -2212,7 +2215,7 @@
     </w:p>
     <w:p>
       <w:pPr>
-        <w:pStyle w:val="PargrafodaLista"/>
+        <w:pStyle w:val="ListParagraph"/>
         <w:numPr>
           <w:ilvl w:val="0"/>
           <w:numId w:val="5"/>
@@ -2231,7 +2234,7 @@
     </w:p>
     <w:p>
       <w:pPr>
-        <w:pStyle w:val="PargrafodaLista"/>
+        <w:pStyle w:val="ListParagraph"/>
         <w:numPr>
           <w:ilvl w:val="0"/>
           <w:numId w:val="5"/>
@@ -2250,7 +2253,7 @@
     </w:p>
     <w:p>
       <w:pPr>
-        <w:pStyle w:val="PargrafodaLista"/>
+        <w:pStyle w:val="ListParagraph"/>
         <w:numPr>
           <w:ilvl w:val="0"/>
           <w:numId w:val="5"/>
@@ -2269,7 +2272,7 @@
     </w:p>
     <w:p>
       <w:pPr>
-        <w:pStyle w:val="PargrafodaLista"/>
+        <w:pStyle w:val="ListParagraph"/>
         <w:numPr>
           <w:ilvl w:val="0"/>
           <w:numId w:val="5"/>
@@ -2288,7 +2291,7 @@
     </w:p>
     <w:p>
       <w:pPr>
-        <w:pStyle w:val="PargrafodaLista"/>
+        <w:pStyle w:val="ListParagraph"/>
         <w:numPr>
           <w:ilvl w:val="0"/>
           <w:numId w:val="5"/>
@@ -2311,7 +2314,7 @@
     <w:p/>
     <w:p>
       <w:pPr>
-        <w:pStyle w:val="Ttulo1"/>
+        <w:pStyle w:val="Heading1"/>
       </w:pPr>
       <w:r>
         <w:t xml:space="preserve">2. Tabela de </w:t>
@@ -5281,7 +5284,7 @@
     </w:p>
     <w:p>
       <w:pPr>
-        <w:pStyle w:val="Ttulo1"/>
+        <w:pStyle w:val="Heading1"/>
       </w:pPr>
       <w:r>
         <w:t>3</w:t>
@@ -5321,7 +5324,7 @@
     </w:p>
     <w:p>
       <w:pPr>
-        <w:pStyle w:val="Ttulo1"/>
+        <w:pStyle w:val="Heading1"/>
       </w:pPr>
       <w:r>
         <w:t>4</w:t>
@@ -5406,7 +5409,7 @@
     </w:p>
     <w:p>
       <w:pPr>
-        <w:pStyle w:val="Ttulo1"/>
+        <w:pStyle w:val="Heading1"/>
       </w:pPr>
       <w:r>
         <w:lastRenderedPageBreak/>
@@ -5477,7 +5480,7 @@
     </w:p>
     <w:p>
       <w:pPr>
-        <w:pStyle w:val="Ttulo1"/>
+        <w:pStyle w:val="Heading1"/>
       </w:pPr>
       <w:bookmarkStart w:id="10" w:name="_Toc240009162"/>
       <w:r>
@@ -5582,7 +5585,7 @@
 </file>
 
 <file path=word/endnotes.xml><?xml version="1.0" encoding="utf-8"?>
-<w:endnotes xmlns:wpc="http://schemas.microsoft.com/office/word/2010/wordprocessingCanvas" xmlns:cx="http://schemas.microsoft.com/office/drawing/2014/chartex" xmlns:cx1="http://schemas.microsoft.com/office/drawing/2015/9/8/chartex" xmlns:cx2="http://schemas.microsoft.com/office/drawing/2015/10/21/chartex" xmlns:cx3="http://schemas.microsoft.com/office/drawing/2016/5/9/chartex" xmlns:cx4="http://schemas.microsoft.com/office/drawing/2016/5/10/chartex" xmlns:cx5="http://schemas.microsoft.com/office/drawing/2016/5/11/chartex" xmlns:cx6="http://schemas.microsoft.com/office/drawing/2016/5/12/chartex" xmlns:cx7="http://schemas.microsoft.com/office/drawing/2016/5/13/chartex" xmlns:cx8="http://schemas.microsoft.com/office/drawing/2016/5/14/chartex" xmlns:mc="http://schemas.openxmlformats.org/markup-compatibility/2006" xmlns:aink="http://schemas.microsoft.com/office/drawing/2016/ink" xmlns:am3d="http://schemas.microsoft.com/office/drawing/2017/model3d" xmlns:o="urn:schemas-microsoft-com:office:office" xmlns:oel="http://schemas.microsoft.com/office/2019/extlst" xmlns:r="http://schemas.openxmlformats.org/officeDocument/2006/relationships" xmlns:m="http://schemas.openxmlformats.org/officeDocument/2006/math" xmlns:v="urn:schemas-microsoft-com:vml" xmlns:wp14="http://schemas.microsoft.com/office/word/2010/wordprocessingDrawing" xmlns:wp="http://schemas.openxmlformats.org/drawingml/2006/wordprocessingDrawing" xmlns:w10="urn:schemas-microsoft-com:office:word" xmlns:w="http://schemas.openxmlformats.org/wordprocessingml/2006/main" xmlns:w14="http://schemas.microsoft.com/office/word/2010/wordml" xmlns:w15="http://schemas.microsoft.com/office/word/2012/wordml" xmlns:w16cex="http://schemas.microsoft.com/office/word/2018/wordml/cex" xmlns:w16cid="http://schemas.microsoft.com/office/word/2016/wordml/cid" xmlns:w16="http://schemas.microsoft.com/office/word/2018/wordml" xmlns:w16du="http://schemas.microsoft.com/office/word/2023/wordml/word16du" xmlns:w16sdtdh="http://schemas.microsoft.com/office/word/2020/wordml/sdtdatahash" xmlns:w16se="http://schemas.microsoft.com/office/word/2015/wordml/symex" xmlns:wpg="http://schemas.microsoft.com/office/word/2010/wordprocessingGroup" xmlns:wpi="http://schemas.microsoft.com/office/word/2010/wordprocessingInk" xmlns:wne="http://schemas.microsoft.com/office/word/2006/wordml" xmlns:wps="http://schemas.microsoft.com/office/word/2010/wordprocessingShape" mc:Ignorable="w14 w15 w16se w16cid w16 w16cex w16sdtdh w16du wp14">
+<w:endnotes xmlns:wpc="http://schemas.microsoft.com/office/word/2010/wordprocessingCanvas" xmlns:cx="http://schemas.microsoft.com/office/drawing/2014/chartex" xmlns:cx1="http://schemas.microsoft.com/office/drawing/2015/9/8/chartex" xmlns:cx2="http://schemas.microsoft.com/office/drawing/2015/10/21/chartex" xmlns:cx3="http://schemas.microsoft.com/office/drawing/2016/5/9/chartex" xmlns:cx4="http://schemas.microsoft.com/office/drawing/2016/5/10/chartex" xmlns:cx5="http://schemas.microsoft.com/office/drawing/2016/5/11/chartex" xmlns:cx6="http://schemas.microsoft.com/office/drawing/2016/5/12/chartex" xmlns:cx7="http://schemas.microsoft.com/office/drawing/2016/5/13/chartex" xmlns:cx8="http://schemas.microsoft.com/office/drawing/2016/5/14/chartex" xmlns:mc="http://schemas.openxmlformats.org/markup-compatibility/2006" xmlns:aink="http://schemas.microsoft.com/office/drawing/2016/ink" xmlns:am3d="http://schemas.microsoft.com/office/drawing/2017/model3d" xmlns:o="urn:schemas-microsoft-com:office:office" xmlns:oel="http://schemas.microsoft.com/office/2019/extlst" xmlns:r="http://schemas.openxmlformats.org/officeDocument/2006/relationships" xmlns:m="http://schemas.openxmlformats.org/officeDocument/2006/math" xmlns:v="urn:schemas-microsoft-com:vml" xmlns:wp14="http://schemas.microsoft.com/office/word/2010/wordprocessingDrawing" xmlns:wp="http://schemas.openxmlformats.org/drawingml/2006/wordprocessingDrawing" xmlns:w10="urn:schemas-microsoft-com:office:word" xmlns:w="http://schemas.openxmlformats.org/wordprocessingml/2006/main" xmlns:w14="http://schemas.microsoft.com/office/word/2010/wordml" xmlns:w15="http://schemas.microsoft.com/office/word/2012/wordml" xmlns:w16cex="http://schemas.microsoft.com/office/word/2018/wordml/cex" xmlns:w16cid="http://schemas.microsoft.com/office/word/2016/wordml/cid" xmlns:w16="http://schemas.microsoft.com/office/word/2018/wordml" xmlns:w16sdtdh="http://schemas.microsoft.com/office/word/2020/wordml/sdtdatahash" xmlns:w16se="http://schemas.microsoft.com/office/word/2015/wordml/symex" xmlns:wpg="http://schemas.microsoft.com/office/word/2010/wordprocessingGroup" xmlns:wpi="http://schemas.microsoft.com/office/word/2010/wordprocessingInk" xmlns:wne="http://schemas.microsoft.com/office/word/2006/wordml" xmlns:wps="http://schemas.microsoft.com/office/word/2010/wordprocessingShape" mc:Ignorable="w14 w15 w16se w16cid w16 w16cex w16sdtdh wp14">
   <w:endnote w:type="separator" w:id="-1">
     <w:p>
       <w:pPr>
@@ -5607,7 +5610,7 @@
 </file>
 
 <file path=word/footnotes.xml><?xml version="1.0" encoding="utf-8"?>
-<w:footnotes xmlns:wpc="http://schemas.microsoft.com/office/word/2010/wordprocessingCanvas" xmlns:cx="http://schemas.microsoft.com/office/drawing/2014/chartex" xmlns:cx1="http://schemas.microsoft.com/office/drawing/2015/9/8/chartex" xmlns:cx2="http://schemas.microsoft.com/office/drawing/2015/10/21/chartex" xmlns:cx3="http://schemas.microsoft.com/office/drawing/2016/5/9/chartex" xmlns:cx4="http://schemas.microsoft.com/office/drawing/2016/5/10/chartex" xmlns:cx5="http://schemas.microsoft.com/office/drawing/2016/5/11/chartex" xmlns:cx6="http://schemas.microsoft.com/office/drawing/2016/5/12/chartex" xmlns:cx7="http://schemas.microsoft.com/office/drawing/2016/5/13/chartex" xmlns:cx8="http://schemas.microsoft.com/office/drawing/2016/5/14/chartex" xmlns:mc="http://schemas.openxmlformats.org/markup-compatibility/2006" xmlns:aink="http://schemas.microsoft.com/office/drawing/2016/ink" xmlns:am3d="http://schemas.microsoft.com/office/drawing/2017/model3d" xmlns:o="urn:schemas-microsoft-com:office:office" xmlns:oel="http://schemas.microsoft.com/office/2019/extlst" xmlns:r="http://schemas.openxmlformats.org/officeDocument/2006/relationships" xmlns:m="http://schemas.openxmlformats.org/officeDocument/2006/math" xmlns:v="urn:schemas-microsoft-com:vml" xmlns:wp14="http://schemas.microsoft.com/office/word/2010/wordprocessingDrawing" xmlns:wp="http://schemas.openxmlformats.org/drawingml/2006/wordprocessingDrawing" xmlns:w10="urn:schemas-microsoft-com:office:word" xmlns:w="http://schemas.openxmlformats.org/wordprocessingml/2006/main" xmlns:w14="http://schemas.microsoft.com/office/word/2010/wordml" xmlns:w15="http://schemas.microsoft.com/office/word/2012/wordml" xmlns:w16cex="http://schemas.microsoft.com/office/word/2018/wordml/cex" xmlns:w16cid="http://schemas.microsoft.com/office/word/2016/wordml/cid" xmlns:w16="http://schemas.microsoft.com/office/word/2018/wordml" xmlns:w16du="http://schemas.microsoft.com/office/word/2023/wordml/word16du" xmlns:w16sdtdh="http://schemas.microsoft.com/office/word/2020/wordml/sdtdatahash" xmlns:w16se="http://schemas.microsoft.com/office/word/2015/wordml/symex" xmlns:wpg="http://schemas.microsoft.com/office/word/2010/wordprocessingGroup" xmlns:wpi="http://schemas.microsoft.com/office/word/2010/wordprocessingInk" xmlns:wne="http://schemas.microsoft.com/office/word/2006/wordml" xmlns:wps="http://schemas.microsoft.com/office/word/2010/wordprocessingShape" mc:Ignorable="w14 w15 w16se w16cid w16 w16cex w16sdtdh w16du wp14">
+<w:footnotes xmlns:wpc="http://schemas.microsoft.com/office/word/2010/wordprocessingCanvas" xmlns:cx="http://schemas.microsoft.com/office/drawing/2014/chartex" xmlns:cx1="http://schemas.microsoft.com/office/drawing/2015/9/8/chartex" xmlns:cx2="http://schemas.microsoft.com/office/drawing/2015/10/21/chartex" xmlns:cx3="http://schemas.microsoft.com/office/drawing/2016/5/9/chartex" xmlns:cx4="http://schemas.microsoft.com/office/drawing/2016/5/10/chartex" xmlns:cx5="http://schemas.microsoft.com/office/drawing/2016/5/11/chartex" xmlns:cx6="http://schemas.microsoft.com/office/drawing/2016/5/12/chartex" xmlns:cx7="http://schemas.microsoft.com/office/drawing/2016/5/13/chartex" xmlns:cx8="http://schemas.microsoft.com/office/drawing/2016/5/14/chartex" xmlns:mc="http://schemas.openxmlformats.org/markup-compatibility/2006" xmlns:aink="http://schemas.microsoft.com/office/drawing/2016/ink" xmlns:am3d="http://schemas.microsoft.com/office/drawing/2017/model3d" xmlns:o="urn:schemas-microsoft-com:office:office" xmlns:oel="http://schemas.microsoft.com/office/2019/extlst" xmlns:r="http://schemas.openxmlformats.org/officeDocument/2006/relationships" xmlns:m="http://schemas.openxmlformats.org/officeDocument/2006/math" xmlns:v="urn:schemas-microsoft-com:vml" xmlns:wp14="http://schemas.microsoft.com/office/word/2010/wordprocessingDrawing" xmlns:wp="http://schemas.openxmlformats.org/drawingml/2006/wordprocessingDrawing" xmlns:w10="urn:schemas-microsoft-com:office:word" xmlns:w="http://schemas.openxmlformats.org/wordprocessingml/2006/main" xmlns:w14="http://schemas.microsoft.com/office/word/2010/wordml" xmlns:w15="http://schemas.microsoft.com/office/word/2012/wordml" xmlns:w16cex="http://schemas.microsoft.com/office/word/2018/wordml/cex" xmlns:w16cid="http://schemas.microsoft.com/office/word/2016/wordml/cid" xmlns:w16="http://schemas.microsoft.com/office/word/2018/wordml" xmlns:w16sdtdh="http://schemas.microsoft.com/office/word/2020/wordml/sdtdatahash" xmlns:w16se="http://schemas.microsoft.com/office/word/2015/wordml/symex" xmlns:wpg="http://schemas.microsoft.com/office/word/2010/wordprocessingGroup" xmlns:wpi="http://schemas.microsoft.com/office/word/2010/wordprocessingInk" xmlns:wne="http://schemas.microsoft.com/office/word/2006/wordml" xmlns:wps="http://schemas.microsoft.com/office/word/2010/wordprocessingShape" mc:Ignorable="w14 w15 w16se w16cid w16 w16cex w16sdtdh wp14">
   <w:footnote w:type="separator" w:id="-1">
     <w:p>
       <w:pPr>
@@ -5632,7 +5635,7 @@
 </file>
 
 <file path=word/header1.xml><?xml version="1.0" encoding="utf-8"?>
-<w:hdr xmlns:wpc="http://schemas.microsoft.com/office/word/2010/wordprocessingCanvas" xmlns:cx="http://schemas.microsoft.com/office/drawing/2014/chartex" xmlns:cx1="http://schemas.microsoft.com/office/drawing/2015/9/8/chartex" xmlns:cx2="http://schemas.microsoft.com/office/drawing/2015/10/21/chartex" xmlns:cx3="http://schemas.microsoft.com/office/drawing/2016/5/9/chartex" xmlns:cx4="http://schemas.microsoft.com/office/drawing/2016/5/10/chartex" xmlns:cx5="http://schemas.microsoft.com/office/drawing/2016/5/11/chartex" xmlns:cx6="http://schemas.microsoft.com/office/drawing/2016/5/12/chartex" xmlns:cx7="http://schemas.microsoft.com/office/drawing/2016/5/13/chartex" xmlns:cx8="http://schemas.microsoft.com/office/drawing/2016/5/14/chartex" xmlns:mc="http://schemas.openxmlformats.org/markup-compatibility/2006" xmlns:aink="http://schemas.microsoft.com/office/drawing/2016/ink" xmlns:am3d="http://schemas.microsoft.com/office/drawing/2017/model3d" xmlns:o="urn:schemas-microsoft-com:office:office" xmlns:oel="http://schemas.microsoft.com/office/2019/extlst" xmlns:r="http://schemas.openxmlformats.org/officeDocument/2006/relationships" xmlns:m="http://schemas.openxmlformats.org/officeDocument/2006/math" xmlns:v="urn:schemas-microsoft-com:vml" xmlns:wp14="http://schemas.microsoft.com/office/word/2010/wordprocessingDrawing" xmlns:wp="http://schemas.openxmlformats.org/drawingml/2006/wordprocessingDrawing" xmlns:w10="urn:schemas-microsoft-com:office:word" xmlns:w="http://schemas.openxmlformats.org/wordprocessingml/2006/main" xmlns:w14="http://schemas.microsoft.com/office/word/2010/wordml" xmlns:w15="http://schemas.microsoft.com/office/word/2012/wordml" xmlns:w16cex="http://schemas.microsoft.com/office/word/2018/wordml/cex" xmlns:w16cid="http://schemas.microsoft.com/office/word/2016/wordml/cid" xmlns:w16="http://schemas.microsoft.com/office/word/2018/wordml" xmlns:w16du="http://schemas.microsoft.com/office/word/2023/wordml/word16du" xmlns:w16sdtdh="http://schemas.microsoft.com/office/word/2020/wordml/sdtdatahash" xmlns:w16se="http://schemas.microsoft.com/office/word/2015/wordml/symex" xmlns:wpg="http://schemas.microsoft.com/office/word/2010/wordprocessingGroup" xmlns:wpi="http://schemas.microsoft.com/office/word/2010/wordprocessingInk" xmlns:wne="http://schemas.microsoft.com/office/word/2006/wordml" xmlns:wps="http://schemas.microsoft.com/office/word/2010/wordprocessingShape" mc:Ignorable="w14 w15 w16se w16cid w16 w16cex w16sdtdh w16du wp14">
+<w:hdr xmlns:wpc="http://schemas.microsoft.com/office/word/2010/wordprocessingCanvas" xmlns:cx="http://schemas.microsoft.com/office/drawing/2014/chartex" xmlns:cx1="http://schemas.microsoft.com/office/drawing/2015/9/8/chartex" xmlns:cx2="http://schemas.microsoft.com/office/drawing/2015/10/21/chartex" xmlns:cx3="http://schemas.microsoft.com/office/drawing/2016/5/9/chartex" xmlns:cx4="http://schemas.microsoft.com/office/drawing/2016/5/10/chartex" xmlns:cx5="http://schemas.microsoft.com/office/drawing/2016/5/11/chartex" xmlns:cx6="http://schemas.microsoft.com/office/drawing/2016/5/12/chartex" xmlns:cx7="http://schemas.microsoft.com/office/drawing/2016/5/13/chartex" xmlns:cx8="http://schemas.microsoft.com/office/drawing/2016/5/14/chartex" xmlns:mc="http://schemas.openxmlformats.org/markup-compatibility/2006" xmlns:aink="http://schemas.microsoft.com/office/drawing/2016/ink" xmlns:am3d="http://schemas.microsoft.com/office/drawing/2017/model3d" xmlns:o="urn:schemas-microsoft-com:office:office" xmlns:oel="http://schemas.microsoft.com/office/2019/extlst" xmlns:r="http://schemas.openxmlformats.org/officeDocument/2006/relationships" xmlns:m="http://schemas.openxmlformats.org/officeDocument/2006/math" xmlns:v="urn:schemas-microsoft-com:vml" xmlns:wp14="http://schemas.microsoft.com/office/word/2010/wordprocessingDrawing" xmlns:wp="http://schemas.openxmlformats.org/drawingml/2006/wordprocessingDrawing" xmlns:w10="urn:schemas-microsoft-com:office:word" xmlns:w="http://schemas.openxmlformats.org/wordprocessingml/2006/main" xmlns:w14="http://schemas.microsoft.com/office/word/2010/wordml" xmlns:w15="http://schemas.microsoft.com/office/word/2012/wordml" xmlns:w16cex="http://schemas.microsoft.com/office/word/2018/wordml/cex" xmlns:w16cid="http://schemas.microsoft.com/office/word/2016/wordml/cid" xmlns:w16="http://schemas.microsoft.com/office/word/2018/wordml" xmlns:w16sdtdh="http://schemas.microsoft.com/office/word/2020/wordml/sdtdatahash" xmlns:w16se="http://schemas.microsoft.com/office/word/2015/wordml/symex" xmlns:wpg="http://schemas.microsoft.com/office/word/2010/wordprocessingGroup" xmlns:wpi="http://schemas.microsoft.com/office/word/2010/wordprocessingInk" xmlns:wne="http://schemas.microsoft.com/office/word/2006/wordml" xmlns:wps="http://schemas.microsoft.com/office/word/2010/wordprocessingShape" mc:Ignorable="w14 w15 w16se w16cid w16 w16cex w16sdtdh wp14">
   <w:sdt>
     <w:sdtPr>
       <w:id w:val="-1213418629"/>
@@ -5649,7 +5652,7 @@
     <w:sdtContent>
       <w:p>
         <w:pPr>
-          <w:pStyle w:val="Cabealho"/>
+          <w:pStyle w:val="Header"/>
           <w:jc w:val="right"/>
         </w:pPr>
         <w:r>
@@ -5678,14 +5681,14 @@
   </w:sdt>
   <w:p>
     <w:pPr>
-      <w:pStyle w:val="Cabealho"/>
+      <w:pStyle w:val="Header"/>
     </w:pPr>
   </w:p>
 </w:hdr>
 </file>
 
 <file path=word/numbering.xml><?xml version="1.0" encoding="utf-8"?>
-<w:numbering xmlns:wpc="http://schemas.microsoft.com/office/word/2010/wordprocessingCanvas" xmlns:cx="http://schemas.microsoft.com/office/drawing/2014/chartex" xmlns:cx1="http://schemas.microsoft.com/office/drawing/2015/9/8/chartex" xmlns:cx2="http://schemas.microsoft.com/office/drawing/2015/10/21/chartex" xmlns:cx3="http://schemas.microsoft.com/office/drawing/2016/5/9/chartex" xmlns:cx4="http://schemas.microsoft.com/office/drawing/2016/5/10/chartex" xmlns:cx5="http://schemas.microsoft.com/office/drawing/2016/5/11/chartex" xmlns:cx6="http://schemas.microsoft.com/office/drawing/2016/5/12/chartex" xmlns:cx7="http://schemas.microsoft.com/office/drawing/2016/5/13/chartex" xmlns:cx8="http://schemas.microsoft.com/office/drawing/2016/5/14/chartex" xmlns:mc="http://schemas.openxmlformats.org/markup-compatibility/2006" xmlns:aink="http://schemas.microsoft.com/office/drawing/2016/ink" xmlns:am3d="http://schemas.microsoft.com/office/drawing/2017/model3d" xmlns:o="urn:schemas-microsoft-com:office:office" xmlns:oel="http://schemas.microsoft.com/office/2019/extlst" xmlns:r="http://schemas.openxmlformats.org/officeDocument/2006/relationships" xmlns:m="http://schemas.openxmlformats.org/officeDocument/2006/math" xmlns:v="urn:schemas-microsoft-com:vml" xmlns:wp14="http://schemas.microsoft.com/office/word/2010/wordprocessingDrawing" xmlns:wp="http://schemas.openxmlformats.org/drawingml/2006/wordprocessingDrawing" xmlns:w10="urn:schemas-microsoft-com:office:word" xmlns:w="http://schemas.openxmlformats.org/wordprocessingml/2006/main" xmlns:w14="http://schemas.microsoft.com/office/word/2010/wordml" xmlns:w15="http://schemas.microsoft.com/office/word/2012/wordml" xmlns:w16cex="http://schemas.microsoft.com/office/word/2018/wordml/cex" xmlns:w16cid="http://schemas.microsoft.com/office/word/2016/wordml/cid" xmlns:w16="http://schemas.microsoft.com/office/word/2018/wordml" xmlns:w16du="http://schemas.microsoft.com/office/word/2023/wordml/word16du" xmlns:w16sdtdh="http://schemas.microsoft.com/office/word/2020/wordml/sdtdatahash" xmlns:w16se="http://schemas.microsoft.com/office/word/2015/wordml/symex" xmlns:wpg="http://schemas.microsoft.com/office/word/2010/wordprocessingGroup" xmlns:wpi="http://schemas.microsoft.com/office/word/2010/wordprocessingInk" xmlns:wne="http://schemas.microsoft.com/office/word/2006/wordml" xmlns:wps="http://schemas.microsoft.com/office/word/2010/wordprocessingShape" mc:Ignorable="w14 w15 w16se w16cid w16 w16cex w16sdtdh w16du wp14">
+<w:numbering xmlns:wpc="http://schemas.microsoft.com/office/word/2010/wordprocessingCanvas" xmlns:cx="http://schemas.microsoft.com/office/drawing/2014/chartex" xmlns:cx1="http://schemas.microsoft.com/office/drawing/2015/9/8/chartex" xmlns:cx2="http://schemas.microsoft.com/office/drawing/2015/10/21/chartex" xmlns:cx3="http://schemas.microsoft.com/office/drawing/2016/5/9/chartex" xmlns:cx4="http://schemas.microsoft.com/office/drawing/2016/5/10/chartex" xmlns:cx5="http://schemas.microsoft.com/office/drawing/2016/5/11/chartex" xmlns:cx6="http://schemas.microsoft.com/office/drawing/2016/5/12/chartex" xmlns:cx7="http://schemas.microsoft.com/office/drawing/2016/5/13/chartex" xmlns:cx8="http://schemas.microsoft.com/office/drawing/2016/5/14/chartex" xmlns:mc="http://schemas.openxmlformats.org/markup-compatibility/2006" xmlns:aink="http://schemas.microsoft.com/office/drawing/2016/ink" xmlns:am3d="http://schemas.microsoft.com/office/drawing/2017/model3d" xmlns:o="urn:schemas-microsoft-com:office:office" xmlns:oel="http://schemas.microsoft.com/office/2019/extlst" xmlns:r="http://schemas.openxmlformats.org/officeDocument/2006/relationships" xmlns:m="http://schemas.openxmlformats.org/officeDocument/2006/math" xmlns:v="urn:schemas-microsoft-com:vml" xmlns:wp14="http://schemas.microsoft.com/office/word/2010/wordprocessingDrawing" xmlns:wp="http://schemas.openxmlformats.org/drawingml/2006/wordprocessingDrawing" xmlns:w10="urn:schemas-microsoft-com:office:word" xmlns:w="http://schemas.openxmlformats.org/wordprocessingml/2006/main" xmlns:w14="http://schemas.microsoft.com/office/word/2010/wordml" xmlns:w15="http://schemas.microsoft.com/office/word/2012/wordml" xmlns:w16cex="http://schemas.microsoft.com/office/word/2018/wordml/cex" xmlns:w16cid="http://schemas.microsoft.com/office/word/2016/wordml/cid" xmlns:w16="http://schemas.microsoft.com/office/word/2018/wordml" xmlns:w16sdtdh="http://schemas.microsoft.com/office/word/2020/wordml/sdtdatahash" xmlns:w16se="http://schemas.microsoft.com/office/word/2015/wordml/symex" xmlns:wpg="http://schemas.microsoft.com/office/word/2010/wordprocessingGroup" xmlns:wpi="http://schemas.microsoft.com/office/word/2010/wordprocessingInk" xmlns:wne="http://schemas.microsoft.com/office/word/2006/wordml" xmlns:wps="http://schemas.microsoft.com/office/word/2010/wordprocessingShape" mc:Ignorable="w14 w15 w16se w16cid w16 w16cex w16sdtdh wp14">
   <w:abstractNum w:abstractNumId="0" w15:restartNumberingAfterBreak="0">
     <w:nsid w:val="17BD535A"/>
     <w:multiLevelType w:val="hybridMultilevel"/>
@@ -6290,7 +6293,7 @@
 </file>
 
 <file path=word/styles.xml><?xml version="1.0" encoding="utf-8"?>
-<w:styles xmlns:mc="http://schemas.openxmlformats.org/markup-compatibility/2006" xmlns:r="http://schemas.openxmlformats.org/officeDocument/2006/relationships" xmlns:w="http://schemas.openxmlformats.org/wordprocessingml/2006/main" xmlns:w14="http://schemas.microsoft.com/office/word/2010/wordml" xmlns:w15="http://schemas.microsoft.com/office/word/2012/wordml" xmlns:w16cex="http://schemas.microsoft.com/office/word/2018/wordml/cex" xmlns:w16cid="http://schemas.microsoft.com/office/word/2016/wordml/cid" xmlns:w16="http://schemas.microsoft.com/office/word/2018/wordml" xmlns:w16du="http://schemas.microsoft.com/office/word/2023/wordml/word16du" xmlns:w16sdtdh="http://schemas.microsoft.com/office/word/2020/wordml/sdtdatahash" xmlns:w16se="http://schemas.microsoft.com/office/word/2015/wordml/symex" mc:Ignorable="w14 w15 w16se w16cid w16 w16cex w16sdtdh w16du">
+<w:styles xmlns:mc="http://schemas.openxmlformats.org/markup-compatibility/2006" xmlns:r="http://schemas.openxmlformats.org/officeDocument/2006/relationships" xmlns:w="http://schemas.openxmlformats.org/wordprocessingml/2006/main" xmlns:w14="http://schemas.microsoft.com/office/word/2010/wordml" xmlns:w15="http://schemas.microsoft.com/office/word/2012/wordml" xmlns:w16cex="http://schemas.microsoft.com/office/word/2018/wordml/cex" xmlns:w16cid="http://schemas.microsoft.com/office/word/2016/wordml/cid" xmlns:w16="http://schemas.microsoft.com/office/word/2018/wordml" xmlns:w16sdtdh="http://schemas.microsoft.com/office/word/2020/wordml/sdtdatahash" xmlns:w16se="http://schemas.microsoft.com/office/word/2015/wordml/symex" mc:Ignorable="w14 w15 w16se w16cid w16 w16cex w16sdtdh">
   <w:docDefaults>
     <w:rPrDefault>
       <w:rPr>
@@ -6700,11 +6703,11 @@
       <w:szCs w:val="24"/>
     </w:rPr>
   </w:style>
-  <w:style w:type="paragraph" w:styleId="Ttulo1">
+  <w:style w:type="paragraph" w:styleId="Heading1">
     <w:name w:val="heading 1"/>
     <w:basedOn w:val="Normal"/>
     <w:next w:val="Normal"/>
-    <w:link w:val="Ttulo1Char"/>
+    <w:link w:val="Heading1Char"/>
     <w:uiPriority w:val="9"/>
     <w:qFormat/>
     <w:rsid w:val="00BD4496"/>
@@ -6716,11 +6719,11 @@
       <w:szCs w:val="28"/>
     </w:rPr>
   </w:style>
-  <w:style w:type="paragraph" w:styleId="Ttulo2">
+  <w:style w:type="paragraph" w:styleId="Heading2">
     <w:name w:val="heading 2"/>
-    <w:basedOn w:val="Ttulo1"/>
+    <w:basedOn w:val="Heading1"/>
     <w:next w:val="Normal"/>
-    <w:link w:val="Ttulo2Char"/>
+    <w:link w:val="Heading2Char"/>
     <w:uiPriority w:val="9"/>
     <w:unhideWhenUsed/>
     <w:qFormat/>
@@ -6729,11 +6732,11 @@
       <w:outlineLvl w:val="1"/>
     </w:pPr>
   </w:style>
-  <w:style w:type="paragraph" w:styleId="Ttulo3">
+  <w:style w:type="paragraph" w:styleId="Heading3">
     <w:name w:val="heading 3"/>
-    <w:basedOn w:val="Ttulo2"/>
+    <w:basedOn w:val="Heading2"/>
     <w:next w:val="Normal"/>
-    <w:link w:val="Ttulo3Char"/>
+    <w:link w:val="Heading3Char"/>
     <w:uiPriority w:val="9"/>
     <w:unhideWhenUsed/>
     <w:qFormat/>
@@ -6742,13 +6745,13 @@
       <w:outlineLvl w:val="2"/>
     </w:pPr>
   </w:style>
-  <w:style w:type="character" w:default="1" w:styleId="Fontepargpadro">
+  <w:style w:type="character" w:default="1" w:styleId="DefaultParagraphFont">
     <w:name w:val="Default Paragraph Font"/>
     <w:uiPriority w:val="1"/>
     <w:semiHidden/>
     <w:unhideWhenUsed/>
   </w:style>
-  <w:style w:type="table" w:default="1" w:styleId="Tabelanormal">
+  <w:style w:type="table" w:default="1" w:styleId="TableNormal">
     <w:name w:val="Normal Table"/>
     <w:uiPriority w:val="99"/>
     <w:semiHidden/>
@@ -6763,16 +6766,16 @@
       </w:tblCellMar>
     </w:tblPr>
   </w:style>
-  <w:style w:type="numbering" w:default="1" w:styleId="Semlista">
+  <w:style w:type="numbering" w:default="1" w:styleId="NoList">
     <w:name w:val="No List"/>
     <w:uiPriority w:val="99"/>
     <w:semiHidden/>
     <w:unhideWhenUsed/>
   </w:style>
-  <w:style w:type="character" w:customStyle="1" w:styleId="Ttulo1Char">
-    <w:name w:val="Título 1 Char"/>
-    <w:basedOn w:val="Fontepargpadro"/>
-    <w:link w:val="Ttulo1"/>
+  <w:style w:type="character" w:customStyle="1" w:styleId="Heading1Char">
+    <w:name w:val="Heading 1 Char"/>
+    <w:basedOn w:val="DefaultParagraphFont"/>
+    <w:link w:val="Heading1"/>
     <w:uiPriority w:val="9"/>
     <w:rsid w:val="00BD4496"/>
     <w:rPr>
@@ -6781,10 +6784,10 @@
       <w:szCs w:val="28"/>
     </w:rPr>
   </w:style>
-  <w:style w:type="character" w:customStyle="1" w:styleId="Ttulo2Char">
-    <w:name w:val="Título 2 Char"/>
-    <w:basedOn w:val="Fontepargpadro"/>
-    <w:link w:val="Ttulo2"/>
+  <w:style w:type="character" w:customStyle="1" w:styleId="Heading2Char">
+    <w:name w:val="Heading 2 Char"/>
+    <w:basedOn w:val="DefaultParagraphFont"/>
+    <w:link w:val="Heading2"/>
     <w:uiPriority w:val="9"/>
     <w:rsid w:val="00BD4496"/>
     <w:rPr>
@@ -6793,10 +6796,10 @@
       <w:szCs w:val="28"/>
     </w:rPr>
   </w:style>
-  <w:style w:type="character" w:customStyle="1" w:styleId="Ttulo3Char">
-    <w:name w:val="Título 3 Char"/>
-    <w:basedOn w:val="Fontepargpadro"/>
-    <w:link w:val="Ttulo3"/>
+  <w:style w:type="character" w:customStyle="1" w:styleId="Heading3Char">
+    <w:name w:val="Heading 3 Char"/>
+    <w:basedOn w:val="DefaultParagraphFont"/>
+    <w:link w:val="Heading3"/>
     <w:uiPriority w:val="9"/>
     <w:rsid w:val="00BD4496"/>
     <w:rPr>
@@ -6822,7 +6825,7 @@
       <w14:ligatures w14:val="none"/>
     </w:rPr>
   </w:style>
-  <w:style w:type="paragraph" w:styleId="PargrafodaLista">
+  <w:style w:type="paragraph" w:styleId="ListParagraph">
     <w:name w:val="List Paragraph"/>
     <w:basedOn w:val="Normal"/>
     <w:uiPriority w:val="34"/>
@@ -6835,7 +6838,7 @@
   </w:style>
   <w:style w:type="character" w:styleId="Hyperlink">
     <w:name w:val="Hyperlink"/>
-    <w:basedOn w:val="Fontepargpadro"/>
+    <w:basedOn w:val="DefaultParagraphFont"/>
     <w:uiPriority w:val="99"/>
     <w:unhideWhenUsed/>
     <w:rsid w:val="00B669D3"/>
@@ -6844,9 +6847,9 @@
       <w:u w:val="single"/>
     </w:rPr>
   </w:style>
-  <w:style w:type="character" w:styleId="MenoPendente">
+  <w:style w:type="character" w:styleId="UnresolvedMention">
     <w:name w:val="Unresolved Mention"/>
-    <w:basedOn w:val="Fontepargpadro"/>
+    <w:basedOn w:val="DefaultParagraphFont"/>
     <w:uiPriority w:val="99"/>
     <w:semiHidden/>
     <w:unhideWhenUsed/>
@@ -6856,10 +6859,10 @@
       <w:shd w:val="clear" w:color="auto" w:fill="E1DFDD"/>
     </w:rPr>
   </w:style>
-  <w:style w:type="paragraph" w:styleId="Cabealho">
+  <w:style w:type="paragraph" w:styleId="Header">
     <w:name w:val="header"/>
     <w:basedOn w:val="Normal"/>
-    <w:link w:val="CabealhoChar"/>
+    <w:link w:val="HeaderChar"/>
     <w:uiPriority w:val="99"/>
     <w:unhideWhenUsed/>
     <w:rsid w:val="007832B1"/>
@@ -6871,10 +6874,10 @@
       <w:spacing w:after="0" w:line="240" w:lineRule="auto"/>
     </w:pPr>
   </w:style>
-  <w:style w:type="character" w:customStyle="1" w:styleId="CabealhoChar">
-    <w:name w:val="Cabeçalho Char"/>
-    <w:basedOn w:val="Fontepargpadro"/>
-    <w:link w:val="Cabealho"/>
+  <w:style w:type="character" w:customStyle="1" w:styleId="HeaderChar">
+    <w:name w:val="Header Char"/>
+    <w:basedOn w:val="DefaultParagraphFont"/>
+    <w:link w:val="Header"/>
     <w:uiPriority w:val="99"/>
     <w:rsid w:val="007832B1"/>
     <w:rPr>
@@ -6883,10 +6886,10 @@
       <w:szCs w:val="24"/>
     </w:rPr>
   </w:style>
-  <w:style w:type="paragraph" w:styleId="Rodap">
+  <w:style w:type="paragraph" w:styleId="Footer">
     <w:name w:val="footer"/>
     <w:basedOn w:val="Normal"/>
-    <w:link w:val="RodapChar"/>
+    <w:link w:val="FooterChar"/>
     <w:uiPriority w:val="99"/>
     <w:unhideWhenUsed/>
     <w:rsid w:val="007832B1"/>
@@ -6898,10 +6901,10 @@
       <w:spacing w:after="0" w:line="240" w:lineRule="auto"/>
     </w:pPr>
   </w:style>
-  <w:style w:type="character" w:customStyle="1" w:styleId="RodapChar">
-    <w:name w:val="Rodapé Char"/>
-    <w:basedOn w:val="Fontepargpadro"/>
-    <w:link w:val="Rodap"/>
+  <w:style w:type="character" w:customStyle="1" w:styleId="FooterChar">
+    <w:name w:val="Footer Char"/>
+    <w:basedOn w:val="DefaultParagraphFont"/>
+    <w:link w:val="Footer"/>
     <w:uiPriority w:val="99"/>
     <w:rsid w:val="007832B1"/>
     <w:rPr>
@@ -6910,9 +6913,9 @@
       <w:szCs w:val="24"/>
     </w:rPr>
   </w:style>
-  <w:style w:type="paragraph" w:styleId="CabealhodoSumrio">
+  <w:style w:type="paragraph" w:styleId="TOCHeading">
     <w:name w:val="TOC Heading"/>
-    <w:basedOn w:val="Ttulo1"/>
+    <w:basedOn w:val="Heading1"/>
     <w:next w:val="Normal"/>
     <w:uiPriority w:val="39"/>
     <w:unhideWhenUsed/>
@@ -6935,7 +6938,7 @@
       <w14:ligatures w14:val="none"/>
     </w:rPr>
   </w:style>
-  <w:style w:type="paragraph" w:styleId="Sumrio1">
+  <w:style w:type="paragraph" w:styleId="TOC1">
     <w:name w:val="toc 1"/>
     <w:basedOn w:val="Normal"/>
     <w:next w:val="Normal"/>
@@ -6947,7 +6950,7 @@
       <w:spacing w:after="100"/>
     </w:pPr>
   </w:style>
-  <w:style w:type="paragraph" w:styleId="Sumrio2">
+  <w:style w:type="paragraph" w:styleId="TOC2">
     <w:name w:val="toc 2"/>
     <w:basedOn w:val="Normal"/>
     <w:next w:val="Normal"/>
@@ -6960,7 +6963,7 @@
       <w:ind w:left="240"/>
     </w:pPr>
   </w:style>
-  <w:style w:type="paragraph" w:styleId="Sumrio3">
+  <w:style w:type="paragraph" w:styleId="TOC3">
     <w:name w:val="toc 3"/>
     <w:basedOn w:val="Normal"/>
     <w:next w:val="Normal"/>
@@ -6973,9 +6976,9 @@
       <w:ind w:left="480"/>
     </w:pPr>
   </w:style>
-  <w:style w:type="character" w:styleId="HiperlinkVisitado">
+  <w:style w:type="character" w:styleId="FollowedHyperlink">
     <w:name w:val="FollowedHyperlink"/>
-    <w:basedOn w:val="Fontepargpadro"/>
+    <w:basedOn w:val="DefaultParagraphFont"/>
     <w:uiPriority w:val="99"/>
     <w:semiHidden/>
     <w:unhideWhenUsed/>

</xml_diff>

<commit_message>
fix: Diagrama de classes atualizado e documentação atualizada
</commit_message>
<xml_diff>
--- a/SoulPass-Java-Documentacao.docx
+++ b/SoulPass-Java-Documentacao.docx
@@ -1,13 +1,13 @@
 
 <file path=word/document.xml><?xml version="1.0" encoding="utf-8"?>
-<w:document xmlns:wpc="http://schemas.microsoft.com/office/word/2010/wordprocessingCanvas" xmlns:cx="http://schemas.microsoft.com/office/drawing/2014/chartex" xmlns:cx1="http://schemas.microsoft.com/office/drawing/2015/9/8/chartex" xmlns:cx2="http://schemas.microsoft.com/office/drawing/2015/10/21/chartex" xmlns:cx3="http://schemas.microsoft.com/office/drawing/2016/5/9/chartex" xmlns:cx4="http://schemas.microsoft.com/office/drawing/2016/5/10/chartex" xmlns:cx5="http://schemas.microsoft.com/office/drawing/2016/5/11/chartex" xmlns:cx6="http://schemas.microsoft.com/office/drawing/2016/5/12/chartex" xmlns:cx7="http://schemas.microsoft.com/office/drawing/2016/5/13/chartex" xmlns:cx8="http://schemas.microsoft.com/office/drawing/2016/5/14/chartex" xmlns:mc="http://schemas.openxmlformats.org/markup-compatibility/2006" xmlns:aink="http://schemas.microsoft.com/office/drawing/2016/ink" xmlns:am3d="http://schemas.microsoft.com/office/drawing/2017/model3d" xmlns:o="urn:schemas-microsoft-com:office:office" xmlns:oel="http://schemas.microsoft.com/office/2019/extlst" xmlns:r="http://schemas.openxmlformats.org/officeDocument/2006/relationships" xmlns:m="http://schemas.openxmlformats.org/officeDocument/2006/math" xmlns:v="urn:schemas-microsoft-com:vml" xmlns:wp14="http://schemas.microsoft.com/office/word/2010/wordprocessingDrawing" xmlns:wp="http://schemas.openxmlformats.org/drawingml/2006/wordprocessingDrawing" xmlns:w10="urn:schemas-microsoft-com:office:word" xmlns:w="http://schemas.openxmlformats.org/wordprocessingml/2006/main" xmlns:w14="http://schemas.microsoft.com/office/word/2010/wordml" xmlns:w15="http://schemas.microsoft.com/office/word/2012/wordml" xmlns:w16cex="http://schemas.microsoft.com/office/word/2018/wordml/cex" xmlns:w16cid="http://schemas.microsoft.com/office/word/2016/wordml/cid" xmlns:w16="http://schemas.microsoft.com/office/word/2018/wordml" xmlns:w16sdtdh="http://schemas.microsoft.com/office/word/2020/wordml/sdtdatahash" xmlns:w16se="http://schemas.microsoft.com/office/word/2015/wordml/symex" xmlns:wpg="http://schemas.microsoft.com/office/word/2010/wordprocessingGroup" xmlns:wpi="http://schemas.microsoft.com/office/word/2010/wordprocessingInk" xmlns:wne="http://schemas.microsoft.com/office/word/2006/wordml" xmlns:wps="http://schemas.microsoft.com/office/word/2010/wordprocessingShape" mc:Ignorable="w14 w15 w16se w16cid w16 w16cex w16sdtdh wp14">
+<w:document xmlns:wpc="http://schemas.microsoft.com/office/word/2010/wordprocessingCanvas" xmlns:cx="http://schemas.microsoft.com/office/drawing/2014/chartex" xmlns:cx1="http://schemas.microsoft.com/office/drawing/2015/9/8/chartex" xmlns:cx2="http://schemas.microsoft.com/office/drawing/2015/10/21/chartex" xmlns:cx3="http://schemas.microsoft.com/office/drawing/2016/5/9/chartex" xmlns:cx4="http://schemas.microsoft.com/office/drawing/2016/5/10/chartex" xmlns:cx5="http://schemas.microsoft.com/office/drawing/2016/5/11/chartex" xmlns:cx6="http://schemas.microsoft.com/office/drawing/2016/5/12/chartex" xmlns:cx7="http://schemas.microsoft.com/office/drawing/2016/5/13/chartex" xmlns:cx8="http://schemas.microsoft.com/office/drawing/2016/5/14/chartex" xmlns:mc="http://schemas.openxmlformats.org/markup-compatibility/2006" xmlns:aink="http://schemas.microsoft.com/office/drawing/2016/ink" xmlns:am3d="http://schemas.microsoft.com/office/drawing/2017/model3d" xmlns:o="urn:schemas-microsoft-com:office:office" xmlns:oel="http://schemas.microsoft.com/office/2019/extlst" xmlns:r="http://schemas.openxmlformats.org/officeDocument/2006/relationships" xmlns:m="http://schemas.openxmlformats.org/officeDocument/2006/math" xmlns:v="urn:schemas-microsoft-com:vml" xmlns:wp14="http://schemas.microsoft.com/office/word/2010/wordprocessingDrawing" xmlns:wp="http://schemas.openxmlformats.org/drawingml/2006/wordprocessingDrawing" xmlns:w10="urn:schemas-microsoft-com:office:word" xmlns:w="http://schemas.openxmlformats.org/wordprocessingml/2006/main" xmlns:w14="http://schemas.microsoft.com/office/word/2010/wordml" xmlns:w15="http://schemas.microsoft.com/office/word/2012/wordml" xmlns:w16cex="http://schemas.microsoft.com/office/word/2018/wordml/cex" xmlns:w16cid="http://schemas.microsoft.com/office/word/2016/wordml/cid" xmlns:w16="http://schemas.microsoft.com/office/word/2018/wordml" xmlns:w16du="http://schemas.microsoft.com/office/word/2023/wordml/word16du" xmlns:w16sdtdh="http://schemas.microsoft.com/office/word/2020/wordml/sdtdatahash" xmlns:w16se="http://schemas.microsoft.com/office/word/2015/wordml/symex" xmlns:wpg="http://schemas.microsoft.com/office/word/2010/wordprocessingGroup" xmlns:wpi="http://schemas.microsoft.com/office/word/2010/wordprocessingInk" xmlns:wne="http://schemas.microsoft.com/office/word/2006/wordml" xmlns:wps="http://schemas.microsoft.com/office/word/2010/wordprocessingShape" mc:Ignorable="w14 w15 w16se w16cid w16 w16cex w16sdtdh w16du wp14">
   <w:body>
     <w:p>
       <w:pPr>
-        <w:pStyle w:val="Heading1"/>
+        <w:pStyle w:val="Ttulo1"/>
         <w:jc w:val="center"/>
       </w:pPr>
-      <w:bookmarkStart w:id="0" w:name="_Toc240009152"/>
+      <w:bookmarkStart w:id="0" w:name="_Toc244177100"/>
       <w:r>
         <w:softHyphen/>
       </w:r>
@@ -238,9 +238,9 @@
     <w:p/>
     <w:p>
       <w:pPr>
-        <w:pStyle w:val="Heading1"/>
-      </w:pPr>
-      <w:bookmarkStart w:id="1" w:name="_Toc240009153"/>
+        <w:pStyle w:val="Ttulo1"/>
+      </w:pPr>
+      <w:bookmarkStart w:id="1" w:name="_Toc244177101"/>
       <w:r>
         <w:t>Sumário</w:t>
       </w:r>
@@ -273,7 +273,7 @@
       <w:sdtContent>
         <w:p>
           <w:pPr>
-            <w:pStyle w:val="TOCHeading"/>
+            <w:pStyle w:val="CabealhodoSumrio"/>
             <w:spacing w:line="360" w:lineRule="auto"/>
             <w:rPr>
               <w:rFonts w:ascii="Arial" w:hAnsi="Arial" w:cs="Arial"/>
@@ -282,24 +282,19 @@
               <w:szCs w:val="28"/>
             </w:rPr>
           </w:pPr>
-          <w:r>
-            <w:rPr>
-              <w:rFonts w:ascii="Arial" w:hAnsi="Arial" w:cs="Arial"/>
-              <w:color w:val="000000" w:themeColor="text1"/>
-              <w:sz w:val="28"/>
-              <w:szCs w:val="28"/>
-            </w:rPr>
-            <w:t>Contents</w:t>
-          </w:r>
         </w:p>
         <w:p>
           <w:pPr>
-            <w:pStyle w:val="TOC1"/>
+            <w:pStyle w:val="Sumrio1"/>
             <w:tabs>
               <w:tab w:val="right" w:leader="dot" w:pos="8494"/>
             </w:tabs>
             <w:rPr>
+              <w:rFonts w:asciiTheme="minorHAnsi" w:eastAsiaTheme="minorEastAsia" w:hAnsiTheme="minorHAnsi" w:cstheme="minorBidi"/>
               <w:noProof/>
+              <w:sz w:val="22"/>
+              <w:szCs w:val="22"/>
+              <w:lang w:eastAsia="pt-BR"/>
             </w:rPr>
           </w:pPr>
           <w:r>
@@ -311,7 +306,7 @@
           <w:r>
             <w:fldChar w:fldCharType="separate"/>
           </w:r>
-          <w:hyperlink w:anchor="_Toc240009152" w:history="1">
+          <w:hyperlink w:anchor="_Toc244177100" w:history="1">
             <w:r>
               <w:rPr>
                 <w:rStyle w:val="Hyperlink"/>
@@ -338,7 +333,7 @@
                 <w:noProof/>
                 <w:webHidden/>
               </w:rPr>
-              <w:instrText xml:space="preserve"> PAGEREF _Toc240009152 \h </w:instrText>
+              <w:instrText xml:space="preserve"> PAGEREF _Toc244177100 \h </w:instrText>
             </w:r>
             <w:r>
               <w:rPr>
@@ -371,15 +366,19 @@
         </w:p>
         <w:p>
           <w:pPr>
-            <w:pStyle w:val="TOC1"/>
+            <w:pStyle w:val="Sumrio1"/>
             <w:tabs>
               <w:tab w:val="right" w:leader="dot" w:pos="8494"/>
             </w:tabs>
             <w:rPr>
+              <w:rFonts w:asciiTheme="minorHAnsi" w:eastAsiaTheme="minorEastAsia" w:hAnsiTheme="minorHAnsi" w:cstheme="minorBidi"/>
               <w:noProof/>
+              <w:sz w:val="22"/>
+              <w:szCs w:val="22"/>
+              <w:lang w:eastAsia="pt-BR"/>
             </w:rPr>
           </w:pPr>
-          <w:hyperlink w:anchor="_Toc240009153" w:history="1">
+          <w:hyperlink w:anchor="_Toc244177101" w:history="1">
             <w:r>
               <w:rPr>
                 <w:rStyle w:val="Hyperlink"/>
@@ -406,7 +405,7 @@
                 <w:noProof/>
                 <w:webHidden/>
               </w:rPr>
-              <w:instrText xml:space="preserve"> PAGEREF _Toc240009153 \h </w:instrText>
+              <w:instrText xml:space="preserve"> PAGEREF _Toc244177101 \h </w:instrText>
             </w:r>
             <w:r>
               <w:rPr>
@@ -439,15 +438,19 @@
         </w:p>
         <w:p>
           <w:pPr>
-            <w:pStyle w:val="TOC1"/>
+            <w:pStyle w:val="Sumrio1"/>
             <w:tabs>
               <w:tab w:val="right" w:leader="dot" w:pos="8494"/>
             </w:tabs>
             <w:rPr>
+              <w:rFonts w:asciiTheme="minorHAnsi" w:eastAsiaTheme="minorEastAsia" w:hAnsiTheme="minorHAnsi" w:cstheme="minorBidi"/>
               <w:noProof/>
+              <w:sz w:val="22"/>
+              <w:szCs w:val="22"/>
+              <w:lang w:eastAsia="pt-BR"/>
             </w:rPr>
           </w:pPr>
-          <w:hyperlink w:anchor="_Toc240009154" w:history="1">
+          <w:hyperlink w:anchor="_Toc244177102" w:history="1">
             <w:r>
               <w:rPr>
                 <w:rStyle w:val="Hyperlink"/>
@@ -474,7 +477,7 @@
                 <w:noProof/>
                 <w:webHidden/>
               </w:rPr>
-              <w:instrText xml:space="preserve"> PAGEREF _Toc240009154 \h </w:instrText>
+              <w:instrText xml:space="preserve"> PAGEREF _Toc244177102 \h </w:instrText>
             </w:r>
             <w:r>
               <w:rPr>
@@ -507,15 +510,19 @@
         </w:p>
         <w:p>
           <w:pPr>
-            <w:pStyle w:val="TOC2"/>
+            <w:pStyle w:val="Sumrio2"/>
             <w:tabs>
               <w:tab w:val="right" w:leader="dot" w:pos="8494"/>
             </w:tabs>
             <w:rPr>
+              <w:rFonts w:asciiTheme="minorHAnsi" w:eastAsiaTheme="minorEastAsia" w:hAnsiTheme="minorHAnsi" w:cstheme="minorBidi"/>
               <w:noProof/>
+              <w:sz w:val="22"/>
+              <w:szCs w:val="22"/>
+              <w:lang w:eastAsia="pt-BR"/>
             </w:rPr>
           </w:pPr>
-          <w:hyperlink w:anchor="_Toc240009155" w:history="1">
+          <w:hyperlink w:anchor="_Toc244177103" w:history="1">
             <w:r>
               <w:rPr>
                 <w:rStyle w:val="Hyperlink"/>
@@ -542,7 +549,7 @@
                 <w:noProof/>
                 <w:webHidden/>
               </w:rPr>
-              <w:instrText xml:space="preserve"> PAGEREF _Toc240009155 \h </w:instrText>
+              <w:instrText xml:space="preserve"> PAGEREF _Toc244177103 \h </w:instrText>
             </w:r>
             <w:r>
               <w:rPr>
@@ -575,15 +582,19 @@
         </w:p>
         <w:p>
           <w:pPr>
-            <w:pStyle w:val="TOC2"/>
+            <w:pStyle w:val="Sumrio2"/>
             <w:tabs>
               <w:tab w:val="right" w:leader="dot" w:pos="8494"/>
             </w:tabs>
             <w:rPr>
+              <w:rFonts w:asciiTheme="minorHAnsi" w:eastAsiaTheme="minorEastAsia" w:hAnsiTheme="minorHAnsi" w:cstheme="minorBidi"/>
               <w:noProof/>
+              <w:sz w:val="22"/>
+              <w:szCs w:val="22"/>
+              <w:lang w:eastAsia="pt-BR"/>
             </w:rPr>
           </w:pPr>
-          <w:hyperlink w:anchor="_Toc240009156" w:history="1">
+          <w:hyperlink w:anchor="_Toc244177104" w:history="1">
             <w:r>
               <w:rPr>
                 <w:rStyle w:val="Hyperlink"/>
@@ -610,7 +621,7 @@
                 <w:noProof/>
                 <w:webHidden/>
               </w:rPr>
-              <w:instrText xml:space="preserve"> PAGEREF _Toc240009156 \h </w:instrText>
+              <w:instrText xml:space="preserve"> PAGEREF _Toc244177104 \h </w:instrText>
             </w:r>
             <w:r>
               <w:rPr>
@@ -643,15 +654,19 @@
         </w:p>
         <w:p>
           <w:pPr>
-            <w:pStyle w:val="TOC3"/>
+            <w:pStyle w:val="Sumrio3"/>
             <w:tabs>
               <w:tab w:val="right" w:leader="dot" w:pos="8494"/>
             </w:tabs>
             <w:rPr>
+              <w:rFonts w:asciiTheme="minorHAnsi" w:eastAsiaTheme="minorEastAsia" w:hAnsiTheme="minorHAnsi" w:cstheme="minorBidi"/>
               <w:noProof/>
+              <w:sz w:val="22"/>
+              <w:szCs w:val="22"/>
+              <w:lang w:eastAsia="pt-BR"/>
             </w:rPr>
           </w:pPr>
-          <w:hyperlink w:anchor="_Toc240009157" w:history="1">
+          <w:hyperlink w:anchor="_Toc244177105" w:history="1">
             <w:r>
               <w:rPr>
                 <w:rStyle w:val="Hyperlink"/>
@@ -678,7 +693,7 @@
                 <w:noProof/>
                 <w:webHidden/>
               </w:rPr>
-              <w:instrText xml:space="preserve"> PAGEREF _Toc240009157 \h </w:instrText>
+              <w:instrText xml:space="preserve"> PAGEREF _Toc244177105 \h </w:instrText>
             </w:r>
             <w:r>
               <w:rPr>
@@ -711,21 +726,25 @@
         </w:p>
         <w:p>
           <w:pPr>
-            <w:pStyle w:val="TOC3"/>
+            <w:pStyle w:val="Sumrio3"/>
             <w:tabs>
               <w:tab w:val="right" w:leader="dot" w:pos="8494"/>
             </w:tabs>
             <w:rPr>
+              <w:rFonts w:asciiTheme="minorHAnsi" w:eastAsiaTheme="minorEastAsia" w:hAnsiTheme="minorHAnsi" w:cstheme="minorBidi"/>
               <w:noProof/>
+              <w:sz w:val="22"/>
+              <w:szCs w:val="22"/>
+              <w:lang w:eastAsia="pt-BR"/>
             </w:rPr>
           </w:pPr>
-          <w:hyperlink w:anchor="_Toc240009158" w:history="1">
+          <w:hyperlink w:anchor="_Toc244177106" w:history="1">
             <w:r>
               <w:rPr>
                 <w:rStyle w:val="Hyperlink"/>
                 <w:noProof/>
               </w:rPr>
-              <w:t>1.2.2. O que ele (ainda) não pode fazer:</w:t>
+              <w:t>1.2.2. O que ele não pode fazer:</w:t>
             </w:r>
             <w:r>
               <w:rPr>
@@ -746,7 +765,7 @@
                 <w:noProof/>
                 <w:webHidden/>
               </w:rPr>
-              <w:instrText xml:space="preserve"> PAGEREF _Toc240009158 \h </w:instrText>
+              <w:instrText xml:space="preserve"> PAGEREF _Toc244177106 \h </w:instrText>
             </w:r>
             <w:r>
               <w:rPr>
@@ -779,22 +798,25 @@
         </w:p>
         <w:p>
           <w:pPr>
-            <w:pStyle w:val="TOC1"/>
+            <w:pStyle w:val="Sumrio2"/>
             <w:tabs>
               <w:tab w:val="right" w:leader="dot" w:pos="8494"/>
             </w:tabs>
             <w:rPr>
+              <w:rFonts w:asciiTheme="minorHAnsi" w:eastAsiaTheme="minorEastAsia" w:hAnsiTheme="minorHAnsi" w:cstheme="minorBidi"/>
               <w:noProof/>
+              <w:sz w:val="22"/>
+              <w:szCs w:val="22"/>
+              <w:lang w:eastAsia="pt-BR"/>
             </w:rPr>
           </w:pPr>
-          <w:hyperlink w:anchor="_Toc240009159" w:history="1">
+          <w:hyperlink w:anchor="_Toc244177107" w:history="1">
             <w:r>
               <w:rPr>
                 <w:rStyle w:val="Hyperlink"/>
                 <w:noProof/>
-                <w:lang w:val="en-US"/>
-              </w:rPr>
-              <w:t>2. Protótipo</w:t>
+              </w:rPr>
+              <w:t>1.3. Principais funcionalidades da solução</w:t>
             </w:r>
             <w:r>
               <w:rPr>
@@ -815,7 +837,7 @@
                 <w:noProof/>
                 <w:webHidden/>
               </w:rPr>
-              <w:instrText xml:space="preserve"> PAGEREF _Toc240009159 \h </w:instrText>
+              <w:instrText xml:space="preserve"> PAGEREF _Toc244177107 \h </w:instrText>
             </w:r>
             <w:r>
               <w:rPr>
@@ -835,7 +857,7 @@
                 <w:noProof/>
                 <w:webHidden/>
               </w:rPr>
-              <w:t>5</w:t>
+              <w:t>4</w:t>
             </w:r>
             <w:r>
               <w:rPr>
@@ -848,21 +870,25 @@
         </w:p>
         <w:p>
           <w:pPr>
-            <w:pStyle w:val="TOC1"/>
+            <w:pStyle w:val="Sumrio1"/>
             <w:tabs>
               <w:tab w:val="right" w:leader="dot" w:pos="8494"/>
             </w:tabs>
             <w:rPr>
+              <w:rFonts w:asciiTheme="minorHAnsi" w:eastAsiaTheme="minorEastAsia" w:hAnsiTheme="minorHAnsi" w:cstheme="minorBidi"/>
               <w:noProof/>
+              <w:sz w:val="22"/>
+              <w:szCs w:val="22"/>
+              <w:lang w:eastAsia="pt-BR"/>
             </w:rPr>
           </w:pPr>
-          <w:hyperlink w:anchor="_Toc240009160" w:history="1">
+          <w:hyperlink w:anchor="_Toc244177108" w:history="1">
             <w:r>
               <w:rPr>
                 <w:rStyle w:val="Hyperlink"/>
                 <w:noProof/>
               </w:rPr>
-              <w:t>3. MER (Modelo de Entidade e Relacionamento)</w:t>
+              <w:t>2. Tabela de Endpoints (API RESTful)</w:t>
             </w:r>
             <w:r>
               <w:rPr>
@@ -883,7 +909,7 @@
                 <w:noProof/>
                 <w:webHidden/>
               </w:rPr>
-              <w:instrText xml:space="preserve"> PAGEREF _Toc240009160 \h </w:instrText>
+              <w:instrText xml:space="preserve"> PAGEREF _Toc244177108 \h </w:instrText>
             </w:r>
             <w:r>
               <w:rPr>
@@ -916,21 +942,25 @@
         </w:p>
         <w:p>
           <w:pPr>
-            <w:pStyle w:val="TOC1"/>
+            <w:pStyle w:val="Sumrio1"/>
             <w:tabs>
               <w:tab w:val="right" w:leader="dot" w:pos="8494"/>
             </w:tabs>
             <w:rPr>
+              <w:rFonts w:asciiTheme="minorHAnsi" w:eastAsiaTheme="minorEastAsia" w:hAnsiTheme="minorHAnsi" w:cstheme="minorBidi"/>
               <w:noProof/>
+              <w:sz w:val="22"/>
+              <w:szCs w:val="22"/>
+              <w:lang w:eastAsia="pt-BR"/>
             </w:rPr>
           </w:pPr>
-          <w:hyperlink w:anchor="_Toc240009161" w:history="1">
+          <w:hyperlink w:anchor="_Toc244177109" w:history="1">
             <w:r>
               <w:rPr>
                 <w:rStyle w:val="Hyperlink"/>
                 <w:noProof/>
               </w:rPr>
-              <w:t>4. Diagrama de Classes</w:t>
+              <w:t>3. Protótipo – Telas da aplicação</w:t>
             </w:r>
             <w:r>
               <w:rPr>
@@ -951,7 +981,7 @@
                 <w:noProof/>
                 <w:webHidden/>
               </w:rPr>
-              <w:instrText xml:space="preserve"> PAGEREF _Toc240009161 \h </w:instrText>
+              <w:instrText xml:space="preserve"> PAGEREF _Toc244177109 \h </w:instrText>
             </w:r>
             <w:r>
               <w:rPr>
@@ -971,7 +1001,7 @@
                 <w:noProof/>
                 <w:webHidden/>
               </w:rPr>
-              <w:t>5</w:t>
+              <w:t>6</w:t>
             </w:r>
             <w:r>
               <w:rPr>
@@ -984,21 +1014,25 @@
         </w:p>
         <w:p>
           <w:pPr>
-            <w:pStyle w:val="TOC1"/>
+            <w:pStyle w:val="Sumrio1"/>
             <w:tabs>
               <w:tab w:val="right" w:leader="dot" w:pos="8494"/>
             </w:tabs>
             <w:rPr>
+              <w:rFonts w:asciiTheme="minorHAnsi" w:eastAsiaTheme="minorEastAsia" w:hAnsiTheme="minorHAnsi" w:cstheme="minorBidi"/>
               <w:noProof/>
+              <w:sz w:val="22"/>
+              <w:szCs w:val="22"/>
+              <w:lang w:eastAsia="pt-BR"/>
             </w:rPr>
           </w:pPr>
-          <w:hyperlink w:anchor="_Toc240009162" w:history="1">
+          <w:hyperlink w:anchor="_Toc244177110" w:history="1">
             <w:r>
               <w:rPr>
                 <w:rStyle w:val="Hyperlink"/>
                 <w:noProof/>
               </w:rPr>
-              <w:t>5. Como rodar a aplicação?</w:t>
+              <w:t>4. MER (Modelo de Entidade e Relacionamento)</w:t>
             </w:r>
             <w:r>
               <w:rPr>
@@ -1019,7 +1053,7 @@
                 <w:noProof/>
                 <w:webHidden/>
               </w:rPr>
-              <w:instrText xml:space="preserve"> PAGEREF _Toc240009162 \h </w:instrText>
+              <w:instrText xml:space="preserve"> PAGEREF _Toc244177110 \h </w:instrText>
             </w:r>
             <w:r>
               <w:rPr>
@@ -1039,7 +1073,151 @@
                 <w:noProof/>
                 <w:webHidden/>
               </w:rPr>
-              <w:t>6</w:t>
+              <w:t>7</w:t>
+            </w:r>
+            <w:r>
+              <w:rPr>
+                <w:noProof/>
+                <w:webHidden/>
+              </w:rPr>
+              <w:fldChar w:fldCharType="end"/>
+            </w:r>
+          </w:hyperlink>
+        </w:p>
+        <w:p>
+          <w:pPr>
+            <w:pStyle w:val="Sumrio1"/>
+            <w:tabs>
+              <w:tab w:val="right" w:leader="dot" w:pos="8494"/>
+            </w:tabs>
+            <w:rPr>
+              <w:rFonts w:asciiTheme="minorHAnsi" w:eastAsiaTheme="minorEastAsia" w:hAnsiTheme="minorHAnsi" w:cstheme="minorBidi"/>
+              <w:noProof/>
+              <w:sz w:val="22"/>
+              <w:szCs w:val="22"/>
+              <w:lang w:eastAsia="pt-BR"/>
+            </w:rPr>
+          </w:pPr>
+          <w:hyperlink w:anchor="_Toc244177111" w:history="1">
+            <w:r>
+              <w:rPr>
+                <w:rStyle w:val="Hyperlink"/>
+                <w:noProof/>
+              </w:rPr>
+              <w:t>5. Diagrama de Classes</w:t>
+            </w:r>
+            <w:r>
+              <w:rPr>
+                <w:noProof/>
+                <w:webHidden/>
+              </w:rPr>
+              <w:tab/>
+            </w:r>
+            <w:r>
+              <w:rPr>
+                <w:noProof/>
+                <w:webHidden/>
+              </w:rPr>
+              <w:fldChar w:fldCharType="begin"/>
+            </w:r>
+            <w:r>
+              <w:rPr>
+                <w:noProof/>
+                <w:webHidden/>
+              </w:rPr>
+              <w:instrText xml:space="preserve"> PAGEREF _Toc244177111 \h </w:instrText>
+            </w:r>
+            <w:r>
+              <w:rPr>
+                <w:noProof/>
+                <w:webHidden/>
+              </w:rPr>
+            </w:r>
+            <w:r>
+              <w:rPr>
+                <w:noProof/>
+                <w:webHidden/>
+              </w:rPr>
+              <w:fldChar w:fldCharType="separate"/>
+            </w:r>
+            <w:r>
+              <w:rPr>
+                <w:noProof/>
+                <w:webHidden/>
+              </w:rPr>
+              <w:t>7</w:t>
+            </w:r>
+            <w:r>
+              <w:rPr>
+                <w:noProof/>
+                <w:webHidden/>
+              </w:rPr>
+              <w:fldChar w:fldCharType="end"/>
+            </w:r>
+          </w:hyperlink>
+        </w:p>
+        <w:p>
+          <w:pPr>
+            <w:pStyle w:val="Sumrio1"/>
+            <w:tabs>
+              <w:tab w:val="right" w:leader="dot" w:pos="8494"/>
+            </w:tabs>
+            <w:rPr>
+              <w:rFonts w:asciiTheme="minorHAnsi" w:eastAsiaTheme="minorEastAsia" w:hAnsiTheme="minorHAnsi" w:cstheme="minorBidi"/>
+              <w:noProof/>
+              <w:sz w:val="22"/>
+              <w:szCs w:val="22"/>
+              <w:lang w:eastAsia="pt-BR"/>
+            </w:rPr>
+          </w:pPr>
+          <w:hyperlink w:anchor="_Toc244177112" w:history="1">
+            <w:r>
+              <w:rPr>
+                <w:rStyle w:val="Hyperlink"/>
+                <w:noProof/>
+              </w:rPr>
+              <w:t>6. Como rodar a aplicação?</w:t>
+            </w:r>
+            <w:r>
+              <w:rPr>
+                <w:noProof/>
+                <w:webHidden/>
+              </w:rPr>
+              <w:tab/>
+            </w:r>
+            <w:r>
+              <w:rPr>
+                <w:noProof/>
+                <w:webHidden/>
+              </w:rPr>
+              <w:fldChar w:fldCharType="begin"/>
+            </w:r>
+            <w:r>
+              <w:rPr>
+                <w:noProof/>
+                <w:webHidden/>
+              </w:rPr>
+              <w:instrText xml:space="preserve"> PAGEREF _Toc244177112 \h </w:instrText>
+            </w:r>
+            <w:r>
+              <w:rPr>
+                <w:noProof/>
+                <w:webHidden/>
+              </w:rPr>
+            </w:r>
+            <w:r>
+              <w:rPr>
+                <w:noProof/>
+                <w:webHidden/>
+              </w:rPr>
+              <w:fldChar w:fldCharType="separate"/>
+            </w:r>
+            <w:r>
+              <w:rPr>
+                <w:noProof/>
+                <w:webHidden/>
+              </w:rPr>
+              <w:t>8</w:t>
             </w:r>
             <w:r>
               <w:rPr>
@@ -1062,9 +1240,7 @@
         </w:p>
       </w:sdtContent>
     </w:sdt>
-    <w:p>
-      <w:bookmarkStart w:id="2" w:name="_Toc240009154"/>
-    </w:p>
+    <w:p/>
     <w:p/>
     <w:p/>
     <w:p/>
@@ -1077,8 +1253,9 @@
     <w:p/>
     <w:p>
       <w:pPr>
-        <w:pStyle w:val="Heading1"/>
-      </w:pPr>
+        <w:pStyle w:val="Ttulo1"/>
+      </w:pPr>
+      <w:bookmarkStart w:id="2" w:name="_Toc244177102"/>
       <w:r>
         <w:t xml:space="preserve">1. </w:t>
       </w:r>
@@ -1089,9 +1266,9 @@
     </w:p>
     <w:p>
       <w:pPr>
-        <w:pStyle w:val="Heading2"/>
-      </w:pPr>
-      <w:bookmarkStart w:id="3" w:name="_Toc240009155"/>
+        <w:pStyle w:val="Ttulo2"/>
+      </w:pPr>
+      <w:bookmarkStart w:id="3" w:name="_Toc244177103"/>
       <w:r>
         <w:t>1.</w:t>
       </w:r>
@@ -1765,15 +1942,14 @@
         <w:t>.</w:t>
       </w:r>
     </w:p>
-    <w:p>
-      <w:bookmarkStart w:id="4" w:name="_Toc240009156"/>
-    </w:p>
+    <w:p/>
     <w:p/>
     <w:p/>
     <w:p>
       <w:pPr>
-        <w:pStyle w:val="Heading2"/>
-      </w:pPr>
+        <w:pStyle w:val="Ttulo2"/>
+      </w:pPr>
+      <w:bookmarkStart w:id="4" w:name="_Toc244177104"/>
       <w:r>
         <w:t>1.2. O Escopo desse projeto</w:t>
       </w:r>
@@ -1781,9 +1957,9 @@
     </w:p>
     <w:p>
       <w:pPr>
-        <w:pStyle w:val="Heading3"/>
-      </w:pPr>
-      <w:bookmarkStart w:id="5" w:name="_Toc240009157"/>
+        <w:pStyle w:val="Ttulo3"/>
+      </w:pPr>
+      <w:bookmarkStart w:id="5" w:name="_Toc244177105"/>
       <w:r>
         <w:t>1.2.1. O que ele pode fazer:</w:t>
       </w:r>
@@ -1791,7 +1967,7 @@
     </w:p>
     <w:p>
       <w:pPr>
-        <w:pStyle w:val="ListParagraph"/>
+        <w:pStyle w:val="PargrafodaLista"/>
         <w:numPr>
           <w:ilvl w:val="0"/>
           <w:numId w:val="5"/>
@@ -1806,7 +1982,7 @@
     </w:p>
     <w:p>
       <w:pPr>
-        <w:pStyle w:val="ListParagraph"/>
+        <w:pStyle w:val="PargrafodaLista"/>
         <w:numPr>
           <w:ilvl w:val="0"/>
           <w:numId w:val="5"/>
@@ -1828,7 +2004,7 @@
     </w:p>
     <w:p>
       <w:pPr>
-        <w:pStyle w:val="ListParagraph"/>
+        <w:pStyle w:val="PargrafodaLista"/>
         <w:numPr>
           <w:ilvl w:val="0"/>
           <w:numId w:val="5"/>
@@ -1846,7 +2022,7 @@
     </w:p>
     <w:p>
       <w:pPr>
-        <w:pStyle w:val="ListParagraph"/>
+        <w:pStyle w:val="PargrafodaLista"/>
         <w:numPr>
           <w:ilvl w:val="0"/>
           <w:numId w:val="5"/>
@@ -1864,7 +2040,7 @@
     </w:p>
     <w:p>
       <w:pPr>
-        <w:pStyle w:val="ListParagraph"/>
+        <w:pStyle w:val="PargrafodaLista"/>
         <w:numPr>
           <w:ilvl w:val="0"/>
           <w:numId w:val="5"/>
@@ -1879,7 +2055,7 @@
     </w:p>
     <w:p>
       <w:pPr>
-        <w:pStyle w:val="ListParagraph"/>
+        <w:pStyle w:val="PargrafodaLista"/>
         <w:numPr>
           <w:ilvl w:val="0"/>
           <w:numId w:val="5"/>
@@ -1894,7 +2070,7 @@
     </w:p>
     <w:p>
       <w:pPr>
-        <w:pStyle w:val="ListParagraph"/>
+        <w:pStyle w:val="PargrafodaLista"/>
         <w:numPr>
           <w:ilvl w:val="0"/>
           <w:numId w:val="5"/>
@@ -1906,7 +2082,7 @@
     </w:p>
     <w:p>
       <w:pPr>
-        <w:pStyle w:val="ListParagraph"/>
+        <w:pStyle w:val="PargrafodaLista"/>
         <w:numPr>
           <w:ilvl w:val="0"/>
           <w:numId w:val="5"/>
@@ -1918,7 +2094,7 @@
     </w:p>
     <w:p>
       <w:pPr>
-        <w:pStyle w:val="ListParagraph"/>
+        <w:pStyle w:val="PargrafodaLista"/>
         <w:numPr>
           <w:ilvl w:val="0"/>
           <w:numId w:val="5"/>
@@ -1930,7 +2106,7 @@
     </w:p>
     <w:p>
       <w:pPr>
-        <w:pStyle w:val="ListParagraph"/>
+        <w:pStyle w:val="PargrafodaLista"/>
         <w:numPr>
           <w:ilvl w:val="0"/>
           <w:numId w:val="5"/>
@@ -1954,7 +2130,7 @@
     </w:p>
     <w:p>
       <w:pPr>
-        <w:pStyle w:val="ListParagraph"/>
+        <w:pStyle w:val="PargrafodaLista"/>
         <w:numPr>
           <w:ilvl w:val="0"/>
           <w:numId w:val="5"/>
@@ -1978,206 +2154,218 @@
     </w:p>
     <w:p>
       <w:pPr>
-        <w:pStyle w:val="ListParagraph"/>
+        <w:pStyle w:val="PargrafodaLista"/>
         <w:numPr>
           <w:ilvl w:val="0"/>
           <w:numId w:val="5"/>
         </w:numPr>
       </w:pPr>
       <w:r>
-        <w:t xml:space="preserve">Fazer </w:t>
-      </w:r>
-      <w:r>
-        <w:rPr>
-          <w:i/>
-          <w:iCs/>
-        </w:rPr>
-        <w:t>posts;</w:t>
+        <w:t>Ganhar pontos se deslocando 6km por dia;</w:t>
       </w:r>
     </w:p>
     <w:p>
       <w:pPr>
-        <w:pStyle w:val="ListParagraph"/>
+        <w:pStyle w:val="PargrafodaLista"/>
         <w:numPr>
           <w:ilvl w:val="0"/>
           <w:numId w:val="5"/>
         </w:numPr>
       </w:pPr>
       <w:r>
-        <w:t>Postar fotos e textos de ações sustentáveis;</w:t>
+        <w:t>Ver histórico de deslocamento;</w:t>
+      </w:r>
+      <w:r>
+        <w:t xml:space="preserve"> </w:t>
       </w:r>
     </w:p>
     <w:p>
       <w:pPr>
-        <w:pStyle w:val="ListParagraph"/>
+        <w:pStyle w:val="PargrafodaLista"/>
         <w:numPr>
           <w:ilvl w:val="0"/>
           <w:numId w:val="5"/>
         </w:numPr>
       </w:pPr>
       <w:r>
-        <w:t xml:space="preserve">Ganhar pontos fazer </w:t>
-      </w:r>
-      <w:r>
-        <w:rPr>
-          <w:i/>
-          <w:iCs/>
-        </w:rPr>
-        <w:t>posts;</w:t>
+        <w:t>Ver histórico de pontos ganhos;</w:t>
       </w:r>
     </w:p>
     <w:p>
       <w:pPr>
-        <w:pStyle w:val="ListParagraph"/>
+        <w:pStyle w:val="PargrafodaLista"/>
         <w:numPr>
           <w:ilvl w:val="0"/>
           <w:numId w:val="5"/>
         </w:numPr>
       </w:pPr>
       <w:r>
-        <w:t>Ganhar pontos se deslocando 6km por dia;</w:t>
+        <w:t>Converter pontos em crédito</w:t>
+      </w:r>
+      <w:r>
+        <w:t>;</w:t>
       </w:r>
     </w:p>
     <w:p>
       <w:pPr>
-        <w:pStyle w:val="ListParagraph"/>
+        <w:pStyle w:val="PargrafodaLista"/>
         <w:numPr>
           <w:ilvl w:val="0"/>
           <w:numId w:val="5"/>
         </w:numPr>
       </w:pPr>
       <w:r>
-        <w:t>Ver histórico de deslocamento;</w:t>
-      </w:r>
-      <w:r>
-        <w:t xml:space="preserve"> </w:t>
+        <w:t>Se conectar a um banco de dados</w:t>
+      </w:r>
+      <w:r>
+        <w:t>;</w:t>
       </w:r>
     </w:p>
     <w:p>
       <w:pPr>
-        <w:pStyle w:val="ListParagraph"/>
+        <w:pStyle w:val="PargrafodaLista"/>
         <w:numPr>
           <w:ilvl w:val="0"/>
           <w:numId w:val="5"/>
         </w:numPr>
       </w:pPr>
       <w:r>
-        <w:t>Ver histórico de pontos ganhos;</w:t>
+        <w:t>Rodar como app na Render.</w:t>
       </w:r>
     </w:p>
     <w:p>
       <w:pPr>
-        <w:pStyle w:val="ListParagraph"/>
+        <w:pStyle w:val="Ttulo3"/>
+      </w:pPr>
+      <w:bookmarkStart w:id="6" w:name="_Toc244177106"/>
+      <w:r>
+        <w:t>1.2.2. O que ele não pode fazer:</w:t>
+      </w:r>
+      <w:bookmarkEnd w:id="6"/>
+    </w:p>
+    <w:p>
+      <w:pPr>
+        <w:pStyle w:val="PargrafodaLista"/>
+        <w:numPr>
+          <w:ilvl w:val="0"/>
+          <w:numId w:val="6"/>
+        </w:numPr>
+      </w:pPr>
+      <w:r>
+        <w:t>Distinguir, através de Inteligência Artificial (IA),</w:t>
+      </w:r>
+      <w:r>
+        <w:t xml:space="preserve"> o tipo de atividade e o quanto ela vale em pontos </w:t>
+      </w:r>
+      <w:proofErr w:type="spellStart"/>
+      <w:r>
+        <w:rPr>
+          <w:i/>
+          <w:iCs/>
+        </w:rPr>
+        <w:t>in-app</w:t>
+      </w:r>
+      <w:proofErr w:type="spellEnd"/>
+      <w:r>
+        <w:rPr>
+          <w:i/>
+          <w:iCs/>
+        </w:rPr>
+        <w:t>;</w:t>
+      </w:r>
+    </w:p>
+    <w:p>
+      <w:pPr>
+        <w:pStyle w:val="PargrafodaLista"/>
+        <w:numPr>
+          <w:ilvl w:val="0"/>
+          <w:numId w:val="6"/>
+        </w:numPr>
+      </w:pPr>
+      <w:r>
+        <w:t xml:space="preserve">Se </w:t>
+      </w:r>
+      <w:proofErr w:type="gramStart"/>
+      <w:r>
+        <w:t>conectar  rede</w:t>
+      </w:r>
+      <w:proofErr w:type="gramEnd"/>
+      <w:r>
+        <w:t xml:space="preserve"> de postagens para se ter comentários ou likes;</w:t>
+      </w:r>
+    </w:p>
+    <w:p>
+      <w:pPr>
+        <w:pStyle w:val="Ttulo2"/>
+        <w:keepNext/>
+      </w:pPr>
+      <w:bookmarkStart w:id="7" w:name="_Toc244177107"/>
+      <w:r>
+        <w:t>1.3. Principais funcionalidades da solução</w:t>
+      </w:r>
+      <w:bookmarkEnd w:id="7"/>
+    </w:p>
+    <w:p>
+      <w:pPr>
+        <w:pStyle w:val="PargrafodaLista"/>
         <w:numPr>
           <w:ilvl w:val="0"/>
           <w:numId w:val="5"/>
         </w:numPr>
       </w:pPr>
       <w:r>
-        <w:t>Converter pontos em crédito</w:t>
-      </w:r>
-      <w:r>
-        <w:t>;</w:t>
+        <w:rPr>
+          <w:b/>
+          <w:bCs/>
+        </w:rPr>
+        <w:t xml:space="preserve">Cadastro, login e recuperação de senha: </w:t>
+      </w:r>
+      <w:r>
+        <w:t>o cadastro do usuário já cria, automaticamente, a conta de pontos vinculada a ele. A senha nunca é devolvida nas respostas da API.</w:t>
       </w:r>
     </w:p>
     <w:p>
       <w:pPr>
-        <w:pStyle w:val="ListParagraph"/>
+        <w:pStyle w:val="PargrafodaLista"/>
         <w:numPr>
           <w:ilvl w:val="0"/>
           <w:numId w:val="5"/>
         </w:numPr>
       </w:pPr>
       <w:r>
-        <w:t>Se conectar a um banco de dados.</w:t>
+        <w:rPr>
+          <w:b/>
+          <w:bCs/>
+        </w:rPr>
+        <w:lastRenderedPageBreak/>
+        <w:t xml:space="preserve">Visão geral da conta: </w:t>
+      </w:r>
+      <w:r>
+        <w:t>saldo de pontos, equivalência em reais, crédito disponível no bilhete, distância percorrida nos últimos 7 dias, meta diária de 6 km e últimas atividades.</w:t>
       </w:r>
     </w:p>
     <w:p>
       <w:pPr>
-        <w:pStyle w:val="ListParagraph"/>
+        <w:pStyle w:val="PargrafodaLista"/>
         <w:numPr>
           <w:ilvl w:val="0"/>
           <w:numId w:val="5"/>
         </w:numPr>
       </w:pPr>
       <w:r>
-        <w:t>Se conectar à Interfaces de Programação de Aplicação (Sigla API, em inglês) de terceiros;</w:t>
+        <w:rPr>
+          <w:b/>
+          <w:bCs/>
+        </w:rPr>
+        <w:t xml:space="preserve">Caminhadas: </w:t>
+      </w:r>
+      <w:r>
+        <w:t>cada deslocamento registrado rende 40 pontos a cada 2 km (até 6 km por caminhada), respeitando o limite de 120 pontos por dia, com listagem do histórico de caminhadas.</w:t>
       </w:r>
     </w:p>
     <w:p>
       <w:pPr>
-        <w:pStyle w:val="Heading3"/>
-      </w:pPr>
-      <w:bookmarkStart w:id="6" w:name="_Toc240009158"/>
-      <w:r>
-        <w:t>1.2.2. O que ele (ainda) não pode fazer:</w:t>
-      </w:r>
-      <w:bookmarkEnd w:id="6"/>
-    </w:p>
-    <w:p>
-      <w:pPr>
-        <w:pStyle w:val="ListParagraph"/>
-        <w:numPr>
-          <w:ilvl w:val="0"/>
-          <w:numId w:val="6"/>
-        </w:numPr>
-      </w:pPr>
-      <w:r>
-        <w:t>Distinguir, através de Inteligência Artificial (IA),</w:t>
-      </w:r>
-      <w:r>
-        <w:t xml:space="preserve"> o tipo de atividade e o quanto ela vale em pontos </w:t>
-      </w:r>
-      <w:proofErr w:type="spellStart"/>
-      <w:r>
-        <w:rPr>
-          <w:i/>
-          <w:iCs/>
-        </w:rPr>
-        <w:t>in-app</w:t>
-      </w:r>
-      <w:proofErr w:type="spellEnd"/>
-      <w:r>
-        <w:rPr>
-          <w:i/>
-          <w:iCs/>
-        </w:rPr>
-        <w:t>;</w:t>
-      </w:r>
-    </w:p>
-    <w:p>
-      <w:pPr>
-        <w:pStyle w:val="ListParagraph"/>
-        <w:numPr>
-          <w:ilvl w:val="0"/>
-          <w:numId w:val="6"/>
-        </w:numPr>
-      </w:pPr>
-      <w:r>
-        <w:t xml:space="preserve">Se </w:t>
-      </w:r>
-      <w:proofErr w:type="gramStart"/>
-      <w:r>
-        <w:t>conectar  rede</w:t>
-      </w:r>
-      <w:proofErr w:type="gramEnd"/>
-      <w:r>
-        <w:t xml:space="preserve"> de postagens para se ter comentários ou likes;</w:t>
-      </w:r>
-    </w:p>
-    <w:p>
-      <w:pPr>
-        <w:pStyle w:val="Heading2"/>
-        <w:keepNext/>
-      </w:pPr>
-      <w:r>
-        <w:lastRenderedPageBreak/>
-        <w:t>1.3. Principais funcionalidades da solução</w:t>
-      </w:r>
-    </w:p>
-    <w:p>
-      <w:pPr>
-        <w:pStyle w:val="ListParagraph"/>
+        <w:pStyle w:val="PargrafodaLista"/>
         <w:numPr>
           <w:ilvl w:val="0"/>
           <w:numId w:val="5"/>
@@ -2188,15 +2376,15 @@
           <w:b/>
           <w:bCs/>
         </w:rPr>
-        <w:t xml:space="preserve">Cadastro, login e recuperação de senha: </w:t>
-      </w:r>
-      <w:r>
-        <w:t>o cadastro do usuário já cria, automaticamente, a conta de pontos vinculada a ele. A senha nunca é devolvida nas respostas da API.</w:t>
+        <w:t xml:space="preserve">Conversão de pontos em crédito: </w:t>
+      </w:r>
+      <w:r>
+        <w:t>110 pontos equivalem a R$ 1,00. O usuário pode simular a conversão antes de confirmá-la, e o crédito é somado ao saldo do bilhete único.</w:t>
       </w:r>
     </w:p>
     <w:p>
       <w:pPr>
-        <w:pStyle w:val="ListParagraph"/>
+        <w:pStyle w:val="PargrafodaLista"/>
         <w:numPr>
           <w:ilvl w:val="0"/>
           <w:numId w:val="5"/>
@@ -2207,15 +2395,15 @@
           <w:b/>
           <w:bCs/>
         </w:rPr>
-        <w:t xml:space="preserve">Visão geral da conta: </w:t>
-      </w:r>
-      <w:r>
-        <w:t>saldo de pontos, equivalência em reais, crédito disponível no bilhete, distância percorrida nos últimos 7 dias, meta diária de 6 km e últimas atividades.</w:t>
+        <w:t xml:space="preserve">Bilhete único: </w:t>
+      </w:r>
+      <w:r>
+        <w:t>cadastro de bilhete com número de 9 dígitos vinculado ao usuário, consulta de crédito e manutenção dos dados.</w:t>
       </w:r>
     </w:p>
     <w:p>
       <w:pPr>
-        <w:pStyle w:val="ListParagraph"/>
+        <w:pStyle w:val="PargrafodaLista"/>
         <w:numPr>
           <w:ilvl w:val="0"/>
           <w:numId w:val="5"/>
@@ -2226,15 +2414,15 @@
           <w:b/>
           <w:bCs/>
         </w:rPr>
-        <w:t xml:space="preserve">Caminhadas: </w:t>
-      </w:r>
-      <w:r>
-        <w:t>cada deslocamento registrado rende 40 pontos a cada 2 km (até 6 km por caminhada), respeitando o limite de 120 pontos por dia, com listagem do histórico de caminhadas.</w:t>
+        <w:t xml:space="preserve">Histórico de pontos: </w:t>
+      </w:r>
+      <w:r>
+        <w:t>registro de todos os pontos ganhos por caminhada, com totais e filtro por origem.</w:t>
       </w:r>
     </w:p>
     <w:p>
       <w:pPr>
-        <w:pStyle w:val="ListParagraph"/>
+        <w:pStyle w:val="PargrafodaLista"/>
         <w:numPr>
           <w:ilvl w:val="0"/>
           <w:numId w:val="5"/>
@@ -2245,77 +2433,18 @@
           <w:b/>
           <w:bCs/>
         </w:rPr>
-        <w:t xml:space="preserve">Conversão de pontos em crédito: </w:t>
-      </w:r>
-      <w:r>
-        <w:t>110 pontos equivalem a R$ 1,00. O usuário pode simular a conversão antes de confirmá-la, e o crédito é somado ao saldo do bilhete único.</w:t>
-      </w:r>
-    </w:p>
-    <w:p>
-      <w:pPr>
-        <w:pStyle w:val="ListParagraph"/>
-        <w:numPr>
-          <w:ilvl w:val="0"/>
-          <w:numId w:val="5"/>
-        </w:numPr>
-      </w:pPr>
-      <w:r>
-        <w:rPr>
-          <w:b/>
-          <w:bCs/>
-        </w:rPr>
-        <w:t xml:space="preserve">Bilhete único: </w:t>
-      </w:r>
-      <w:r>
-        <w:t>cadastro de bilhete com número de 9 dígitos vinculado ao usuário, consulta de crédito e manutenção dos dados.</w:t>
-      </w:r>
-    </w:p>
-    <w:p>
-      <w:pPr>
-        <w:pStyle w:val="ListParagraph"/>
-        <w:numPr>
-          <w:ilvl w:val="0"/>
-          <w:numId w:val="5"/>
-        </w:numPr>
-      </w:pPr>
-      <w:r>
-        <w:rPr>
-          <w:b/>
-          <w:bCs/>
-        </w:rPr>
-        <w:t xml:space="preserve">Histórico de pontos: </w:t>
-      </w:r>
-      <w:r>
-        <w:t>registro de todos os pontos ganhos por caminhada, com totais e filtro por origem.</w:t>
-      </w:r>
-    </w:p>
-    <w:p>
-      <w:pPr>
-        <w:pStyle w:val="ListParagraph"/>
-        <w:numPr>
-          <w:ilvl w:val="0"/>
-          <w:numId w:val="5"/>
-        </w:numPr>
-      </w:pPr>
-      <w:r>
-        <w:rPr>
-          <w:b/>
-          <w:bCs/>
-        </w:rPr>
         <w:t xml:space="preserve">Respostas padronizadas: </w:t>
       </w:r>
       <w:r>
         <w:t>a API devolve códigos HTTP adequados (400, 401, 404, 409 e 500) acompanhados de uma mensagem explicando o erro.</w:t>
       </w:r>
-    </w:p>
-    <w:p>
-      <w:bookmarkStart w:id="7" w:name="_Toc240009159"/>
     </w:p>
     <w:p/>
     <w:p>
       <w:pPr>
-        <w:pStyle w:val="Heading1"/>
-      </w:pPr>
+        <w:pStyle w:val="Ttulo1"/>
+      </w:pPr>
+      <w:bookmarkStart w:id="8" w:name="_Toc244177108"/>
       <w:r>
         <w:t xml:space="preserve">2. Tabela de </w:t>
       </w:r>
@@ -2335,6 +2464,7 @@
       <w:r>
         <w:t>)</w:t>
       </w:r>
+      <w:bookmarkEnd w:id="8"/>
     </w:p>
     <w:p/>
     <w:tbl>
@@ -2483,7 +2613,47 @@
                 <w:sz w:val="18"/>
                 <w:szCs w:val="18"/>
               </w:rPr>
-              <w:t>Usuários – /usuarios (telas de cadastro, login e Meu perfil)</w:t>
+              <w:t>Usuários – /</w:t>
+            </w:r>
+            <w:proofErr w:type="spellStart"/>
+            <w:r>
+              <w:rPr>
+                <w:b/>
+                <w:bCs/>
+                <w:sz w:val="18"/>
+                <w:szCs w:val="18"/>
+              </w:rPr>
+              <w:t>usuarios</w:t>
+            </w:r>
+            <w:proofErr w:type="spellEnd"/>
+            <w:r>
+              <w:rPr>
+                <w:b/>
+                <w:bCs/>
+                <w:sz w:val="18"/>
+                <w:szCs w:val="18"/>
+              </w:rPr>
+              <w:t xml:space="preserve"> (telas de cadastro, login </w:t>
+            </w:r>
+            <w:proofErr w:type="gramStart"/>
+            <w:r>
+              <w:rPr>
+                <w:b/>
+                <w:bCs/>
+                <w:sz w:val="18"/>
+                <w:szCs w:val="18"/>
+              </w:rPr>
+              <w:t>e Meu</w:t>
+            </w:r>
+            <w:proofErr w:type="gramEnd"/>
+            <w:r>
+              <w:rPr>
+                <w:b/>
+                <w:bCs/>
+                <w:sz w:val="18"/>
+                <w:szCs w:val="18"/>
+              </w:rPr>
+              <w:t xml:space="preserve"> perfil)</w:t>
             </w:r>
           </w:p>
         </w:tc>
@@ -2528,8 +2698,17 @@
                 <w:sz w:val="18"/>
                 <w:szCs w:val="18"/>
               </w:rPr>
-              <w:t>/usuarios</w:t>
-            </w:r>
+              <w:t>/</w:t>
+            </w:r>
+            <w:proofErr w:type="spellStart"/>
+            <w:r>
+              <w:rPr>
+                <w:sz w:val="18"/>
+                <w:szCs w:val="18"/>
+              </w:rPr>
+              <w:t>usuarios</w:t>
+            </w:r>
+            <w:proofErr w:type="spellEnd"/>
           </w:p>
         </w:tc>
         <w:tc>
@@ -2547,7 +2726,39 @@
                 <w:sz w:val="18"/>
                 <w:szCs w:val="18"/>
               </w:rPr>
-              <w:t>Cadastra o usuário e cria sua conta. Corpo: nome, idade, cpf, email, senha.</w:t>
+              <w:t xml:space="preserve">Cadastra o usuário e cria sua conta. Corpo: nome, idade, </w:t>
+            </w:r>
+            <w:proofErr w:type="spellStart"/>
+            <w:r>
+              <w:rPr>
+                <w:sz w:val="18"/>
+                <w:szCs w:val="18"/>
+              </w:rPr>
+              <w:t>cpf</w:t>
+            </w:r>
+            <w:proofErr w:type="spellEnd"/>
+            <w:r>
+              <w:rPr>
+                <w:sz w:val="18"/>
+                <w:szCs w:val="18"/>
+              </w:rPr>
+              <w:t xml:space="preserve">, </w:t>
+            </w:r>
+            <w:proofErr w:type="spellStart"/>
+            <w:r>
+              <w:rPr>
+                <w:sz w:val="18"/>
+                <w:szCs w:val="18"/>
+              </w:rPr>
+              <w:t>email</w:t>
+            </w:r>
+            <w:proofErr w:type="spellEnd"/>
+            <w:r>
+              <w:rPr>
+                <w:sz w:val="18"/>
+                <w:szCs w:val="18"/>
+              </w:rPr>
+              <w:t>, senha.</w:t>
             </w:r>
           </w:p>
         </w:tc>
@@ -2611,7 +2822,23 @@
                 <w:sz w:val="18"/>
                 <w:szCs w:val="18"/>
               </w:rPr>
-              <w:t>/usuarios/login</w:t>
+              <w:t>/</w:t>
+            </w:r>
+            <w:proofErr w:type="spellStart"/>
+            <w:r>
+              <w:rPr>
+                <w:sz w:val="18"/>
+                <w:szCs w:val="18"/>
+              </w:rPr>
+              <w:t>usuarios</w:t>
+            </w:r>
+            <w:proofErr w:type="spellEnd"/>
+            <w:r>
+              <w:rPr>
+                <w:sz w:val="18"/>
+                <w:szCs w:val="18"/>
+              </w:rPr>
+              <w:t>/login</w:t>
             </w:r>
           </w:p>
         </w:tc>
@@ -2630,7 +2857,23 @@
                 <w:sz w:val="18"/>
                 <w:szCs w:val="18"/>
               </w:rPr>
-              <w:t>Realiza o login. Corpo: email, senha. Retorna usuário e conta.</w:t>
+              <w:t xml:space="preserve">Realiza o login. Corpo: </w:t>
+            </w:r>
+            <w:proofErr w:type="spellStart"/>
+            <w:r>
+              <w:rPr>
+                <w:sz w:val="18"/>
+                <w:szCs w:val="18"/>
+              </w:rPr>
+              <w:t>email</w:t>
+            </w:r>
+            <w:proofErr w:type="spellEnd"/>
+            <w:r>
+              <w:rPr>
+                <w:sz w:val="18"/>
+                <w:szCs w:val="18"/>
+              </w:rPr>
+              <w:t>, senha. Retorna usuário e conta.</w:t>
             </w:r>
           </w:p>
         </w:tc>
@@ -2694,7 +2937,23 @@
                 <w:sz w:val="18"/>
                 <w:szCs w:val="18"/>
               </w:rPr>
-              <w:t>/usuarios/senha</w:t>
+              <w:t>/</w:t>
+            </w:r>
+            <w:proofErr w:type="spellStart"/>
+            <w:r>
+              <w:rPr>
+                <w:sz w:val="18"/>
+                <w:szCs w:val="18"/>
+              </w:rPr>
+              <w:t>usuarios</w:t>
+            </w:r>
+            <w:proofErr w:type="spellEnd"/>
+            <w:r>
+              <w:rPr>
+                <w:sz w:val="18"/>
+                <w:szCs w:val="18"/>
+              </w:rPr>
+              <w:t>/senha</w:t>
             </w:r>
           </w:p>
         </w:tc>
@@ -2713,7 +2972,39 @@
                 <w:sz w:val="18"/>
                 <w:szCs w:val="18"/>
               </w:rPr>
-              <w:t>Redefine a senha. Corpo: email, novaSenha.</w:t>
+              <w:t xml:space="preserve">Redefine a senha. Corpo: </w:t>
+            </w:r>
+            <w:proofErr w:type="spellStart"/>
+            <w:r>
+              <w:rPr>
+                <w:sz w:val="18"/>
+                <w:szCs w:val="18"/>
+              </w:rPr>
+              <w:t>email</w:t>
+            </w:r>
+            <w:proofErr w:type="spellEnd"/>
+            <w:r>
+              <w:rPr>
+                <w:sz w:val="18"/>
+                <w:szCs w:val="18"/>
+              </w:rPr>
+              <w:t xml:space="preserve">, </w:t>
+            </w:r>
+            <w:proofErr w:type="spellStart"/>
+            <w:r>
+              <w:rPr>
+                <w:sz w:val="18"/>
+                <w:szCs w:val="18"/>
+              </w:rPr>
+              <w:t>novaSenha</w:t>
+            </w:r>
+            <w:proofErr w:type="spellEnd"/>
+            <w:r>
+              <w:rPr>
+                <w:sz w:val="18"/>
+                <w:szCs w:val="18"/>
+              </w:rPr>
+              <w:t>.</w:t>
             </w:r>
           </w:p>
         </w:tc>
@@ -2777,8 +3068,17 @@
                 <w:sz w:val="18"/>
                 <w:szCs w:val="18"/>
               </w:rPr>
-              <w:t>/usuarios</w:t>
-            </w:r>
+              <w:t>/</w:t>
+            </w:r>
+            <w:proofErr w:type="spellStart"/>
+            <w:r>
+              <w:rPr>
+                <w:sz w:val="18"/>
+                <w:szCs w:val="18"/>
+              </w:rPr>
+              <w:t>usuarios</w:t>
+            </w:r>
+            <w:proofErr w:type="spellEnd"/>
           </w:p>
         </w:tc>
         <w:tc>
@@ -2841,7 +3141,6 @@
                 <w:sz w:val="18"/>
                 <w:szCs w:val="18"/>
               </w:rPr>
-              <w:lastRenderedPageBreak/>
               <w:t>GET</w:t>
             </w:r>
           </w:p>
@@ -2861,7 +3160,23 @@
                 <w:sz w:val="18"/>
                 <w:szCs w:val="18"/>
               </w:rPr>
-              <w:t>/usuarios/{id}</w:t>
+              <w:t>/</w:t>
+            </w:r>
+            <w:proofErr w:type="spellStart"/>
+            <w:r>
+              <w:rPr>
+                <w:sz w:val="18"/>
+                <w:szCs w:val="18"/>
+              </w:rPr>
+              <w:t>usuarios</w:t>
+            </w:r>
+            <w:proofErr w:type="spellEnd"/>
+            <w:r>
+              <w:rPr>
+                <w:sz w:val="18"/>
+                <w:szCs w:val="18"/>
+              </w:rPr>
+              <w:t>/{id}</w:t>
             </w:r>
           </w:p>
         </w:tc>
@@ -2944,7 +3259,23 @@
                 <w:sz w:val="18"/>
                 <w:szCs w:val="18"/>
               </w:rPr>
-              <w:t>/usuarios/{id}</w:t>
+              <w:t>/</w:t>
+            </w:r>
+            <w:proofErr w:type="spellStart"/>
+            <w:r>
+              <w:rPr>
+                <w:sz w:val="18"/>
+                <w:szCs w:val="18"/>
+              </w:rPr>
+              <w:t>usuarios</w:t>
+            </w:r>
+            <w:proofErr w:type="spellEnd"/>
+            <w:r>
+              <w:rPr>
+                <w:sz w:val="18"/>
+                <w:szCs w:val="18"/>
+              </w:rPr>
+              <w:t>/{id}</w:t>
             </w:r>
           </w:p>
         </w:tc>
@@ -3027,7 +3358,23 @@
                 <w:sz w:val="18"/>
                 <w:szCs w:val="18"/>
               </w:rPr>
-              <w:t>/usuarios/{id}</w:t>
+              <w:t>/</w:t>
+            </w:r>
+            <w:proofErr w:type="spellStart"/>
+            <w:r>
+              <w:rPr>
+                <w:sz w:val="18"/>
+                <w:szCs w:val="18"/>
+              </w:rPr>
+              <w:t>usuarios</w:t>
+            </w:r>
+            <w:proofErr w:type="spellEnd"/>
+            <w:r>
+              <w:rPr>
+                <w:sz w:val="18"/>
+                <w:szCs w:val="18"/>
+              </w:rPr>
+              <w:t>/{id}</w:t>
             </w:r>
           </w:p>
         </w:tc>
@@ -3305,7 +3652,39 @@
                 <w:sz w:val="18"/>
                 <w:szCs w:val="18"/>
               </w:rPr>
-              <w:t>/contas/usuario/{idUser}</w:t>
+              <w:t>/contas/</w:t>
+            </w:r>
+            <w:proofErr w:type="spellStart"/>
+            <w:r>
+              <w:rPr>
+                <w:sz w:val="18"/>
+                <w:szCs w:val="18"/>
+              </w:rPr>
+              <w:t>usuario</w:t>
+            </w:r>
+            <w:proofErr w:type="spellEnd"/>
+            <w:r>
+              <w:rPr>
+                <w:sz w:val="18"/>
+                <w:szCs w:val="18"/>
+              </w:rPr>
+              <w:t>/{</w:t>
+            </w:r>
+            <w:proofErr w:type="spellStart"/>
+            <w:r>
+              <w:rPr>
+                <w:sz w:val="18"/>
+                <w:szCs w:val="18"/>
+              </w:rPr>
+              <w:t>idUser</w:t>
+            </w:r>
+            <w:proofErr w:type="spellEnd"/>
+            <w:r>
+              <w:rPr>
+                <w:sz w:val="18"/>
+                <w:szCs w:val="18"/>
+              </w:rPr>
+              <w:t>}</w:t>
             </w:r>
           </w:p>
         </w:tc>
@@ -3369,6 +3748,7 @@
                 <w:sz w:val="18"/>
                 <w:szCs w:val="18"/>
               </w:rPr>
+              <w:lastRenderedPageBreak/>
               <w:t>GET</w:t>
             </w:r>
           </w:p>
@@ -3471,7 +3851,23 @@
                 <w:sz w:val="18"/>
                 <w:szCs w:val="18"/>
               </w:rPr>
-              <w:t>/contas/{id}/conversao?pontos={pontos}</w:t>
+              <w:t>/contas/{id}/</w:t>
+            </w:r>
+            <w:proofErr w:type="spellStart"/>
+            <w:r>
+              <w:rPr>
+                <w:sz w:val="18"/>
+                <w:szCs w:val="18"/>
+              </w:rPr>
+              <w:t>conversao?pontos</w:t>
+            </w:r>
+            <w:proofErr w:type="spellEnd"/>
+            <w:r>
+              <w:rPr>
+                <w:sz w:val="18"/>
+                <w:szCs w:val="18"/>
+              </w:rPr>
+              <w:t>={pontos}</w:t>
             </w:r>
           </w:p>
         </w:tc>
@@ -3554,8 +3950,17 @@
                 <w:sz w:val="18"/>
                 <w:szCs w:val="18"/>
               </w:rPr>
-              <w:t>/contas/{id}/conversao</w:t>
-            </w:r>
+              <w:t>/contas/{id}/</w:t>
+            </w:r>
+            <w:proofErr w:type="spellStart"/>
+            <w:r>
+              <w:rPr>
+                <w:sz w:val="18"/>
+                <w:szCs w:val="18"/>
+              </w:rPr>
+              <w:t>conversao</w:t>
+            </w:r>
+            <w:proofErr w:type="spellEnd"/>
           </w:p>
         </w:tc>
         <w:tc>
@@ -4081,7 +4486,39 @@
                 <w:sz w:val="18"/>
                 <w:szCs w:val="18"/>
               </w:rPr>
-              <w:t>/bilhetes/usuario/{idUser}</w:t>
+              <w:t>/bilhetes/</w:t>
+            </w:r>
+            <w:proofErr w:type="spellStart"/>
+            <w:r>
+              <w:rPr>
+                <w:sz w:val="18"/>
+                <w:szCs w:val="18"/>
+              </w:rPr>
+              <w:t>usuario</w:t>
+            </w:r>
+            <w:proofErr w:type="spellEnd"/>
+            <w:r>
+              <w:rPr>
+                <w:sz w:val="18"/>
+                <w:szCs w:val="18"/>
+              </w:rPr>
+              <w:t>/{</w:t>
+            </w:r>
+            <w:proofErr w:type="spellStart"/>
+            <w:r>
+              <w:rPr>
+                <w:sz w:val="18"/>
+                <w:szCs w:val="18"/>
+              </w:rPr>
+              <w:t>idUser</w:t>
+            </w:r>
+            <w:proofErr w:type="spellEnd"/>
+            <w:r>
+              <w:rPr>
+                <w:sz w:val="18"/>
+                <w:szCs w:val="18"/>
+              </w:rPr>
+              <w:t>}</w:t>
             </w:r>
           </w:p>
         </w:tc>
@@ -4164,7 +4601,39 @@
                 <w:sz w:val="18"/>
                 <w:szCs w:val="18"/>
               </w:rPr>
-              <w:t>/bilhetes/usuario/{idUser}</w:t>
+              <w:t>/bilhetes/</w:t>
+            </w:r>
+            <w:proofErr w:type="spellStart"/>
+            <w:r>
+              <w:rPr>
+                <w:sz w:val="18"/>
+                <w:szCs w:val="18"/>
+              </w:rPr>
+              <w:t>usuario</w:t>
+            </w:r>
+            <w:proofErr w:type="spellEnd"/>
+            <w:r>
+              <w:rPr>
+                <w:sz w:val="18"/>
+                <w:szCs w:val="18"/>
+              </w:rPr>
+              <w:t>/{</w:t>
+            </w:r>
+            <w:proofErr w:type="spellStart"/>
+            <w:r>
+              <w:rPr>
+                <w:sz w:val="18"/>
+                <w:szCs w:val="18"/>
+              </w:rPr>
+              <w:t>idUser</w:t>
+            </w:r>
+            <w:proofErr w:type="spellEnd"/>
+            <w:r>
+              <w:rPr>
+                <w:sz w:val="18"/>
+                <w:szCs w:val="18"/>
+              </w:rPr>
+              <w:t>}</w:t>
             </w:r>
           </w:p>
         </w:tc>
@@ -4183,7 +4652,23 @@
                 <w:sz w:val="18"/>
                 <w:szCs w:val="18"/>
               </w:rPr>
-              <w:t>Cadastra o bilhete e o vincula ao usuário. Corpo: numBilhete (9 dígitos).</w:t>
+              <w:t xml:space="preserve">Cadastra o bilhete e o vincula ao usuário. Corpo: </w:t>
+            </w:r>
+            <w:proofErr w:type="spellStart"/>
+            <w:r>
+              <w:rPr>
+                <w:sz w:val="18"/>
+                <w:szCs w:val="18"/>
+              </w:rPr>
+              <w:t>numBilhete</w:t>
+            </w:r>
+            <w:proofErr w:type="spellEnd"/>
+            <w:r>
+              <w:rPr>
+                <w:sz w:val="18"/>
+                <w:szCs w:val="18"/>
+              </w:rPr>
+              <w:t xml:space="preserve"> (9 dígitos).</w:t>
             </w:r>
           </w:p>
         </w:tc>
@@ -4461,7 +4946,39 @@
                 <w:sz w:val="18"/>
                 <w:szCs w:val="18"/>
               </w:rPr>
-              <w:t>Registra uma caminhada e credita os pontos. Corpo: idConta, kmAndados.</w:t>
+              <w:t xml:space="preserve">Registra uma caminhada e credita os pontos. Corpo: </w:t>
+            </w:r>
+            <w:proofErr w:type="spellStart"/>
+            <w:r>
+              <w:rPr>
+                <w:sz w:val="18"/>
+                <w:szCs w:val="18"/>
+              </w:rPr>
+              <w:t>idConta</w:t>
+            </w:r>
+            <w:proofErr w:type="spellEnd"/>
+            <w:r>
+              <w:rPr>
+                <w:sz w:val="18"/>
+                <w:szCs w:val="18"/>
+              </w:rPr>
+              <w:t xml:space="preserve">, </w:t>
+            </w:r>
+            <w:proofErr w:type="spellStart"/>
+            <w:r>
+              <w:rPr>
+                <w:sz w:val="18"/>
+                <w:szCs w:val="18"/>
+              </w:rPr>
+              <w:t>kmAndados</w:t>
+            </w:r>
+            <w:proofErr w:type="spellEnd"/>
+            <w:r>
+              <w:rPr>
+                <w:sz w:val="18"/>
+                <w:szCs w:val="18"/>
+              </w:rPr>
+              <w:t>.</w:t>
             </w:r>
           </w:p>
         </w:tc>
@@ -4525,7 +5042,23 @@
                 <w:sz w:val="18"/>
                 <w:szCs w:val="18"/>
               </w:rPr>
-              <w:t>/caminhadas/conta/{idConta}</w:t>
+              <w:t>/caminhadas/conta/{</w:t>
+            </w:r>
+            <w:proofErr w:type="spellStart"/>
+            <w:r>
+              <w:rPr>
+                <w:sz w:val="18"/>
+                <w:szCs w:val="18"/>
+              </w:rPr>
+              <w:t>idConta</w:t>
+            </w:r>
+            <w:proofErr w:type="spellEnd"/>
+            <w:r>
+              <w:rPr>
+                <w:sz w:val="18"/>
+                <w:szCs w:val="18"/>
+              </w:rPr>
+              <w:t>}</w:t>
             </w:r>
           </w:p>
         </w:tc>
@@ -4758,7 +5291,27 @@
                 <w:sz w:val="18"/>
                 <w:szCs w:val="18"/>
               </w:rPr>
-              <w:t>Históricos – /historicos (Meu histórico)</w:t>
+              <w:t>Históricos – /</w:t>
+            </w:r>
+            <w:proofErr w:type="spellStart"/>
+            <w:r>
+              <w:rPr>
+                <w:b/>
+                <w:bCs/>
+                <w:sz w:val="18"/>
+                <w:szCs w:val="18"/>
+              </w:rPr>
+              <w:t>historicos</w:t>
+            </w:r>
+            <w:proofErr w:type="spellEnd"/>
+            <w:r>
+              <w:rPr>
+                <w:b/>
+                <w:bCs/>
+                <w:sz w:val="18"/>
+                <w:szCs w:val="18"/>
+              </w:rPr>
+              <w:t xml:space="preserve"> (Meu histórico)</w:t>
             </w:r>
           </w:p>
         </w:tc>
@@ -4803,7 +5356,39 @@
                 <w:sz w:val="18"/>
                 <w:szCs w:val="18"/>
               </w:rPr>
-              <w:t>/historicos/conta/{idConta}?origem={origem}</w:t>
+              <w:t>/</w:t>
+            </w:r>
+            <w:proofErr w:type="spellStart"/>
+            <w:r>
+              <w:rPr>
+                <w:sz w:val="18"/>
+                <w:szCs w:val="18"/>
+              </w:rPr>
+              <w:t>historicos</w:t>
+            </w:r>
+            <w:proofErr w:type="spellEnd"/>
+            <w:r>
+              <w:rPr>
+                <w:sz w:val="18"/>
+                <w:szCs w:val="18"/>
+              </w:rPr>
+              <w:t>/conta/{</w:t>
+            </w:r>
+            <w:proofErr w:type="spellStart"/>
+            <w:r>
+              <w:rPr>
+                <w:sz w:val="18"/>
+                <w:szCs w:val="18"/>
+              </w:rPr>
+              <w:t>idConta</w:t>
+            </w:r>
+            <w:proofErr w:type="spellEnd"/>
+            <w:r>
+              <w:rPr>
+                <w:sz w:val="18"/>
+                <w:szCs w:val="18"/>
+              </w:rPr>
+              <w:t>}?origem={origem}</w:t>
             </w:r>
           </w:p>
         </w:tc>
@@ -4886,7 +5471,23 @@
                 <w:sz w:val="18"/>
                 <w:szCs w:val="18"/>
               </w:rPr>
-              <w:t>/historicos/{id}</w:t>
+              <w:t>/</w:t>
+            </w:r>
+            <w:proofErr w:type="spellStart"/>
+            <w:r>
+              <w:rPr>
+                <w:sz w:val="18"/>
+                <w:szCs w:val="18"/>
+              </w:rPr>
+              <w:t>historicos</w:t>
+            </w:r>
+            <w:proofErr w:type="spellEnd"/>
+            <w:r>
+              <w:rPr>
+                <w:sz w:val="18"/>
+                <w:szCs w:val="18"/>
+              </w:rPr>
+              <w:t>/{id}</w:t>
             </w:r>
           </w:p>
         </w:tc>
@@ -4969,7 +5570,23 @@
                 <w:sz w:val="18"/>
                 <w:szCs w:val="18"/>
               </w:rPr>
-              <w:t>/historicos/{id}</w:t>
+              <w:t>/</w:t>
+            </w:r>
+            <w:proofErr w:type="spellStart"/>
+            <w:r>
+              <w:rPr>
+                <w:sz w:val="18"/>
+                <w:szCs w:val="18"/>
+              </w:rPr>
+              <w:t>historicos</w:t>
+            </w:r>
+            <w:proofErr w:type="spellEnd"/>
+            <w:r>
+              <w:rPr>
+                <w:sz w:val="18"/>
+                <w:szCs w:val="18"/>
+              </w:rPr>
+              <w:t>/{id}</w:t>
             </w:r>
           </w:p>
         </w:tc>
@@ -5013,304 +5630,40 @@
         </w:tc>
       </w:tr>
     </w:tbl>
+    <w:p/>
     <w:p>
       <w:pPr>
-        <w:spacing w:before="200" w:after="80"/>
-      </w:pPr>
-      <w:r>
-        <w:rPr>
-          <w:b/>
-          <w:bCs/>
-        </w:rPr>
-        <w:t>Significado dos códigos de status</w:t>
-      </w:r>
+        <w:pStyle w:val="Ttulo1"/>
+      </w:pPr>
+      <w:bookmarkStart w:id="9" w:name="_Toc244177109"/>
+      <w:r>
+        <w:t>3</w:t>
+      </w:r>
+      <w:r>
+        <w:t>. Protótipo</w:t>
+      </w:r>
+      <w:r>
+        <w:t xml:space="preserve"> – Telas da aplicação</w:t>
+      </w:r>
+      <w:bookmarkEnd w:id="9"/>
     </w:p>
     <w:p>
-      <w:r>
-        <w:rPr>
-          <w:b/>
-          <w:bCs/>
-        </w:rPr>
-        <w:t xml:space="preserve">200 OK: </w:t>
-      </w:r>
-      <w:r>
-        <w:t xml:space="preserve">requisição concluída com sucesso e dados retornados. </w:t>
+      <w:pPr>
+        <w:ind w:firstLine="708"/>
+      </w:pPr>
+      <w:r>
+        <w:t>Acesse o</w:t>
+      </w:r>
+      <w:r>
+        <w:t xml:space="preserve"> link a seguir:</w:t>
       </w:r>
     </w:p>
     <w:p>
-      <w:r>
-        <w:rPr>
-          <w:b/>
-          <w:bCs/>
-        </w:rPr>
-        <w:t xml:space="preserve">201 </w:t>
-      </w:r>
-      <w:proofErr w:type="spellStart"/>
-      <w:r>
-        <w:rPr>
-          <w:b/>
-          <w:bCs/>
-        </w:rPr>
-        <w:t>Created</w:t>
-      </w:r>
-      <w:proofErr w:type="spellEnd"/>
-      <w:r>
-        <w:rPr>
-          <w:b/>
-          <w:bCs/>
-        </w:rPr>
-        <w:t xml:space="preserve">: </w:t>
-      </w:r>
-      <w:r>
-        <w:t xml:space="preserve">recurso criado. </w:t>
-      </w:r>
-    </w:p>
-    <w:p>
-      <w:r>
-        <w:rPr>
-          <w:b/>
-          <w:bCs/>
-        </w:rPr>
-        <w:lastRenderedPageBreak/>
-        <w:t xml:space="preserve">204 No </w:t>
-      </w:r>
-      <w:proofErr w:type="spellStart"/>
-      <w:r>
-        <w:rPr>
-          <w:b/>
-          <w:bCs/>
-        </w:rPr>
-        <w:t>Content</w:t>
-      </w:r>
-      <w:proofErr w:type="spellEnd"/>
-      <w:r>
-        <w:rPr>
-          <w:b/>
-          <w:bCs/>
-        </w:rPr>
-        <w:t xml:space="preserve">: </w:t>
-      </w:r>
-      <w:r>
-        <w:t xml:space="preserve">operação concluída, sem corpo de resposta. </w:t>
-      </w:r>
-    </w:p>
-    <w:p>
-      <w:r>
-        <w:rPr>
-          <w:b/>
-          <w:bCs/>
-        </w:rPr>
-        <w:t xml:space="preserve">400 </w:t>
-      </w:r>
-      <w:proofErr w:type="spellStart"/>
-      <w:r>
-        <w:rPr>
-          <w:b/>
-          <w:bCs/>
-        </w:rPr>
-        <w:t>Bad</w:t>
-      </w:r>
-      <w:proofErr w:type="spellEnd"/>
-      <w:r>
-        <w:rPr>
-          <w:b/>
-          <w:bCs/>
-        </w:rPr>
-        <w:t xml:space="preserve"> </w:t>
-      </w:r>
-      <w:proofErr w:type="spellStart"/>
-      <w:r>
-        <w:rPr>
-          <w:b/>
-          <w:bCs/>
-        </w:rPr>
-        <w:t>Request</w:t>
-      </w:r>
-      <w:proofErr w:type="spellEnd"/>
-      <w:r>
-        <w:rPr>
-          <w:b/>
-          <w:bCs/>
-        </w:rPr>
-        <w:t xml:space="preserve">: </w:t>
-      </w:r>
-      <w:r>
-        <w:t xml:space="preserve">dados inválidos ou regra de negócio violada. </w:t>
-      </w:r>
-    </w:p>
-    <w:p>
-      <w:r>
-        <w:rPr>
-          <w:b/>
-          <w:bCs/>
-        </w:rPr>
-        <w:t xml:space="preserve">401 </w:t>
-      </w:r>
-      <w:proofErr w:type="spellStart"/>
-      <w:r>
-        <w:rPr>
-          <w:b/>
-          <w:bCs/>
-        </w:rPr>
-        <w:t>Unauthorized</w:t>
-      </w:r>
-      <w:proofErr w:type="spellEnd"/>
-      <w:r>
-        <w:rPr>
-          <w:b/>
-          <w:bCs/>
-        </w:rPr>
-        <w:t xml:space="preserve">: </w:t>
-      </w:r>
-      <w:r>
-        <w:t xml:space="preserve">e-mail ou senha inválidos. </w:t>
-      </w:r>
-    </w:p>
-    <w:p>
-      <w:r>
-        <w:rPr>
-          <w:b/>
-          <w:bCs/>
-        </w:rPr>
-        <w:t xml:space="preserve">404 </w:t>
-      </w:r>
-      <w:proofErr w:type="spellStart"/>
-      <w:r>
-        <w:rPr>
-          <w:b/>
-          <w:bCs/>
-        </w:rPr>
-        <w:t>Not</w:t>
-      </w:r>
-      <w:proofErr w:type="spellEnd"/>
-      <w:r>
-        <w:rPr>
-          <w:b/>
-          <w:bCs/>
-        </w:rPr>
-        <w:t xml:space="preserve"> </w:t>
-      </w:r>
-      <w:proofErr w:type="spellStart"/>
-      <w:r>
-        <w:rPr>
-          <w:b/>
-          <w:bCs/>
-        </w:rPr>
-        <w:t>Found</w:t>
-      </w:r>
-      <w:proofErr w:type="spellEnd"/>
-      <w:r>
-        <w:rPr>
-          <w:b/>
-          <w:bCs/>
-        </w:rPr>
-        <w:t xml:space="preserve">: </w:t>
-      </w:r>
-      <w:r>
-        <w:t xml:space="preserve">recurso não encontrado. </w:t>
-      </w:r>
-    </w:p>
-    <w:p>
-      <w:r>
-        <w:rPr>
-          <w:b/>
-          <w:bCs/>
-        </w:rPr>
-        <w:t xml:space="preserve">409 </w:t>
-      </w:r>
-      <w:proofErr w:type="spellStart"/>
-      <w:r>
-        <w:rPr>
-          <w:b/>
-          <w:bCs/>
-        </w:rPr>
-        <w:t>Conflict</w:t>
-      </w:r>
-      <w:proofErr w:type="spellEnd"/>
-      <w:r>
-        <w:rPr>
-          <w:b/>
-          <w:bCs/>
-        </w:rPr>
-        <w:t xml:space="preserve">: </w:t>
-      </w:r>
-      <w:r>
-        <w:t xml:space="preserve">conflito com o estado atual, como e-mail já cadastrado ou conta inativa. </w:t>
-      </w:r>
-    </w:p>
-    <w:p>
-      <w:r>
-        <w:rPr>
-          <w:b/>
-          <w:bCs/>
-        </w:rPr>
-        <w:t xml:space="preserve">500 </w:t>
-      </w:r>
-      <w:proofErr w:type="spellStart"/>
-      <w:r>
-        <w:rPr>
-          <w:b/>
-          <w:bCs/>
-        </w:rPr>
-        <w:t>Internal</w:t>
-      </w:r>
-      <w:proofErr w:type="spellEnd"/>
-      <w:r>
-        <w:rPr>
-          <w:b/>
-          <w:bCs/>
-        </w:rPr>
-        <w:t xml:space="preserve"> Server </w:t>
-      </w:r>
-      <w:proofErr w:type="spellStart"/>
-      <w:r>
-        <w:rPr>
-          <w:b/>
-          <w:bCs/>
-        </w:rPr>
-        <w:t>Error</w:t>
-      </w:r>
-      <w:proofErr w:type="spellEnd"/>
-      <w:r>
-        <w:rPr>
-          <w:b/>
-          <w:bCs/>
-        </w:rPr>
-        <w:t xml:space="preserve">: </w:t>
-      </w:r>
-      <w:r>
-        <w:t>falha inesperada, como indisponibilidade do banco de dados; pode ocorrer em qualquer endpoint.</w:t>
-      </w:r>
-    </w:p>
-    <w:p>
-      <w:pPr>
-        <w:pStyle w:val="Heading1"/>
-      </w:pPr>
-      <w:r>
-        <w:t>3</w:t>
-      </w:r>
-      <w:r>
-        <w:t>. Protótipo</w:t>
-      </w:r>
-      <w:bookmarkEnd w:id="7"/>
-      <w:r>
-        <w:t xml:space="preserve"> – Telas da aplicação</w:t>
-      </w:r>
-    </w:p>
-    <w:p>
       <w:pPr>
         <w:ind w:firstLine="708"/>
-      </w:pPr>
-      <w:r>
-        <w:t>Acesse o</w:t>
-      </w:r>
-      <w:r>
-        <w:t xml:space="preserve"> link a seguir:</w:t>
-      </w:r>
-    </w:p>
-    <w:p>
-      <w:pPr>
-        <w:ind w:firstLine="708"/>
+        <w:rPr>
+          <w:rStyle w:val="Hyperlink"/>
+        </w:rPr>
       </w:pPr>
       <w:hyperlink r:id="rId9" w:history="1">
         <w:r>
@@ -5320,22 +5673,44 @@
           <w:t>https://www.figma.com/site/0cQyRoIL1mQcZd8ziV5CTK/SoulPass</w:t>
         </w:r>
       </w:hyperlink>
-      <w:bookmarkStart w:id="8" w:name="_Toc240009160"/>
     </w:p>
     <w:p>
       <w:pPr>
-        <w:pStyle w:val="Heading1"/>
-      </w:pPr>
-      <w:r>
-        <w:t>4</w:t>
-      </w:r>
-      <w:r>
-        <w:t>. MER (Modelo de Entidade e Relacionamento)</w:t>
-      </w:r>
-      <w:bookmarkEnd w:id="8"/>
+        <w:ind w:firstLine="708"/>
+        <w:rPr>
+          <w:rStyle w:val="Hyperlink"/>
+        </w:rPr>
+      </w:pPr>
     </w:p>
     <w:p>
       <w:pPr>
+        <w:ind w:firstLine="708"/>
+        <w:rPr>
+          <w:rStyle w:val="Hyperlink"/>
+        </w:rPr>
+      </w:pPr>
+    </w:p>
+    <w:p>
+      <w:pPr>
+        <w:ind w:firstLine="708"/>
+      </w:pPr>
+    </w:p>
+    <w:p>
+      <w:pPr>
+        <w:pStyle w:val="Ttulo1"/>
+      </w:pPr>
+      <w:bookmarkStart w:id="10" w:name="_Toc244177110"/>
+      <w:r>
+        <w:lastRenderedPageBreak/>
+        <w:t>4</w:t>
+      </w:r>
+      <w:r>
+        <w:t>. MER (Modelo de Entidade e Relacionamento)</w:t>
+      </w:r>
+      <w:bookmarkEnd w:id="10"/>
+    </w:p>
+    <w:p>
+      <w:pPr>
         <w:jc w:val="center"/>
         <w:rPr>
           <w:lang w:val="en-US"/>
@@ -5347,10 +5722,10 @@
           <w:lang w:val="en-US"/>
         </w:rPr>
         <w:drawing>
-          <wp:inline distT="0" distB="0" distL="0" distR="0" wp14:anchorId="7AB477B8" wp14:editId="7861D6BC">
-            <wp:extent cx="4333152" cy="3455719"/>
+          <wp:inline distT="0" distB="0" distL="0" distR="0" wp14:anchorId="5E02B7C0" wp14:editId="2DE88F48">
+            <wp:extent cx="5400040" cy="4311015"/>
             <wp:effectExtent l="0" t="0" r="0" b="0"/>
-            <wp:docPr id="5" name="Picture 5"/>
+            <wp:docPr id="1529746784" name="Imagem 1" descr="Diagrama&#10;&#10;Descrição gerada automaticamente"/>
             <wp:cNvGraphicFramePr>
               <a:graphicFrameLocks xmlns:a="http://schemas.openxmlformats.org/drawingml/2006/main" noChangeAspect="1"/>
             </wp:cNvGraphicFramePr>
@@ -5358,20 +5733,77 @@
               <a:graphicData uri="http://schemas.openxmlformats.org/drawingml/2006/picture">
                 <pic:pic xmlns:pic="http://schemas.openxmlformats.org/drawingml/2006/picture">
                   <pic:nvPicPr>
-                    <pic:cNvPr id="0" name="Picture 14"/>
+                    <pic:cNvPr id="1529746784" name="Imagem 1" descr="Diagrama&#10;&#10;Descrição gerada automaticamente"/>
+                    <pic:cNvPicPr/>
+                  </pic:nvPicPr>
+                  <pic:blipFill>
+                    <a:blip r:embed="rId10"/>
+                    <a:stretch>
+                      <a:fillRect/>
+                    </a:stretch>
+                  </pic:blipFill>
+                  <pic:spPr>
+                    <a:xfrm>
+                      <a:off x="0" y="0"/>
+                      <a:ext cx="5400040" cy="4311015"/>
+                    </a:xfrm>
+                    <a:prstGeom prst="rect">
+                      <a:avLst/>
+                    </a:prstGeom>
+                  </pic:spPr>
+                </pic:pic>
+              </a:graphicData>
+            </a:graphic>
+          </wp:inline>
+        </w:drawing>
+      </w:r>
+    </w:p>
+    <w:p>
+      <w:pPr>
+        <w:pStyle w:val="Ttulo1"/>
+      </w:pPr>
+      <w:bookmarkStart w:id="11" w:name="_Toc244177111"/>
+      <w:r>
+        <w:t>5</w:t>
+      </w:r>
+      <w:r>
+        <w:t>. Diagrama de Classes</w:t>
+      </w:r>
+      <w:bookmarkEnd w:id="11"/>
+    </w:p>
+    <w:p>
+      <w:pPr>
+        <w:jc w:val="center"/>
+      </w:pPr>
+      <w:r>
+        <w:rPr>
+          <w:noProof/>
+        </w:rPr>
+        <w:drawing>
+          <wp:inline distT="0" distB="0" distL="0" distR="0" wp14:anchorId="68F0F051" wp14:editId="314FF244">
+            <wp:extent cx="4803140" cy="3558245"/>
+            <wp:effectExtent l="0" t="0" r="0" b="4445"/>
+            <wp:docPr id="2040992736" name="Imagem 2"/>
+            <wp:cNvGraphicFramePr>
+              <a:graphicFrameLocks xmlns:a="http://schemas.openxmlformats.org/drawingml/2006/main" noChangeAspect="1"/>
+            </wp:cNvGraphicFramePr>
+            <a:graphic xmlns:a="http://schemas.openxmlformats.org/drawingml/2006/main">
+              <a:graphicData uri="http://schemas.openxmlformats.org/drawingml/2006/picture">
+                <pic:pic xmlns:pic="http://schemas.openxmlformats.org/drawingml/2006/picture">
+                  <pic:nvPicPr>
+                    <pic:cNvPr id="2040992736" name="Imagem 2"/>
                     <pic:cNvPicPr>
                       <a:picLocks noChangeAspect="1" noChangeArrowheads="1"/>
                     </pic:cNvPicPr>
                   </pic:nvPicPr>
                   <pic:blipFill>
-                    <a:blip r:embed="rId10">
+                    <a:blip r:embed="rId11">
                       <a:extLst>
                         <a:ext uri="{28A0092B-C50C-407E-A947-70E740481C1C}">
                           <a14:useLocalDpi xmlns:a14="http://schemas.microsoft.com/office/drawing/2010/main" val="0"/>
                         </a:ext>
                       </a:extLst>
                     </a:blip>
-                    <a:srcRect/>
                     <a:stretch>
                       <a:fillRect/>
                     </a:stretch>
@@ -5379,7 +5811,7 @@
                   <pic:spPr bwMode="auto">
                     <a:xfrm>
                       <a:off x="0" y="0"/>
-                      <a:ext cx="4341662" cy="3462506"/>
+                      <a:ext cx="4819640" cy="3570468"/>
                     </a:xfrm>
                     <a:prstGeom prst="rect">
                       <a:avLst/>
@@ -5397,183 +5829,169 @@
       </w:r>
     </w:p>
     <w:p>
-      <w:bookmarkStart w:id="9" w:name="_Toc240009161"/>
-    </w:p>
-    <w:p/>
-    <w:p>
-      <w:pPr>
-        <w:rPr>
-          <w:u w:val="single"/>
-        </w:rPr>
-      </w:pPr>
+      <w:pPr>
+        <w:pStyle w:val="Ttulo1"/>
+      </w:pPr>
+      <w:bookmarkStart w:id="12" w:name="_Toc244177112"/>
+      <w:r>
+        <w:lastRenderedPageBreak/>
+        <w:t>6</w:t>
+      </w:r>
+      <w:r>
+        <w:t>. Como rodar a aplicação?</w:t>
+      </w:r>
+      <w:bookmarkEnd w:id="12"/>
     </w:p>
     <w:p>
-      <w:pPr>
-        <w:pStyle w:val="Heading1"/>
-      </w:pPr>
-      <w:r>
-        <w:lastRenderedPageBreak/>
-        <w:t>5</w:t>
-      </w:r>
-      <w:r>
-        <w:t>. Diagrama de Classes</w:t>
-      </w:r>
-      <w:bookmarkEnd w:id="9"/>
+      <w:r>
+        <w:tab/>
+        <w:t xml:space="preserve">O </w:t>
+      </w:r>
+      <w:r>
+        <w:rPr>
+          <w:i/>
+          <w:iCs/>
+        </w:rPr>
+        <w:t>app</w:t>
+      </w:r>
+      <w:r>
+        <w:t xml:space="preserve"> a seguir foi feito no </w:t>
+      </w:r>
+      <w:proofErr w:type="spellStart"/>
+      <w:r>
+        <w:rPr>
+          <w:b/>
+          <w:bCs/>
+        </w:rPr>
+        <w:t>JetBrains</w:t>
+      </w:r>
+      <w:proofErr w:type="spellEnd"/>
+      <w:r>
+        <w:rPr>
+          <w:b/>
+          <w:bCs/>
+        </w:rPr>
+        <w:t xml:space="preserve"> </w:t>
+      </w:r>
+      <w:proofErr w:type="spellStart"/>
+      <w:r>
+        <w:rPr>
+          <w:b/>
+          <w:bCs/>
+        </w:rPr>
+        <w:t>IntelliJ</w:t>
+      </w:r>
+      <w:proofErr w:type="spellEnd"/>
+      <w:r>
+        <w:t xml:space="preserve">, na </w:t>
+      </w:r>
+      <w:r>
+        <w:rPr>
+          <w:b/>
+          <w:bCs/>
+        </w:rPr>
+        <w:t>versão 25 do JDK.</w:t>
+      </w:r>
+      <w:r>
+        <w:t xml:space="preserve"> </w:t>
+      </w:r>
+      <w:r>
+        <w:t xml:space="preserve">Caso ainda esteja vendo esse arquivo pelo .zip, por favor, extraia o conteúdo da pasta comprimida para uma nova pasta. </w:t>
+      </w:r>
+      <w:r>
+        <w:t xml:space="preserve">Abra a pasta do projeto pelo </w:t>
+      </w:r>
+      <w:proofErr w:type="spellStart"/>
+      <w:r>
+        <w:t>IntelliJ</w:t>
+      </w:r>
+      <w:proofErr w:type="spellEnd"/>
+      <w:r>
+        <w:t xml:space="preserve"> e use a classe </w:t>
+      </w:r>
+      <w:r>
+        <w:rPr>
+          <w:i/>
+          <w:iCs/>
+        </w:rPr>
+        <w:t>App</w:t>
+      </w:r>
+      <w:r>
+        <w:t xml:space="preserve"> para rodar a aplicação</w:t>
+      </w:r>
+      <w:r>
+        <w:t>. Aproveite o sistema.</w:t>
+      </w:r>
     </w:p>
     <w:p>
-      <w:pPr>
-        <w:jc w:val="center"/>
-      </w:pPr>
-      <w:r>
-        <w:rPr>
-          <w:noProof/>
-        </w:rPr>
-        <w:drawing>
-          <wp:inline distT="0" distB="0" distL="0" distR="0" wp14:anchorId="5C77E51A" wp14:editId="7E9D0B8E">
-            <wp:extent cx="4144903" cy="3220995"/>
-            <wp:effectExtent l="0" t="0" r="8255" b="0"/>
-            <wp:docPr id="1047754742" name="Imagem 2"/>
-            <wp:cNvGraphicFramePr>
-              <a:graphicFrameLocks xmlns:a="http://schemas.openxmlformats.org/drawingml/2006/main" noChangeAspect="1"/>
-            </wp:cNvGraphicFramePr>
-            <a:graphic xmlns:a="http://schemas.openxmlformats.org/drawingml/2006/main">
-              <a:graphicData uri="http://schemas.openxmlformats.org/drawingml/2006/picture">
-                <pic:pic xmlns:pic="http://schemas.openxmlformats.org/drawingml/2006/picture">
-                  <pic:nvPicPr>
-                    <pic:cNvPr id="0" name="Picture 2"/>
-                    <pic:cNvPicPr>
-                      <a:picLocks noChangeAspect="1" noChangeArrowheads="1"/>
-                    </pic:cNvPicPr>
-                  </pic:nvPicPr>
-                  <pic:blipFill>
-                    <a:blip r:embed="rId11">
-                      <a:extLst>
-                        <a:ext uri="{28A0092B-C50C-407E-A947-70E740481C1C}">
-                          <a14:useLocalDpi xmlns:a14="http://schemas.microsoft.com/office/drawing/2010/main" val="0"/>
-                        </a:ext>
-                      </a:extLst>
-                    </a:blip>
-                    <a:srcRect/>
-                    <a:stretch>
-                      <a:fillRect/>
-                    </a:stretch>
-                  </pic:blipFill>
-                  <pic:spPr bwMode="auto">
-                    <a:xfrm>
-                      <a:off x="0" y="0"/>
-                      <a:ext cx="4198556" cy="3262689"/>
-                    </a:xfrm>
-                    <a:prstGeom prst="rect">
-                      <a:avLst/>
-                    </a:prstGeom>
-                    <a:noFill/>
-                    <a:ln>
-                      <a:noFill/>
-                    </a:ln>
-                  </pic:spPr>
-                </pic:pic>
-              </a:graphicData>
-            </a:graphic>
-          </wp:inline>
-        </w:drawing>
-      </w:r>
-    </w:p>
-    <w:p>
-      <w:pPr>
-        <w:pStyle w:val="Heading1"/>
-      </w:pPr>
-      <w:bookmarkStart w:id="10" w:name="_Toc240009162"/>
-      <w:r>
-        <w:t>6</w:t>
-      </w:r>
-      <w:r>
-        <w:t>. Como rodar a aplicação?</w:t>
-      </w:r>
-      <w:bookmarkEnd w:id="10"/>
-    </w:p>
-    <w:p>
       <w:r>
         <w:tab/>
-        <w:t xml:space="preserve">O </w:t>
-      </w:r>
+      </w:r>
+      <w:proofErr w:type="spellStart"/>
+      <w:r>
+        <w:t>Contúdo</w:t>
+      </w:r>
+      <w:proofErr w:type="spellEnd"/>
+      <w:r>
+        <w:t xml:space="preserve">, pode ser que queira acessar sem ter que abrir o projeto, use o link do projeto que foi </w:t>
+      </w:r>
+      <w:proofErr w:type="spellStart"/>
       <w:r>
         <w:rPr>
           <w:i/>
           <w:iCs/>
         </w:rPr>
-        <w:t>app</w:t>
-      </w:r>
-      <w:r>
-        <w:t xml:space="preserve"> a seguir foi feito no </w:t>
-      </w:r>
-      <w:proofErr w:type="spellStart"/>
-      <w:r>
-        <w:rPr>
-          <w:b/>
-          <w:bCs/>
-        </w:rPr>
-        <w:t>JetBrains</w:t>
+        <w:t>deployed</w:t>
       </w:r>
       <w:proofErr w:type="spellEnd"/>
-      <w:r>
-        <w:rPr>
-          <w:b/>
-          <w:bCs/>
-        </w:rPr>
-        <w:t xml:space="preserve"> </w:t>
-      </w:r>
-      <w:proofErr w:type="spellStart"/>
-      <w:r>
-        <w:rPr>
-          <w:b/>
-          <w:bCs/>
-        </w:rPr>
-        <w:t>IntelliJ</w:t>
-      </w:r>
-      <w:proofErr w:type="spellEnd"/>
-      <w:r>
-        <w:t xml:space="preserve">, na </w:t>
-      </w:r>
-      <w:r>
-        <w:rPr>
-          <w:b/>
-          <w:bCs/>
-        </w:rPr>
-        <w:t>versão 25 do JDK.</w:t>
-      </w:r>
-      <w:r>
-        <w:t xml:space="preserve"> </w:t>
-      </w:r>
-      <w:r>
-        <w:t xml:space="preserve">Caso ainda esteja vendo esse arquivo pelo .zip, por favor, extraia o conteúdo da pasta comprimida para uma nova pasta. </w:t>
-      </w:r>
-      <w:r>
-        <w:t xml:space="preserve">Abra a pasta do projeto pelo </w:t>
-      </w:r>
-      <w:proofErr w:type="spellStart"/>
-      <w:r>
-        <w:t>IntelliJ</w:t>
-      </w:r>
-      <w:proofErr w:type="spellEnd"/>
-      <w:r>
-        <w:t xml:space="preserve"> e use a classe </w:t>
-      </w:r>
       <w:r>
         <w:rPr>
           <w:i/>
           <w:iCs/>
         </w:rPr>
-        <w:t>App</w:t>
-      </w:r>
-      <w:r>
-        <w:t xml:space="preserve"> para rodar a aplicação</w:t>
-      </w:r>
-      <w:r>
-        <w:t>. Aproveite o sistema.</w:t>
+        <w:t xml:space="preserve"> </w:t>
+      </w:r>
+      <w:r>
+        <w:t xml:space="preserve">na Render ( </w:t>
+      </w:r>
+      <w:hyperlink r:id="rId12" w:history="1">
+        <w:r>
+          <w:rPr>
+            <w:rStyle w:val="Hyperlink"/>
+          </w:rPr>
+          <w:t>https://soulpass-api.onrender.com</w:t>
+        </w:r>
+      </w:hyperlink>
+      <w:r>
+        <w:t xml:space="preserve"> ) e na própria URL escreva um dos </w:t>
+      </w:r>
+      <w:proofErr w:type="spellStart"/>
+      <w:r>
+        <w:rPr>
+          <w:i/>
+          <w:iCs/>
+        </w:rPr>
+        <w:t>Endpoints</w:t>
+      </w:r>
+      <w:proofErr w:type="spellEnd"/>
+      <w:r>
+        <w:t xml:space="preserve"> da tabela de </w:t>
+      </w:r>
+      <w:proofErr w:type="spellStart"/>
+      <w:r>
+        <w:rPr>
+          <w:i/>
+          <w:iCs/>
+        </w:rPr>
+        <w:t>Endpoints</w:t>
+      </w:r>
+      <w:proofErr w:type="spellEnd"/>
+      <w:r>
+        <w:t xml:space="preserve"> acima. Ela deve retornar um JSON com os métodos GET. Os demais métodos só serão acessados no Front-end.</w:t>
       </w:r>
     </w:p>
     <w:sectPr>
-      <w:headerReference w:type="default" r:id="rId12"/>
+      <w:headerReference w:type="default" r:id="rId13"/>
       <w:pgSz w:w="11906" w:h="16838"/>
       <w:pgMar w:top="1417" w:right="1701" w:bottom="1417" w:left="1701" w:header="708" w:footer="708" w:gutter="0"/>
       <w:cols w:space="708"/>
@@ -5585,7 +6003,7 @@
 </file>
 
 <file path=word/endnotes.xml><?xml version="1.0" encoding="utf-8"?>
-<w:endnotes xmlns:wpc="http://schemas.microsoft.com/office/word/2010/wordprocessingCanvas" xmlns:cx="http://schemas.microsoft.com/office/drawing/2014/chartex" xmlns:cx1="http://schemas.microsoft.com/office/drawing/2015/9/8/chartex" xmlns:cx2="http://schemas.microsoft.com/office/drawing/2015/10/21/chartex" xmlns:cx3="http://schemas.microsoft.com/office/drawing/2016/5/9/chartex" xmlns:cx4="http://schemas.microsoft.com/office/drawing/2016/5/10/chartex" xmlns:cx5="http://schemas.microsoft.com/office/drawing/2016/5/11/chartex" xmlns:cx6="http://schemas.microsoft.com/office/drawing/2016/5/12/chartex" xmlns:cx7="http://schemas.microsoft.com/office/drawing/2016/5/13/chartex" xmlns:cx8="http://schemas.microsoft.com/office/drawing/2016/5/14/chartex" xmlns:mc="http://schemas.openxmlformats.org/markup-compatibility/2006" xmlns:aink="http://schemas.microsoft.com/office/drawing/2016/ink" xmlns:am3d="http://schemas.microsoft.com/office/drawing/2017/model3d" xmlns:o="urn:schemas-microsoft-com:office:office" xmlns:oel="http://schemas.microsoft.com/office/2019/extlst" xmlns:r="http://schemas.openxmlformats.org/officeDocument/2006/relationships" xmlns:m="http://schemas.openxmlformats.org/officeDocument/2006/math" xmlns:v="urn:schemas-microsoft-com:vml" xmlns:wp14="http://schemas.microsoft.com/office/word/2010/wordprocessingDrawing" xmlns:wp="http://schemas.openxmlformats.org/drawingml/2006/wordprocessingDrawing" xmlns:w10="urn:schemas-microsoft-com:office:word" xmlns:w="http://schemas.openxmlformats.org/wordprocessingml/2006/main" xmlns:w14="http://schemas.microsoft.com/office/word/2010/wordml" xmlns:w15="http://schemas.microsoft.com/office/word/2012/wordml" xmlns:w16cex="http://schemas.microsoft.com/office/word/2018/wordml/cex" xmlns:w16cid="http://schemas.microsoft.com/office/word/2016/wordml/cid" xmlns:w16="http://schemas.microsoft.com/office/word/2018/wordml" xmlns:w16sdtdh="http://schemas.microsoft.com/office/word/2020/wordml/sdtdatahash" xmlns:w16se="http://schemas.microsoft.com/office/word/2015/wordml/symex" xmlns:wpg="http://schemas.microsoft.com/office/word/2010/wordprocessingGroup" xmlns:wpi="http://schemas.microsoft.com/office/word/2010/wordprocessingInk" xmlns:wne="http://schemas.microsoft.com/office/word/2006/wordml" xmlns:wps="http://schemas.microsoft.com/office/word/2010/wordprocessingShape" mc:Ignorable="w14 w15 w16se w16cid w16 w16cex w16sdtdh wp14">
+<w:endnotes xmlns:wpc="http://schemas.microsoft.com/office/word/2010/wordprocessingCanvas" xmlns:cx="http://schemas.microsoft.com/office/drawing/2014/chartex" xmlns:cx1="http://schemas.microsoft.com/office/drawing/2015/9/8/chartex" xmlns:cx2="http://schemas.microsoft.com/office/drawing/2015/10/21/chartex" xmlns:cx3="http://schemas.microsoft.com/office/drawing/2016/5/9/chartex" xmlns:cx4="http://schemas.microsoft.com/office/drawing/2016/5/10/chartex" xmlns:cx5="http://schemas.microsoft.com/office/drawing/2016/5/11/chartex" xmlns:cx6="http://schemas.microsoft.com/office/drawing/2016/5/12/chartex" xmlns:cx7="http://schemas.microsoft.com/office/drawing/2016/5/13/chartex" xmlns:cx8="http://schemas.microsoft.com/office/drawing/2016/5/14/chartex" xmlns:mc="http://schemas.openxmlformats.org/markup-compatibility/2006" xmlns:aink="http://schemas.microsoft.com/office/drawing/2016/ink" xmlns:am3d="http://schemas.microsoft.com/office/drawing/2017/model3d" xmlns:o="urn:schemas-microsoft-com:office:office" xmlns:oel="http://schemas.microsoft.com/office/2019/extlst" xmlns:r="http://schemas.openxmlformats.org/officeDocument/2006/relationships" xmlns:m="http://schemas.openxmlformats.org/officeDocument/2006/math" xmlns:v="urn:schemas-microsoft-com:vml" xmlns:wp14="http://schemas.microsoft.com/office/word/2010/wordprocessingDrawing" xmlns:wp="http://schemas.openxmlformats.org/drawingml/2006/wordprocessingDrawing" xmlns:w10="urn:schemas-microsoft-com:office:word" xmlns:w="http://schemas.openxmlformats.org/wordprocessingml/2006/main" xmlns:w14="http://schemas.microsoft.com/office/word/2010/wordml" xmlns:w15="http://schemas.microsoft.com/office/word/2012/wordml" xmlns:w16cex="http://schemas.microsoft.com/office/word/2018/wordml/cex" xmlns:w16cid="http://schemas.microsoft.com/office/word/2016/wordml/cid" xmlns:w16="http://schemas.microsoft.com/office/word/2018/wordml" xmlns:w16du="http://schemas.microsoft.com/office/word/2023/wordml/word16du" xmlns:w16sdtdh="http://schemas.microsoft.com/office/word/2020/wordml/sdtdatahash" xmlns:w16se="http://schemas.microsoft.com/office/word/2015/wordml/symex" xmlns:wpg="http://schemas.microsoft.com/office/word/2010/wordprocessingGroup" xmlns:wpi="http://schemas.microsoft.com/office/word/2010/wordprocessingInk" xmlns:wne="http://schemas.microsoft.com/office/word/2006/wordml" xmlns:wps="http://schemas.microsoft.com/office/word/2010/wordprocessingShape" mc:Ignorable="w14 w15 w16se w16cid w16 w16cex w16sdtdh w16du wp14">
   <w:endnote w:type="separator" w:id="-1">
     <w:p>
       <w:pPr>
@@ -5610,7 +6028,7 @@
 </file>
 
 <file path=word/footnotes.xml><?xml version="1.0" encoding="utf-8"?>
-<w:footnotes xmlns:wpc="http://schemas.microsoft.com/office/word/2010/wordprocessingCanvas" xmlns:cx="http://schemas.microsoft.com/office/drawing/2014/chartex" xmlns:cx1="http://schemas.microsoft.com/office/drawing/2015/9/8/chartex" xmlns:cx2="http://schemas.microsoft.com/office/drawing/2015/10/21/chartex" xmlns:cx3="http://schemas.microsoft.com/office/drawing/2016/5/9/chartex" xmlns:cx4="http://schemas.microsoft.com/office/drawing/2016/5/10/chartex" xmlns:cx5="http://schemas.microsoft.com/office/drawing/2016/5/11/chartex" xmlns:cx6="http://schemas.microsoft.com/office/drawing/2016/5/12/chartex" xmlns:cx7="http://schemas.microsoft.com/office/drawing/2016/5/13/chartex" xmlns:cx8="http://schemas.microsoft.com/office/drawing/2016/5/14/chartex" xmlns:mc="http://schemas.openxmlformats.org/markup-compatibility/2006" xmlns:aink="http://schemas.microsoft.com/office/drawing/2016/ink" xmlns:am3d="http://schemas.microsoft.com/office/drawing/2017/model3d" xmlns:o="urn:schemas-microsoft-com:office:office" xmlns:oel="http://schemas.microsoft.com/office/2019/extlst" xmlns:r="http://schemas.openxmlformats.org/officeDocument/2006/relationships" xmlns:m="http://schemas.openxmlformats.org/officeDocument/2006/math" xmlns:v="urn:schemas-microsoft-com:vml" xmlns:wp14="http://schemas.microsoft.com/office/word/2010/wordprocessingDrawing" xmlns:wp="http://schemas.openxmlformats.org/drawingml/2006/wordprocessingDrawing" xmlns:w10="urn:schemas-microsoft-com:office:word" xmlns:w="http://schemas.openxmlformats.org/wordprocessingml/2006/main" xmlns:w14="http://schemas.microsoft.com/office/word/2010/wordml" xmlns:w15="http://schemas.microsoft.com/office/word/2012/wordml" xmlns:w16cex="http://schemas.microsoft.com/office/word/2018/wordml/cex" xmlns:w16cid="http://schemas.microsoft.com/office/word/2016/wordml/cid" xmlns:w16="http://schemas.microsoft.com/office/word/2018/wordml" xmlns:w16sdtdh="http://schemas.microsoft.com/office/word/2020/wordml/sdtdatahash" xmlns:w16se="http://schemas.microsoft.com/office/word/2015/wordml/symex" xmlns:wpg="http://schemas.microsoft.com/office/word/2010/wordprocessingGroup" xmlns:wpi="http://schemas.microsoft.com/office/word/2010/wordprocessingInk" xmlns:wne="http://schemas.microsoft.com/office/word/2006/wordml" xmlns:wps="http://schemas.microsoft.com/office/word/2010/wordprocessingShape" mc:Ignorable="w14 w15 w16se w16cid w16 w16cex w16sdtdh wp14">
+<w:footnotes xmlns:wpc="http://schemas.microsoft.com/office/word/2010/wordprocessingCanvas" xmlns:cx="http://schemas.microsoft.com/office/drawing/2014/chartex" xmlns:cx1="http://schemas.microsoft.com/office/drawing/2015/9/8/chartex" xmlns:cx2="http://schemas.microsoft.com/office/drawing/2015/10/21/chartex" xmlns:cx3="http://schemas.microsoft.com/office/drawing/2016/5/9/chartex" xmlns:cx4="http://schemas.microsoft.com/office/drawing/2016/5/10/chartex" xmlns:cx5="http://schemas.microsoft.com/office/drawing/2016/5/11/chartex" xmlns:cx6="http://schemas.microsoft.com/office/drawing/2016/5/12/chartex" xmlns:cx7="http://schemas.microsoft.com/office/drawing/2016/5/13/chartex" xmlns:cx8="http://schemas.microsoft.com/office/drawing/2016/5/14/chartex" xmlns:mc="http://schemas.openxmlformats.org/markup-compatibility/2006" xmlns:aink="http://schemas.microsoft.com/office/drawing/2016/ink" xmlns:am3d="http://schemas.microsoft.com/office/drawing/2017/model3d" xmlns:o="urn:schemas-microsoft-com:office:office" xmlns:oel="http://schemas.microsoft.com/office/2019/extlst" xmlns:r="http://schemas.openxmlformats.org/officeDocument/2006/relationships" xmlns:m="http://schemas.openxmlformats.org/officeDocument/2006/math" xmlns:v="urn:schemas-microsoft-com:vml" xmlns:wp14="http://schemas.microsoft.com/office/word/2010/wordprocessingDrawing" xmlns:wp="http://schemas.openxmlformats.org/drawingml/2006/wordprocessingDrawing" xmlns:w10="urn:schemas-microsoft-com:office:word" xmlns:w="http://schemas.openxmlformats.org/wordprocessingml/2006/main" xmlns:w14="http://schemas.microsoft.com/office/word/2010/wordml" xmlns:w15="http://schemas.microsoft.com/office/word/2012/wordml" xmlns:w16cex="http://schemas.microsoft.com/office/word/2018/wordml/cex" xmlns:w16cid="http://schemas.microsoft.com/office/word/2016/wordml/cid" xmlns:w16="http://schemas.microsoft.com/office/word/2018/wordml" xmlns:w16du="http://schemas.microsoft.com/office/word/2023/wordml/word16du" xmlns:w16sdtdh="http://schemas.microsoft.com/office/word/2020/wordml/sdtdatahash" xmlns:w16se="http://schemas.microsoft.com/office/word/2015/wordml/symex" xmlns:wpg="http://schemas.microsoft.com/office/word/2010/wordprocessingGroup" xmlns:wpi="http://schemas.microsoft.com/office/word/2010/wordprocessingInk" xmlns:wne="http://schemas.microsoft.com/office/word/2006/wordml" xmlns:wps="http://schemas.microsoft.com/office/word/2010/wordprocessingShape" mc:Ignorable="w14 w15 w16se w16cid w16 w16cex w16sdtdh w16du wp14">
   <w:footnote w:type="separator" w:id="-1">
     <w:p>
       <w:pPr>
@@ -5635,7 +6053,7 @@
 </file>
 
 <file path=word/header1.xml><?xml version="1.0" encoding="utf-8"?>
-<w:hdr xmlns:wpc="http://schemas.microsoft.com/office/word/2010/wordprocessingCanvas" xmlns:cx="http://schemas.microsoft.com/office/drawing/2014/chartex" xmlns:cx1="http://schemas.microsoft.com/office/drawing/2015/9/8/chartex" xmlns:cx2="http://schemas.microsoft.com/office/drawing/2015/10/21/chartex" xmlns:cx3="http://schemas.microsoft.com/office/drawing/2016/5/9/chartex" xmlns:cx4="http://schemas.microsoft.com/office/drawing/2016/5/10/chartex" xmlns:cx5="http://schemas.microsoft.com/office/drawing/2016/5/11/chartex" xmlns:cx6="http://schemas.microsoft.com/office/drawing/2016/5/12/chartex" xmlns:cx7="http://schemas.microsoft.com/office/drawing/2016/5/13/chartex" xmlns:cx8="http://schemas.microsoft.com/office/drawing/2016/5/14/chartex" xmlns:mc="http://schemas.openxmlformats.org/markup-compatibility/2006" xmlns:aink="http://schemas.microsoft.com/office/drawing/2016/ink" xmlns:am3d="http://schemas.microsoft.com/office/drawing/2017/model3d" xmlns:o="urn:schemas-microsoft-com:office:office" xmlns:oel="http://schemas.microsoft.com/office/2019/extlst" xmlns:r="http://schemas.openxmlformats.org/officeDocument/2006/relationships" xmlns:m="http://schemas.openxmlformats.org/officeDocument/2006/math" xmlns:v="urn:schemas-microsoft-com:vml" xmlns:wp14="http://schemas.microsoft.com/office/word/2010/wordprocessingDrawing" xmlns:wp="http://schemas.openxmlformats.org/drawingml/2006/wordprocessingDrawing" xmlns:w10="urn:schemas-microsoft-com:office:word" xmlns:w="http://schemas.openxmlformats.org/wordprocessingml/2006/main" xmlns:w14="http://schemas.microsoft.com/office/word/2010/wordml" xmlns:w15="http://schemas.microsoft.com/office/word/2012/wordml" xmlns:w16cex="http://schemas.microsoft.com/office/word/2018/wordml/cex" xmlns:w16cid="http://schemas.microsoft.com/office/word/2016/wordml/cid" xmlns:w16="http://schemas.microsoft.com/office/word/2018/wordml" xmlns:w16sdtdh="http://schemas.microsoft.com/office/word/2020/wordml/sdtdatahash" xmlns:w16se="http://schemas.microsoft.com/office/word/2015/wordml/symex" xmlns:wpg="http://schemas.microsoft.com/office/word/2010/wordprocessingGroup" xmlns:wpi="http://schemas.microsoft.com/office/word/2010/wordprocessingInk" xmlns:wne="http://schemas.microsoft.com/office/word/2006/wordml" xmlns:wps="http://schemas.microsoft.com/office/word/2010/wordprocessingShape" mc:Ignorable="w14 w15 w16se w16cid w16 w16cex w16sdtdh wp14">
+<w:hdr xmlns:wpc="http://schemas.microsoft.com/office/word/2010/wordprocessingCanvas" xmlns:cx="http://schemas.microsoft.com/office/drawing/2014/chartex" xmlns:cx1="http://schemas.microsoft.com/office/drawing/2015/9/8/chartex" xmlns:cx2="http://schemas.microsoft.com/office/drawing/2015/10/21/chartex" xmlns:cx3="http://schemas.microsoft.com/office/drawing/2016/5/9/chartex" xmlns:cx4="http://schemas.microsoft.com/office/drawing/2016/5/10/chartex" xmlns:cx5="http://schemas.microsoft.com/office/drawing/2016/5/11/chartex" xmlns:cx6="http://schemas.microsoft.com/office/drawing/2016/5/12/chartex" xmlns:cx7="http://schemas.microsoft.com/office/drawing/2016/5/13/chartex" xmlns:cx8="http://schemas.microsoft.com/office/drawing/2016/5/14/chartex" xmlns:mc="http://schemas.openxmlformats.org/markup-compatibility/2006" xmlns:aink="http://schemas.microsoft.com/office/drawing/2016/ink" xmlns:am3d="http://schemas.microsoft.com/office/drawing/2017/model3d" xmlns:o="urn:schemas-microsoft-com:office:office" xmlns:oel="http://schemas.microsoft.com/office/2019/extlst" xmlns:r="http://schemas.openxmlformats.org/officeDocument/2006/relationships" xmlns:m="http://schemas.openxmlformats.org/officeDocument/2006/math" xmlns:v="urn:schemas-microsoft-com:vml" xmlns:wp14="http://schemas.microsoft.com/office/word/2010/wordprocessingDrawing" xmlns:wp="http://schemas.openxmlformats.org/drawingml/2006/wordprocessingDrawing" xmlns:w10="urn:schemas-microsoft-com:office:word" xmlns:w="http://schemas.openxmlformats.org/wordprocessingml/2006/main" xmlns:w14="http://schemas.microsoft.com/office/word/2010/wordml" xmlns:w15="http://schemas.microsoft.com/office/word/2012/wordml" xmlns:w16cex="http://schemas.microsoft.com/office/word/2018/wordml/cex" xmlns:w16cid="http://schemas.microsoft.com/office/word/2016/wordml/cid" xmlns:w16="http://schemas.microsoft.com/office/word/2018/wordml" xmlns:w16du="http://schemas.microsoft.com/office/word/2023/wordml/word16du" xmlns:w16sdtdh="http://schemas.microsoft.com/office/word/2020/wordml/sdtdatahash" xmlns:w16se="http://schemas.microsoft.com/office/word/2015/wordml/symex" xmlns:wpg="http://schemas.microsoft.com/office/word/2010/wordprocessingGroup" xmlns:wpi="http://schemas.microsoft.com/office/word/2010/wordprocessingInk" xmlns:wne="http://schemas.microsoft.com/office/word/2006/wordml" xmlns:wps="http://schemas.microsoft.com/office/word/2010/wordprocessingShape" mc:Ignorable="w14 w15 w16se w16cid w16 w16cex w16sdtdh w16du wp14">
   <w:sdt>
     <w:sdtPr>
       <w:id w:val="-1213418629"/>
@@ -5652,7 +6070,7 @@
     <w:sdtContent>
       <w:p>
         <w:pPr>
-          <w:pStyle w:val="Header"/>
+          <w:pStyle w:val="Cabealho"/>
           <w:jc w:val="right"/>
         </w:pPr>
         <w:r>
@@ -5681,14 +6099,14 @@
   </w:sdt>
   <w:p>
     <w:pPr>
-      <w:pStyle w:val="Header"/>
+      <w:pStyle w:val="Cabealho"/>
     </w:pPr>
   </w:p>
 </w:hdr>
 </file>
 
 <file path=word/numbering.xml><?xml version="1.0" encoding="utf-8"?>
-<w:numbering xmlns:wpc="http://schemas.microsoft.com/office/word/2010/wordprocessingCanvas" xmlns:cx="http://schemas.microsoft.com/office/drawing/2014/chartex" xmlns:cx1="http://schemas.microsoft.com/office/drawing/2015/9/8/chartex" xmlns:cx2="http://schemas.microsoft.com/office/drawing/2015/10/21/chartex" xmlns:cx3="http://schemas.microsoft.com/office/drawing/2016/5/9/chartex" xmlns:cx4="http://schemas.microsoft.com/office/drawing/2016/5/10/chartex" xmlns:cx5="http://schemas.microsoft.com/office/drawing/2016/5/11/chartex" xmlns:cx6="http://schemas.microsoft.com/office/drawing/2016/5/12/chartex" xmlns:cx7="http://schemas.microsoft.com/office/drawing/2016/5/13/chartex" xmlns:cx8="http://schemas.microsoft.com/office/drawing/2016/5/14/chartex" xmlns:mc="http://schemas.openxmlformats.org/markup-compatibility/2006" xmlns:aink="http://schemas.microsoft.com/office/drawing/2016/ink" xmlns:am3d="http://schemas.microsoft.com/office/drawing/2017/model3d" xmlns:o="urn:schemas-microsoft-com:office:office" xmlns:oel="http://schemas.microsoft.com/office/2019/extlst" xmlns:r="http://schemas.openxmlformats.org/officeDocument/2006/relationships" xmlns:m="http://schemas.openxmlformats.org/officeDocument/2006/math" xmlns:v="urn:schemas-microsoft-com:vml" xmlns:wp14="http://schemas.microsoft.com/office/word/2010/wordprocessingDrawing" xmlns:wp="http://schemas.openxmlformats.org/drawingml/2006/wordprocessingDrawing" xmlns:w10="urn:schemas-microsoft-com:office:word" xmlns:w="http://schemas.openxmlformats.org/wordprocessingml/2006/main" xmlns:w14="http://schemas.microsoft.com/office/word/2010/wordml" xmlns:w15="http://schemas.microsoft.com/office/word/2012/wordml" xmlns:w16cex="http://schemas.microsoft.com/office/word/2018/wordml/cex" xmlns:w16cid="http://schemas.microsoft.com/office/word/2016/wordml/cid" xmlns:w16="http://schemas.microsoft.com/office/word/2018/wordml" xmlns:w16sdtdh="http://schemas.microsoft.com/office/word/2020/wordml/sdtdatahash" xmlns:w16se="http://schemas.microsoft.com/office/word/2015/wordml/symex" xmlns:wpg="http://schemas.microsoft.com/office/word/2010/wordprocessingGroup" xmlns:wpi="http://schemas.microsoft.com/office/word/2010/wordprocessingInk" xmlns:wne="http://schemas.microsoft.com/office/word/2006/wordml" xmlns:wps="http://schemas.microsoft.com/office/word/2010/wordprocessingShape" mc:Ignorable="w14 w15 w16se w16cid w16 w16cex w16sdtdh wp14">
+<w:numbering xmlns:wpc="http://schemas.microsoft.com/office/word/2010/wordprocessingCanvas" xmlns:cx="http://schemas.microsoft.com/office/drawing/2014/chartex" xmlns:cx1="http://schemas.microsoft.com/office/drawing/2015/9/8/chartex" xmlns:cx2="http://schemas.microsoft.com/office/drawing/2015/10/21/chartex" xmlns:cx3="http://schemas.microsoft.com/office/drawing/2016/5/9/chartex" xmlns:cx4="http://schemas.microsoft.com/office/drawing/2016/5/10/chartex" xmlns:cx5="http://schemas.microsoft.com/office/drawing/2016/5/11/chartex" xmlns:cx6="http://schemas.microsoft.com/office/drawing/2016/5/12/chartex" xmlns:cx7="http://schemas.microsoft.com/office/drawing/2016/5/13/chartex" xmlns:cx8="http://schemas.microsoft.com/office/drawing/2016/5/14/chartex" xmlns:mc="http://schemas.openxmlformats.org/markup-compatibility/2006" xmlns:aink="http://schemas.microsoft.com/office/drawing/2016/ink" xmlns:am3d="http://schemas.microsoft.com/office/drawing/2017/model3d" xmlns:o="urn:schemas-microsoft-com:office:office" xmlns:oel="http://schemas.microsoft.com/office/2019/extlst" xmlns:r="http://schemas.openxmlformats.org/officeDocument/2006/relationships" xmlns:m="http://schemas.openxmlformats.org/officeDocument/2006/math" xmlns:v="urn:schemas-microsoft-com:vml" xmlns:wp14="http://schemas.microsoft.com/office/word/2010/wordprocessingDrawing" xmlns:wp="http://schemas.openxmlformats.org/drawingml/2006/wordprocessingDrawing" xmlns:w10="urn:schemas-microsoft-com:office:word" xmlns:w="http://schemas.openxmlformats.org/wordprocessingml/2006/main" xmlns:w14="http://schemas.microsoft.com/office/word/2010/wordml" xmlns:w15="http://schemas.microsoft.com/office/word/2012/wordml" xmlns:w16cex="http://schemas.microsoft.com/office/word/2018/wordml/cex" xmlns:w16cid="http://schemas.microsoft.com/office/word/2016/wordml/cid" xmlns:w16="http://schemas.microsoft.com/office/word/2018/wordml" xmlns:w16du="http://schemas.microsoft.com/office/word/2023/wordml/word16du" xmlns:w16sdtdh="http://schemas.microsoft.com/office/word/2020/wordml/sdtdatahash" xmlns:w16se="http://schemas.microsoft.com/office/word/2015/wordml/symex" xmlns:wpg="http://schemas.microsoft.com/office/word/2010/wordprocessingGroup" xmlns:wpi="http://schemas.microsoft.com/office/word/2010/wordprocessingInk" xmlns:wne="http://schemas.microsoft.com/office/word/2006/wordml" xmlns:wps="http://schemas.microsoft.com/office/word/2010/wordprocessingShape" mc:Ignorable="w14 w15 w16se w16cid w16 w16cex w16sdtdh w16du wp14">
   <w:abstractNum w:abstractNumId="0" w15:restartNumberingAfterBreak="0">
     <w:nsid w:val="17BD535A"/>
     <w:multiLevelType w:val="hybridMultilevel"/>
@@ -6293,7 +6711,7 @@
 </file>
 
 <file path=word/styles.xml><?xml version="1.0" encoding="utf-8"?>
-<w:styles xmlns:mc="http://schemas.openxmlformats.org/markup-compatibility/2006" xmlns:r="http://schemas.openxmlformats.org/officeDocument/2006/relationships" xmlns:w="http://schemas.openxmlformats.org/wordprocessingml/2006/main" xmlns:w14="http://schemas.microsoft.com/office/word/2010/wordml" xmlns:w15="http://schemas.microsoft.com/office/word/2012/wordml" xmlns:w16cex="http://schemas.microsoft.com/office/word/2018/wordml/cex" xmlns:w16cid="http://schemas.microsoft.com/office/word/2016/wordml/cid" xmlns:w16="http://schemas.microsoft.com/office/word/2018/wordml" xmlns:w16sdtdh="http://schemas.microsoft.com/office/word/2020/wordml/sdtdatahash" xmlns:w16se="http://schemas.microsoft.com/office/word/2015/wordml/symex" mc:Ignorable="w14 w15 w16se w16cid w16 w16cex w16sdtdh">
+<w:styles xmlns:mc="http://schemas.openxmlformats.org/markup-compatibility/2006" xmlns:r="http://schemas.openxmlformats.org/officeDocument/2006/relationships" xmlns:w="http://schemas.openxmlformats.org/wordprocessingml/2006/main" xmlns:w14="http://schemas.microsoft.com/office/word/2010/wordml" xmlns:w15="http://schemas.microsoft.com/office/word/2012/wordml" xmlns:w16cex="http://schemas.microsoft.com/office/word/2018/wordml/cex" xmlns:w16cid="http://schemas.microsoft.com/office/word/2016/wordml/cid" xmlns:w16="http://schemas.microsoft.com/office/word/2018/wordml" xmlns:w16du="http://schemas.microsoft.com/office/word/2023/wordml/word16du" xmlns:w16sdtdh="http://schemas.microsoft.com/office/word/2020/wordml/sdtdatahash" xmlns:w16se="http://schemas.microsoft.com/office/word/2015/wordml/symex" mc:Ignorable="w14 w15 w16se w16cid w16 w16cex w16sdtdh w16du">
   <w:docDefaults>
     <w:rPrDefault>
       <w:rPr>
@@ -6703,11 +7121,11 @@
       <w:szCs w:val="24"/>
     </w:rPr>
   </w:style>
-  <w:style w:type="paragraph" w:styleId="Heading1">
+  <w:style w:type="paragraph" w:styleId="Ttulo1">
     <w:name w:val="heading 1"/>
     <w:basedOn w:val="Normal"/>
     <w:next w:val="Normal"/>
-    <w:link w:val="Heading1Char"/>
+    <w:link w:val="Ttulo1Char"/>
     <w:uiPriority w:val="9"/>
     <w:qFormat/>
     <w:rsid w:val="00BD4496"/>
@@ -6719,11 +7137,11 @@
       <w:szCs w:val="28"/>
     </w:rPr>
   </w:style>
-  <w:style w:type="paragraph" w:styleId="Heading2">
+  <w:style w:type="paragraph" w:styleId="Ttulo2">
     <w:name w:val="heading 2"/>
-    <w:basedOn w:val="Heading1"/>
+    <w:basedOn w:val="Ttulo1"/>
     <w:next w:val="Normal"/>
-    <w:link w:val="Heading2Char"/>
+    <w:link w:val="Ttulo2Char"/>
     <w:uiPriority w:val="9"/>
     <w:unhideWhenUsed/>
     <w:qFormat/>
@@ -6732,11 +7150,11 @@
       <w:outlineLvl w:val="1"/>
     </w:pPr>
   </w:style>
-  <w:style w:type="paragraph" w:styleId="Heading3">
+  <w:style w:type="paragraph" w:styleId="Ttulo3">
     <w:name w:val="heading 3"/>
-    <w:basedOn w:val="Heading2"/>
+    <w:basedOn w:val="Ttulo2"/>
     <w:next w:val="Normal"/>
-    <w:link w:val="Heading3Char"/>
+    <w:link w:val="Ttulo3Char"/>
     <w:uiPriority w:val="9"/>
     <w:unhideWhenUsed/>
     <w:qFormat/>
@@ -6745,13 +7163,13 @@
       <w:outlineLvl w:val="2"/>
     </w:pPr>
   </w:style>
-  <w:style w:type="character" w:default="1" w:styleId="DefaultParagraphFont">
+  <w:style w:type="character" w:default="1" w:styleId="Fontepargpadro">
     <w:name w:val="Default Paragraph Font"/>
     <w:uiPriority w:val="1"/>
     <w:semiHidden/>
     <w:unhideWhenUsed/>
   </w:style>
-  <w:style w:type="table" w:default="1" w:styleId="TableNormal">
+  <w:style w:type="table" w:default="1" w:styleId="Tabelanormal">
     <w:name w:val="Normal Table"/>
     <w:uiPriority w:val="99"/>
     <w:semiHidden/>
@@ -6766,16 +7184,16 @@
       </w:tblCellMar>
     </w:tblPr>
   </w:style>
-  <w:style w:type="numbering" w:default="1" w:styleId="NoList">
+  <w:style w:type="numbering" w:default="1" w:styleId="Semlista">
     <w:name w:val="No List"/>
     <w:uiPriority w:val="99"/>
     <w:semiHidden/>
     <w:unhideWhenUsed/>
   </w:style>
-  <w:style w:type="character" w:customStyle="1" w:styleId="Heading1Char">
-    <w:name w:val="Heading 1 Char"/>
-    <w:basedOn w:val="DefaultParagraphFont"/>
-    <w:link w:val="Heading1"/>
+  <w:style w:type="character" w:customStyle="1" w:styleId="Ttulo1Char">
+    <w:name w:val="Título 1 Char"/>
+    <w:basedOn w:val="Fontepargpadro"/>
+    <w:link w:val="Ttulo1"/>
     <w:uiPriority w:val="9"/>
     <w:rsid w:val="00BD4496"/>
     <w:rPr>
@@ -6784,10 +7202,10 @@
       <w:szCs w:val="28"/>
     </w:rPr>
   </w:style>
-  <w:style w:type="character" w:customStyle="1" w:styleId="Heading2Char">
-    <w:name w:val="Heading 2 Char"/>
-    <w:basedOn w:val="DefaultParagraphFont"/>
-    <w:link w:val="Heading2"/>
+  <w:style w:type="character" w:customStyle="1" w:styleId="Ttulo2Char">
+    <w:name w:val="Título 2 Char"/>
+    <w:basedOn w:val="Fontepargpadro"/>
+    <w:link w:val="Ttulo2"/>
     <w:uiPriority w:val="9"/>
     <w:rsid w:val="00BD4496"/>
     <w:rPr>
@@ -6796,10 +7214,10 @@
       <w:szCs w:val="28"/>
     </w:rPr>
   </w:style>
-  <w:style w:type="character" w:customStyle="1" w:styleId="Heading3Char">
-    <w:name w:val="Heading 3 Char"/>
-    <w:basedOn w:val="DefaultParagraphFont"/>
-    <w:link w:val="Heading3"/>
+  <w:style w:type="character" w:customStyle="1" w:styleId="Ttulo3Char">
+    <w:name w:val="Título 3 Char"/>
+    <w:basedOn w:val="Fontepargpadro"/>
+    <w:link w:val="Ttulo3"/>
     <w:uiPriority w:val="9"/>
     <w:rsid w:val="00BD4496"/>
     <w:rPr>
@@ -6825,7 +7243,7 @@
       <w14:ligatures w14:val="none"/>
     </w:rPr>
   </w:style>
-  <w:style w:type="paragraph" w:styleId="ListParagraph">
+  <w:style w:type="paragraph" w:styleId="PargrafodaLista">
     <w:name w:val="List Paragraph"/>
     <w:basedOn w:val="Normal"/>
     <w:uiPriority w:val="34"/>
@@ -6838,7 +7256,7 @@
   </w:style>
   <w:style w:type="character" w:styleId="Hyperlink">
     <w:name w:val="Hyperlink"/>
-    <w:basedOn w:val="DefaultParagraphFont"/>
+    <w:basedOn w:val="Fontepargpadro"/>
     <w:uiPriority w:val="99"/>
     <w:unhideWhenUsed/>
     <w:rsid w:val="00B669D3"/>
@@ -6847,9 +7265,9 @@
       <w:u w:val="single"/>
     </w:rPr>
   </w:style>
-  <w:style w:type="character" w:styleId="UnresolvedMention">
+  <w:style w:type="character" w:styleId="MenoPendente">
     <w:name w:val="Unresolved Mention"/>
-    <w:basedOn w:val="DefaultParagraphFont"/>
+    <w:basedOn w:val="Fontepargpadro"/>
     <w:uiPriority w:val="99"/>
     <w:semiHidden/>
     <w:unhideWhenUsed/>
@@ -6859,10 +7277,10 @@
       <w:shd w:val="clear" w:color="auto" w:fill="E1DFDD"/>
     </w:rPr>
   </w:style>
-  <w:style w:type="paragraph" w:styleId="Header">
+  <w:style w:type="paragraph" w:styleId="Cabealho">
     <w:name w:val="header"/>
     <w:basedOn w:val="Normal"/>
-    <w:link w:val="HeaderChar"/>
+    <w:link w:val="CabealhoChar"/>
     <w:uiPriority w:val="99"/>
     <w:unhideWhenUsed/>
     <w:rsid w:val="007832B1"/>
@@ -6874,10 +7292,10 @@
       <w:spacing w:after="0" w:line="240" w:lineRule="auto"/>
     </w:pPr>
   </w:style>
-  <w:style w:type="character" w:customStyle="1" w:styleId="HeaderChar">
-    <w:name w:val="Header Char"/>
-    <w:basedOn w:val="DefaultParagraphFont"/>
-    <w:link w:val="Header"/>
+  <w:style w:type="character" w:customStyle="1" w:styleId="CabealhoChar">
+    <w:name w:val="Cabeçalho Char"/>
+    <w:basedOn w:val="Fontepargpadro"/>
+    <w:link w:val="Cabealho"/>
     <w:uiPriority w:val="99"/>
     <w:rsid w:val="007832B1"/>
     <w:rPr>
@@ -6886,10 +7304,10 @@
       <w:szCs w:val="24"/>
     </w:rPr>
   </w:style>
-  <w:style w:type="paragraph" w:styleId="Footer">
+  <w:style w:type="paragraph" w:styleId="Rodap">
     <w:name w:val="footer"/>
     <w:basedOn w:val="Normal"/>
-    <w:link w:val="FooterChar"/>
+    <w:link w:val="RodapChar"/>
     <w:uiPriority w:val="99"/>
     <w:unhideWhenUsed/>
     <w:rsid w:val="007832B1"/>
@@ -6901,10 +7319,10 @@
       <w:spacing w:after="0" w:line="240" w:lineRule="auto"/>
     </w:pPr>
   </w:style>
-  <w:style w:type="character" w:customStyle="1" w:styleId="FooterChar">
-    <w:name w:val="Footer Char"/>
-    <w:basedOn w:val="DefaultParagraphFont"/>
-    <w:link w:val="Footer"/>
+  <w:style w:type="character" w:customStyle="1" w:styleId="RodapChar">
+    <w:name w:val="Rodapé Char"/>
+    <w:basedOn w:val="Fontepargpadro"/>
+    <w:link w:val="Rodap"/>
     <w:uiPriority w:val="99"/>
     <w:rsid w:val="007832B1"/>
     <w:rPr>
@@ -6913,9 +7331,9 @@
       <w:szCs w:val="24"/>
     </w:rPr>
   </w:style>
-  <w:style w:type="paragraph" w:styleId="TOCHeading">
+  <w:style w:type="paragraph" w:styleId="CabealhodoSumrio">
     <w:name w:val="TOC Heading"/>
-    <w:basedOn w:val="Heading1"/>
+    <w:basedOn w:val="Ttulo1"/>
     <w:next w:val="Normal"/>
     <w:uiPriority w:val="39"/>
     <w:unhideWhenUsed/>
@@ -6938,7 +7356,7 @@
       <w14:ligatures w14:val="none"/>
     </w:rPr>
   </w:style>
-  <w:style w:type="paragraph" w:styleId="TOC1">
+  <w:style w:type="paragraph" w:styleId="Sumrio1">
     <w:name w:val="toc 1"/>
     <w:basedOn w:val="Normal"/>
     <w:next w:val="Normal"/>
@@ -6950,7 +7368,7 @@
       <w:spacing w:after="100"/>
     </w:pPr>
   </w:style>
-  <w:style w:type="paragraph" w:styleId="TOC2">
+  <w:style w:type="paragraph" w:styleId="Sumrio2">
     <w:name w:val="toc 2"/>
     <w:basedOn w:val="Normal"/>
     <w:next w:val="Normal"/>
@@ -6963,7 +7381,7 @@
       <w:ind w:left="240"/>
     </w:pPr>
   </w:style>
-  <w:style w:type="paragraph" w:styleId="TOC3">
+  <w:style w:type="paragraph" w:styleId="Sumrio3">
     <w:name w:val="toc 3"/>
     <w:basedOn w:val="Normal"/>
     <w:next w:val="Normal"/>
@@ -6976,9 +7394,9 @@
       <w:ind w:left="480"/>
     </w:pPr>
   </w:style>
-  <w:style w:type="character" w:styleId="FollowedHyperlink">
+  <w:style w:type="character" w:styleId="HiperlinkVisitado">
     <w:name w:val="FollowedHyperlink"/>
-    <w:basedOn w:val="DefaultParagraphFont"/>
+    <w:basedOn w:val="Fontepargpadro"/>
     <w:uiPriority w:val="99"/>
     <w:semiHidden/>
     <w:unhideWhenUsed/>

</xml_diff>